<commit_message>
Proposta Surcin v2: documentos e slides atualizados com a transcrição da reunião
Co-Authored-By: Claude Opus 5.5 (1M context) <noreply@anthropic.com>
Claude-Session: https://claude.ai/code/session_0127xFh2xB8HoQ18BDMAY2QJ
</commit_message>
<xml_diff>
--- a/proposta-surcin/01-diagnostico-preliminar.docx
+++ b/proposta-surcin/01-diagnostico-preliminar.docx
@@ -18,7 +18,7 @@
           <w:color w:val="595959"/>
           <w:sz w:val="26"/>
         </w:rPr>
-        <w:t>Surcin Consultoria · leitura da reunião de descoberta</w:t>
+        <w:t>Surcin · leitura da reunião de descoberta de 12/10/2026</w:t>
       </w:r>
     </w:p>
     <w:p>
@@ -28,7 +28,7 @@
           <w:color w:val="595959"/>
           <w:sz w:val="18"/>
         </w:rPr>
-        <w:t>Versão preliminar · 13/10/2026 · uso interno até revisão do Renato</w:t>
+        <w:t>Versão 2 · 13/10/2026 · atualizada com a transcrição da reunião · uso interno até revisão do Renato</w:t>
       </w:r>
     </w:p>
     <w:tbl>
@@ -52,7 +52,7 @@
               <w:rPr>
                 <w:sz w:val="20"/>
               </w:rPr>
-              <w:t>Este documento foi montado antes da chegada da transcrição. Tudo que não está marcado como [FATO] precisa ser conferido com a gravação antes de ir para a Thamires. Nenhum número, processo ou volume da empresa foi inventado: os campos vazios estão marcados como [PREENCHER].</w:t>
+              <w:t>Fonte: transcrição automática da reunião de 12/10/2026 (2h38). Transcrições automáticas trocam nomes e números; os pontos marcados [CONFIRMAR] devem ser conferidos com a gravação ou com a Thamires. Nada aqui foi acrescentado além do que ela disse.</w:t>
             </w:r>
           </w:p>
         </w:tc>
@@ -64,7 +64,7 @@
         <w:rPr>
           <w:i/>
         </w:rPr>
-        <w:t>Legenda usada neste documento: [FATO] confirmado na reunião ou no briefing; [HIPÓTESE] inferência do consultor, a validar; [PREENCHER] completar com a transcrição ou a gravação da reunião de 12/10/2026.</w:t>
+        <w:t>Legenda: [FATO] dito pela Thamires na reunião de 12/10/2026 (o minuto da gravação aparece entre parênteses); [HIPÓTESE] leitura do consultor, a validar; [CONFIRMAR] número ou nome que apareceu de forma ambígua na transcrição automática.</w:t>
       </w:r>
     </w:p>
     <w:p>
@@ -72,7 +72,7 @@
         <w:pStyle w:val="Heading1"/>
       </w:pPr>
       <w:r>
-        <w:t>1. O que já foi feito</w:t>
+        <w:t>1. Resumo executivo</w:t>
       </w:r>
     </w:p>
     <w:p>
@@ -80,7 +80,7 @@
         <w:rPr>
           <w:i w:val="0"/>
         </w:rPr>
-        <w:t>Em 12/10/2026 foi realizada a reunião de descoberta com a Thamires, com duração de cerca de 2h30. Nela, a cliente apresentou a empresa de ponta a ponta. Por isso, essa reunião é tratada como a primeira parte do diagnóstico, e não como uma conversa comercial prévia.</w:t>
+        <w:t>A Surcin é um escritório pequeno que já tem processos desenhados, mas ainda depende da Thamires para quase tudo. Ela reconstruiu a empresa a partir de 2023 com passo a passos, checklists e rotinas no Trello, e recuperou cerca de 90% dos clientes que havia perdido (00:11). O gargalo atual não é falta de processo, é falta de eficiência e de autonomia da equipe: ela revisa e corrige tudo, e um erro de configuração no Domínio em agosto gerou imposto pago errado, multa, um prejuízo de cerca de R$ 10 mil e a perda de um cliente (00:26 a 00:29).</w:t>
       </w:r>
     </w:p>
     <w:p>
@@ -88,7 +88,15 @@
         <w:rPr>
           <w:i w:val="0"/>
         </w:rPr>
-        <w:t>O que ainda falta para fechar o diagnóstico: ouvir os funcionários que executam as tarefas, entender os insumos (inputs) de cada rotina, de onde vêm, quem os produz e quem depende deles.</w:t>
+        <w:t>Ela tem prazo pessoal e financeiro: uma prova de certificação em 13/12/2026, caixa garantido por um Pronampe até novembro e a meta de entrar em janeiro com a casa arrumada para contratar um contador e voltar a investir em vendas (00:31 a 00:37, 02:14).</w:t>
+      </w:r>
+    </w:p>
+    <w:p>
+      <w:r>
+        <w:rPr>
+          <w:i/>
+        </w:rPr>
+        <w:t>Frase dela que resume o objetivo: "Hoje eu sinto que eu tenho um processo. Esse processo ele só não tá eficiente. Se eu melhorar isso, eu consigo escalar com as mesmas pessoas." (01:14)</w:t>
       </w:r>
     </w:p>
     <w:p>
@@ -96,7 +104,7 @@
         <w:pStyle w:val="Heading1"/>
       </w:pPr>
       <w:r>
-        <w:t>2. Perfil da empresa</w:t>
+        <w:t>2. A empresa</w:t>
       </w:r>
     </w:p>
     <w:tbl>
@@ -114,7 +122,7 @@
       <w:tr>
         <w:tc>
           <w:tcPr>
-            <w:tcW w:type="dxa" w:w="2551"/>
+            <w:tcW w:type="dxa" w:w="1984"/>
             <w:shd w:val="clear" w:color="auto" w:fill="1F3A5F"/>
           </w:tcPr>
           <w:p>
@@ -131,7 +139,7 @@
         </w:tc>
         <w:tc>
           <w:tcPr>
-            <w:tcW w:type="dxa" w:w="4535"/>
+            <w:tcW w:type="dxa" w:w="5386"/>
             <w:shd w:val="clear" w:color="auto" w:fill="1F3A5F"/>
           </w:tcPr>
           <w:p>
@@ -142,13 +150,13 @@
                 <w:color w:val="FFFFFF"/>
                 <w:sz w:val="20"/>
               </w:rPr>
-              <w:t>Situação</w:t>
+              <w:t>O que foi dito</w:t>
             </w:r>
           </w:p>
         </w:tc>
         <w:tc>
           <w:tcPr>
-            <w:tcW w:type="dxa" w:w="1984"/>
+            <w:tcW w:type="dxa" w:w="1701"/>
             <w:shd w:val="clear" w:color="auto" w:fill="1F3A5F"/>
           </w:tcPr>
           <w:p>
@@ -167,7 +175,7 @@
       <w:tr>
         <w:tc>
           <w:tcPr>
-            <w:tcW w:type="dxa" w:w="2551"/>
+            <w:tcW w:type="dxa" w:w="1984"/>
           </w:tcPr>
           <w:p>
             <w:r/>
@@ -176,13 +184,13 @@
                 <w:b w:val="0"/>
                 <w:sz w:val="20"/>
               </w:rPr>
-              <w:t>Responsável / decisora</w:t>
+              <w:t>Proposta de valor</w:t>
             </w:r>
           </w:p>
         </w:tc>
         <w:tc>
           <w:tcPr>
-            <w:tcW w:type="dxa" w:w="4535"/>
+            <w:tcW w:type="dxa" w:w="5386"/>
           </w:tcPr>
           <w:p>
             <w:r/>
@@ -191,10 +199,27 @@
                 <w:b w:val="0"/>
                 <w:sz w:val="20"/>
               </w:rPr>
-              <w:t>Thamires, contadora e advogada de formação, dona do escritório</w:t>
+              <w:t>Fazer a gestão do empresário de ponta a ponta: contabilidade, financeiro (onde ela mais se encontra) e jurídico consultivo e preventivo</w:t>
             </w:r>
           </w:p>
         </w:tc>
+        <w:tc>
+          <w:tcPr>
+            <w:tcW w:type="dxa" w:w="1701"/>
+          </w:tcPr>
+          <w:p>
+            <w:r/>
+            <w:r>
+              <w:rPr>
+                <w:b w:val="0"/>
+                <w:sz w:val="20"/>
+              </w:rPr>
+              <w:t>[FATO] 00:05</w:t>
+            </w:r>
+          </w:p>
+        </w:tc>
+      </w:tr>
+      <w:tr>
         <w:tc>
           <w:tcPr>
             <w:tcW w:type="dxa" w:w="1984"/>
@@ -206,15 +231,13 @@
                 <w:b w:val="0"/>
                 <w:sz w:val="20"/>
               </w:rPr>
-              <w:t>[FATO] briefing</w:t>
+              <w:t>Estrutura societária</w:t>
             </w:r>
           </w:p>
         </w:tc>
-      </w:tr>
-      <w:tr>
         <w:tc>
           <w:tcPr>
-            <w:tcW w:type="dxa" w:w="2551"/>
+            <w:tcW w:type="dxa" w:w="5386"/>
           </w:tcPr>
           <w:p>
             <w:r/>
@@ -223,13 +246,13 @@
                 <w:b w:val="0"/>
                 <w:sz w:val="20"/>
               </w:rPr>
-              <w:t>Tipo de negócio</w:t>
+              <w:t>Três CNPJs: contabilidade, financeiro e jurídico, separados por questão tributária</w:t>
             </w:r>
           </w:p>
         </w:tc>
         <w:tc>
           <w:tcPr>
-            <w:tcW w:type="dxa" w:w="4535"/>
+            <w:tcW w:type="dxa" w:w="1701"/>
           </w:tcPr>
           <w:p>
             <w:r/>
@@ -238,10 +261,12 @@
                 <w:b w:val="0"/>
                 <w:sz w:val="20"/>
               </w:rPr>
-              <w:t>Escritório próprio com serviços contábeis [confirmar se presta serviços jurídicos também]</w:t>
+              <w:t>[FATO] 01:02</w:t>
             </w:r>
           </w:p>
         </w:tc>
+      </w:tr>
+      <w:tr>
         <w:tc>
           <w:tcPr>
             <w:tcW w:type="dxa" w:w="1984"/>
@@ -253,15 +278,13 @@
                 <w:b w:val="0"/>
                 <w:sz w:val="20"/>
               </w:rPr>
-              <w:t>[FATO] / [PREENCHER]</w:t>
+              <w:t>Clientes de contabilidade</w:t>
             </w:r>
           </w:p>
         </w:tc>
-      </w:tr>
-      <w:tr>
         <w:tc>
           <w:tcPr>
-            <w:tcW w:type="dxa" w:w="2551"/>
+            <w:tcW w:type="dxa" w:w="5386"/>
           </w:tcPr>
           <w:p>
             <w:r/>
@@ -270,13 +293,13 @@
                 <w:b w:val="0"/>
                 <w:sz w:val="20"/>
               </w:rPr>
-              <w:t>Áreas identificadas</w:t>
+              <w:t>Cerca de 40; o fiscal do mês passado cobriu 44 clientes</w:t>
             </w:r>
           </w:p>
         </w:tc>
         <w:tc>
           <w:tcPr>
-            <w:tcW w:type="dxa" w:w="4535"/>
+            <w:tcW w:type="dxa" w:w="1701"/>
           </w:tcPr>
           <w:p>
             <w:r/>
@@ -285,10 +308,12 @@
                 <w:b w:val="0"/>
                 <w:sz w:val="20"/>
               </w:rPr>
-              <w:t>Departamento Pessoal, Financeiro, Contabilidade, Vendas</w:t>
+              <w:t>[FATO] 01:55 e 02:00</w:t>
             </w:r>
           </w:p>
         </w:tc>
+      </w:tr>
+      <w:tr>
         <w:tc>
           <w:tcPr>
             <w:tcW w:type="dxa" w:w="1984"/>
@@ -300,15 +325,13 @@
                 <w:b w:val="0"/>
                 <w:sz w:val="20"/>
               </w:rPr>
-              <w:t>[FATO] briefing</w:t>
+              <w:t>Clientes de financeiro (BPO)</w:t>
             </w:r>
           </w:p>
         </w:tc>
-      </w:tr>
-      <w:tr>
         <w:tc>
           <w:tcPr>
-            <w:tcW w:type="dxa" w:w="2551"/>
+            <w:tcW w:type="dxa" w:w="5386"/>
           </w:tcPr>
           <w:p>
             <w:r/>
@@ -317,13 +340,13 @@
                 <w:b w:val="0"/>
                 <w:sz w:val="20"/>
               </w:rPr>
-              <w:t>Objetivo declarado</w:t>
+              <w:t>Entre 12 e 16, conforme o trecho; Vitória cuida de todos</w:t>
             </w:r>
           </w:p>
         </w:tc>
         <w:tc>
           <w:tcPr>
-            <w:tcW w:type="dxa" w:w="4535"/>
+            <w:tcW w:type="dxa" w:w="1701"/>
           </w:tcPr>
           <w:p>
             <w:r/>
@@ -332,10 +355,12 @@
                 <w:b w:val="0"/>
                 <w:sz w:val="20"/>
               </w:rPr>
-              <w:t>Organizar e automatizar os processos da empresa</w:t>
+              <w:t>[FATO] 00:38, 00:46, 01:02 [CONFIRMAR]</w:t>
             </w:r>
           </w:p>
         </w:tc>
+      </w:tr>
+      <w:tr>
         <w:tc>
           <w:tcPr>
             <w:tcW w:type="dxa" w:w="1984"/>
@@ -347,15 +372,13 @@
                 <w:b w:val="0"/>
                 <w:sz w:val="20"/>
               </w:rPr>
-              <w:t>[FATO] briefing</w:t>
+              <w:t>Departamento Pessoal</w:t>
             </w:r>
           </w:p>
         </w:tc>
-      </w:tr>
-      <w:tr>
         <w:tc>
           <w:tcPr>
-            <w:tcW w:type="dxa" w:w="2551"/>
+            <w:tcW w:type="dxa" w:w="5386"/>
           </w:tcPr>
           <w:p>
             <w:r/>
@@ -364,13 +387,13 @@
                 <w:b w:val="0"/>
                 <w:sz w:val="20"/>
               </w:rPr>
-              <w:t>Número de funcionários e por área</w:t>
+              <w:t>Cerca de 25 vidas; 4 ou 5 clientes com funcionários; a maioria dos clientes é PJ</w:t>
             </w:r>
           </w:p>
         </w:tc>
         <w:tc>
           <w:tcPr>
-            <w:tcW w:type="dxa" w:w="4535"/>
+            <w:tcW w:type="dxa" w:w="1701"/>
           </w:tcPr>
           <w:p>
             <w:r/>
@@ -379,9 +402,12 @@
                 <w:b w:val="0"/>
                 <w:sz w:val="20"/>
               </w:rPr>
+              <w:t>[FATO] 00:40</w:t>
             </w:r>
           </w:p>
         </w:tc>
+      </w:tr>
+      <w:tr>
         <w:tc>
           <w:tcPr>
             <w:tcW w:type="dxa" w:w="1984"/>
@@ -393,15 +419,13 @@
                 <w:b w:val="0"/>
                 <w:sz w:val="20"/>
               </w:rPr>
-              <w:t>[PREENCHER]</w:t>
+              <w:t>Jurídico</w:t>
             </w:r>
           </w:p>
         </w:tc>
-      </w:tr>
-      <w:tr>
         <w:tc>
           <w:tcPr>
-            <w:tcW w:type="dxa" w:w="2551"/>
+            <w:tcW w:type="dxa" w:w="5386"/>
           </w:tcPr>
           <w:p>
             <w:r/>
@@ -410,13 +434,13 @@
                 <w:b w:val="0"/>
                 <w:sz w:val="20"/>
               </w:rPr>
-              <w:t>Número de clientes atendidos</w:t>
+              <w:t>Cerca de 20 processos em andamento, herdados de uma sociedade desfeita, em fase final; contratos e societário (abertura de empresas). Hoje não gera receita recorrente</w:t>
             </w:r>
           </w:p>
         </w:tc>
         <w:tc>
           <w:tcPr>
-            <w:tcW w:type="dxa" w:w="4535"/>
+            <w:tcW w:type="dxa" w:w="1701"/>
           </w:tcPr>
           <w:p>
             <w:r/>
@@ -425,9 +449,12 @@
                 <w:b w:val="0"/>
                 <w:sz w:val="20"/>
               </w:rPr>
+              <w:t>[FATO] 00:43, 01:45</w:t>
             </w:r>
           </w:p>
         </w:tc>
+      </w:tr>
+      <w:tr>
         <w:tc>
           <w:tcPr>
             <w:tcW w:type="dxa" w:w="1984"/>
@@ -439,15 +466,13 @@
                 <w:b w:val="0"/>
                 <w:sz w:val="20"/>
               </w:rPr>
-              <w:t>[PREENCHER]</w:t>
+              <w:t>Outros serviços</w:t>
             </w:r>
           </w:p>
         </w:tc>
-      </w:tr>
-      <w:tr>
         <w:tc>
           <w:tcPr>
-            <w:tcW w:type="dxa" w:w="2551"/>
+            <w:tcW w:type="dxa" w:w="5386"/>
           </w:tcPr>
           <w:p>
             <w:r/>
@@ -456,13 +481,13 @@
                 <w:b w:val="0"/>
                 <w:sz w:val="20"/>
               </w:rPr>
-              <w:t>Volume mensal (folhas, lançamentos, guias, contratos)</w:t>
+              <w:t>Revenda de certificado digital, imposto de renda (pontual), parcerias com outras contabilidades, clientes do Lucro Presumido</w:t>
             </w:r>
           </w:p>
         </w:tc>
         <w:tc>
           <w:tcPr>
-            <w:tcW w:type="dxa" w:w="4535"/>
+            <w:tcW w:type="dxa" w:w="1701"/>
           </w:tcPr>
           <w:p>
             <w:r/>
@@ -471,9 +496,12 @@
                 <w:b w:val="0"/>
                 <w:sz w:val="20"/>
               </w:rPr>
+              <w:t>[FATO] 00:52 a 00:53</w:t>
             </w:r>
           </w:p>
         </w:tc>
+      </w:tr>
+      <w:tr>
         <w:tc>
           <w:tcPr>
             <w:tcW w:type="dxa" w:w="1984"/>
@@ -485,15 +513,13 @@
                 <w:b w:val="0"/>
                 <w:sz w:val="20"/>
               </w:rPr>
-              <w:t>[PREENCHER]</w:t>
+              <w:t>Situação financeira</w:t>
             </w:r>
           </w:p>
         </w:tc>
-      </w:tr>
-      <w:tr>
         <w:tc>
           <w:tcPr>
-            <w:tcW w:type="dxa" w:w="2551"/>
+            <w:tcW w:type="dxa" w:w="5386"/>
           </w:tcPr>
           <w:p>
             <w:r/>
@@ -502,13 +528,13 @@
                 <w:b w:val="0"/>
                 <w:sz w:val="20"/>
               </w:rPr>
-              <w:t>Faturamento ou porte (se ela citou)</w:t>
+              <w:t>Prejuízo de agosto; Pronampe garante caixa até novembro; dezembro apertado; pagamento começa em fevereiro</w:t>
             </w:r>
           </w:p>
         </w:tc>
         <w:tc>
           <w:tcPr>
-            <w:tcW w:type="dxa" w:w="4535"/>
+            <w:tcW w:type="dxa" w:w="1701"/>
           </w:tcPr>
           <w:p>
             <w:r/>
@@ -517,9 +543,12 @@
                 <w:b w:val="0"/>
                 <w:sz w:val="20"/>
               </w:rPr>
+              <w:t>[FATO] 00:31, 01:33</w:t>
             </w:r>
           </w:p>
         </w:tc>
+      </w:tr>
+      <w:tr>
         <w:tc>
           <w:tcPr>
             <w:tcW w:type="dxa" w:w="1984"/>
@@ -531,7 +560,37 @@
                 <w:b w:val="0"/>
                 <w:sz w:val="20"/>
               </w:rPr>
-              <w:t>[PREENCHER]</w:t>
+              <w:t>Decisões já tomadas</w:t>
+            </w:r>
+          </w:p>
+        </w:tc>
+        <w:tc>
+          <w:tcPr>
+            <w:tcW w:type="dxa" w:w="5386"/>
+          </w:tcPr>
+          <w:p>
+            <w:r/>
+            <w:r>
+              <w:rPr>
+                <w:b w:val="0"/>
+                <w:sz w:val="20"/>
+              </w:rPr>
+              <w:t>Não contratar até o fim do ano; contratar em janeiro um contador experiente no Domínio; tráfego pago pausado (cerca de R$ 1 mil em anúncios), social media mantida</w:t>
+            </w:r>
+          </w:p>
+        </w:tc>
+        <w:tc>
+          <w:tcPr>
+            <w:tcW w:type="dxa" w:w="1701"/>
+          </w:tcPr>
+          <w:p>
+            <w:r/>
+            <w:r>
+              <w:rPr>
+                <w:b w:val="0"/>
+                <w:sz w:val="20"/>
+              </w:rPr>
+              <w:t>[FATO] 00:30, 01:49, 02:12</w:t>
             </w:r>
           </w:p>
         </w:tc>
@@ -543,15 +602,7 @@
         <w:pStyle w:val="Heading1"/>
       </w:pPr>
       <w:r>
-        <w:t>3. Ferramentas citadas</w:t>
-      </w:r>
-    </w:p>
-    <w:p>
-      <w:r>
-        <w:rPr>
-          <w:i w:val="0"/>
-        </w:rPr>
-        <w:t>As ferramentas abaixo foram mencionadas na reunião. A finalidade e o uso efetivo de cada uma ainda precisam ser confirmados.</w:t>
+        <w:t>3. Equipe atual</w:t>
       </w:r>
     </w:p>
     <w:tbl>
@@ -570,7 +621,417 @@
       <w:tr>
         <w:tc>
           <w:tcPr>
-            <w:tcW w:type="dxa" w:w="1701"/>
+            <w:tcW w:type="dxa" w:w="1304"/>
+            <w:shd w:val="clear" w:color="auto" w:fill="1F3A5F"/>
+          </w:tcPr>
+          <w:p>
+            <w:r/>
+            <w:r>
+              <w:rPr>
+                <w:b/>
+                <w:color w:val="FFFFFF"/>
+                <w:sz w:val="20"/>
+              </w:rPr>
+              <w:t>Pessoa</w:t>
+            </w:r>
+          </w:p>
+        </w:tc>
+        <w:tc>
+          <w:tcPr>
+            <w:tcW w:type="dxa" w:w="3402"/>
+            <w:shd w:val="clear" w:color="auto" w:fill="1F3A5F"/>
+          </w:tcPr>
+          <w:p>
+            <w:r/>
+            <w:r>
+              <w:rPr>
+                <w:b/>
+                <w:color w:val="FFFFFF"/>
+                <w:sz w:val="20"/>
+              </w:rPr>
+              <w:t>Função hoje</w:t>
+            </w:r>
+          </w:p>
+        </w:tc>
+        <w:tc>
+          <w:tcPr>
+            <w:tcW w:type="dxa" w:w="2948"/>
+            <w:shd w:val="clear" w:color="auto" w:fill="1F3A5F"/>
+          </w:tcPr>
+          <w:p>
+            <w:r/>
+            <w:r>
+              <w:rPr>
+                <w:b/>
+                <w:color w:val="FFFFFF"/>
+                <w:sz w:val="20"/>
+              </w:rPr>
+              <w:t>Observações dela</w:t>
+            </w:r>
+          </w:p>
+        </w:tc>
+        <w:tc>
+          <w:tcPr>
+            <w:tcW w:type="dxa" w:w="1417"/>
+            <w:shd w:val="clear" w:color="auto" w:fill="1F3A5F"/>
+          </w:tcPr>
+          <w:p>
+            <w:r/>
+            <w:r>
+              <w:rPr>
+                <w:b/>
+                <w:color w:val="FFFFFF"/>
+                <w:sz w:val="20"/>
+              </w:rPr>
+              <w:t>Fonte</w:t>
+            </w:r>
+          </w:p>
+        </w:tc>
+      </w:tr>
+      <w:tr>
+        <w:tc>
+          <w:tcPr>
+            <w:tcW w:type="dxa" w:w="1304"/>
+          </w:tcPr>
+          <w:p>
+            <w:r/>
+            <w:r>
+              <w:rPr>
+                <w:b w:val="0"/>
+                <w:sz w:val="20"/>
+              </w:rPr>
+              <w:t>Thamires</w:t>
+            </w:r>
+          </w:p>
+        </w:tc>
+        <w:tc>
+          <w:tcPr>
+            <w:tcW w:type="dxa" w:w="3402"/>
+          </w:tcPr>
+          <w:p>
+            <w:r/>
+            <w:r>
+              <w:rPr>
+                <w:b w:val="0"/>
+                <w:sz w:val="20"/>
+              </w:rPr>
+              <w:t>Direção, técnica contábil e jurídica, fiscal (absorveu após a saída da contadora), reuniões de fechamento, comercial</w:t>
+            </w:r>
+          </w:p>
+        </w:tc>
+        <w:tc>
+          <w:tcPr>
+            <w:tcW w:type="dxa" w:w="2948"/>
+          </w:tcPr>
+          <w:p>
+            <w:r/>
+            <w:r>
+              <w:rPr>
+                <w:b w:val="0"/>
+                <w:sz w:val="20"/>
+              </w:rPr>
+              <w:t>Tudo passa por ela; revisa o trabalho de todos</w:t>
+            </w:r>
+          </w:p>
+        </w:tc>
+        <w:tc>
+          <w:tcPr>
+            <w:tcW w:type="dxa" w:w="1417"/>
+          </w:tcPr>
+          <w:p>
+            <w:r/>
+            <w:r>
+              <w:rPr>
+                <w:b w:val="0"/>
+                <w:sz w:val="20"/>
+              </w:rPr>
+              <w:t>00:18, 00:30</w:t>
+            </w:r>
+          </w:p>
+        </w:tc>
+      </w:tr>
+      <w:tr>
+        <w:tc>
+          <w:tcPr>
+            <w:tcW w:type="dxa" w:w="1304"/>
+          </w:tcPr>
+          <w:p>
+            <w:r/>
+            <w:r>
+              <w:rPr>
+                <w:b w:val="0"/>
+                <w:sz w:val="20"/>
+              </w:rPr>
+              <w:t>Júlia</w:t>
+            </w:r>
+          </w:p>
+        </w:tc>
+        <w:tc>
+          <w:tcPr>
+            <w:tcW w:type="dxa" w:w="3402"/>
+          </w:tcPr>
+          <w:p>
+            <w:r/>
+            <w:r>
+              <w:rPr>
+                <w:b w:val="0"/>
+                <w:sz w:val="20"/>
+              </w:rPr>
+              <w:t>Secretária e braço direito: atendimento, WhatsApp, agenda, Trello, implantação de novos clientes, propostas no Canva, envio de impostos, apoio no fiscal (confere notas e XML)</w:t>
+            </w:r>
+          </w:p>
+        </w:tc>
+        <w:tc>
+          <w:tcPr>
+            <w:tcW w:type="dxa" w:w="2948"/>
+          </w:tcPr>
+          <w:p>
+            <w:r/>
+            <w:r>
+              <w:rPr>
+                <w:b w:val="0"/>
+                <w:sz w:val="20"/>
+              </w:rPr>
+              <w:t>Vê a empresa inteira; candidata a supervisora em 2027, condicionado a graduação</w:t>
+            </w:r>
+          </w:p>
+        </w:tc>
+        <w:tc>
+          <w:tcPr>
+            <w:tcW w:type="dxa" w:w="1417"/>
+          </w:tcPr>
+          <w:p>
+            <w:r/>
+            <w:r>
+              <w:rPr>
+                <w:b w:val="0"/>
+                <w:sz w:val="20"/>
+              </w:rPr>
+              <w:t>00:15 a 00:19, 01:04, 01:35</w:t>
+            </w:r>
+          </w:p>
+        </w:tc>
+      </w:tr>
+      <w:tr>
+        <w:tc>
+          <w:tcPr>
+            <w:tcW w:type="dxa" w:w="1304"/>
+          </w:tcPr>
+          <w:p>
+            <w:r/>
+            <w:r>
+              <w:rPr>
+                <w:b w:val="0"/>
+                <w:sz w:val="20"/>
+              </w:rPr>
+              <w:t>Vitória</w:t>
+            </w:r>
+          </w:p>
+        </w:tc>
+        <w:tc>
+          <w:tcPr>
+            <w:tcW w:type="dxa" w:w="3402"/>
+          </w:tcPr>
+          <w:p>
+            <w:r/>
+            <w:r>
+              <w:rPr>
+                <w:b w:val="0"/>
+                <w:sz w:val="20"/>
+              </w:rPr>
+              <w:t>Financeiro operacional: pagamentos (terças e sextas), emissão de notas, conciliação no Conta Azul, preparação do fechamento</w:t>
+            </w:r>
+          </w:p>
+        </w:tc>
+        <w:tc>
+          <w:tcPr>
+            <w:tcW w:type="dxa" w:w="2948"/>
+          </w:tcPr>
+          <w:p>
+            <w:r/>
+            <w:r>
+              <w:rPr>
+                <w:b w:val="0"/>
+                <w:sz w:val="20"/>
+              </w:rPr>
+              <w:t>Muito boa quando o processo está desenhado; ainda precisa de ajuda na classificação de despesas. De férias até 28/10 [CONFIRMAR]</w:t>
+            </w:r>
+          </w:p>
+        </w:tc>
+        <w:tc>
+          <w:tcPr>
+            <w:tcW w:type="dxa" w:w="1417"/>
+          </w:tcPr>
+          <w:p>
+            <w:r/>
+            <w:r>
+              <w:rPr>
+                <w:b w:val="0"/>
+                <w:sz w:val="20"/>
+              </w:rPr>
+              <w:t>00:13 a 00:15, 01:21, 01:34</w:t>
+            </w:r>
+          </w:p>
+        </w:tc>
+      </w:tr>
+      <w:tr>
+        <w:tc>
+          <w:tcPr>
+            <w:tcW w:type="dxa" w:w="1304"/>
+          </w:tcPr>
+          <w:p>
+            <w:r/>
+            <w:r>
+              <w:rPr>
+                <w:b w:val="0"/>
+                <w:sz w:val="20"/>
+              </w:rPr>
+              <w:t>Tamara</w:t>
+            </w:r>
+          </w:p>
+        </w:tc>
+        <w:tc>
+          <w:tcPr>
+            <w:tcW w:type="dxa" w:w="3402"/>
+          </w:tcPr>
+          <w:p>
+            <w:r/>
+            <w:r>
+              <w:rPr>
+                <w:b w:val="0"/>
+                <w:sz w:val="20"/>
+              </w:rPr>
+              <w:t>Hoje divide DP (folha), conciliações e emissão de notas; a partir de novembro, só DP</w:t>
+            </w:r>
+          </w:p>
+        </w:tc>
+        <w:tc>
+          <w:tcPr>
+            <w:tcW w:type="dxa" w:w="2948"/>
+          </w:tcPr>
+          <w:p>
+            <w:r/>
+            <w:r>
+              <w:rPr>
+                <w:b w:val="0"/>
+                <w:sz w:val="20"/>
+              </w:rPr>
+              <w:t>Sem experiência anterior; está gostando do DP</w:t>
+            </w:r>
+          </w:p>
+        </w:tc>
+        <w:tc>
+          <w:tcPr>
+            <w:tcW w:type="dxa" w:w="1417"/>
+          </w:tcPr>
+          <w:p>
+            <w:r/>
+            <w:r>
+              <w:rPr>
+                <w:b w:val="0"/>
+                <w:sz w:val="20"/>
+              </w:rPr>
+              <w:t>00:39 a 00:41, 02:05</w:t>
+            </w:r>
+          </w:p>
+        </w:tc>
+      </w:tr>
+      <w:tr>
+        <w:tc>
+          <w:tcPr>
+            <w:tcW w:type="dxa" w:w="1304"/>
+          </w:tcPr>
+          <w:p>
+            <w:r/>
+            <w:r>
+              <w:rPr>
+                <w:b w:val="0"/>
+                <w:sz w:val="20"/>
+              </w:rPr>
+              <w:t>Alana</w:t>
+            </w:r>
+          </w:p>
+        </w:tc>
+        <w:tc>
+          <w:tcPr>
+            <w:tcW w:type="dxa" w:w="3402"/>
+          </w:tcPr>
+          <w:p>
+            <w:r/>
+            <w:r>
+              <w:rPr>
+                <w:b w:val="0"/>
+                <w:sz w:val="20"/>
+              </w:rPr>
+              <w:t>Estagiária do jurídico: processos em andamento e apoio no societário</w:t>
+            </w:r>
+          </w:p>
+        </w:tc>
+        <w:tc>
+          <w:tcPr>
+            <w:tcW w:type="dxa" w:w="2948"/>
+          </w:tcPr>
+          <w:p>
+            <w:r/>
+            <w:r>
+              <w:rPr>
+                <w:b w:val="0"/>
+                <w:sz w:val="20"/>
+              </w:rPr>
+              <w:t>Trabalha só quarta e sexta, paga por hora; tudo precisa de revisão; a permanência está em reavaliação</w:t>
+            </w:r>
+          </w:p>
+        </w:tc>
+        <w:tc>
+          <w:tcPr>
+            <w:tcW w:type="dxa" w:w="1417"/>
+          </w:tcPr>
+          <w:p>
+            <w:r/>
+            <w:r>
+              <w:rPr>
+                <w:b w:val="0"/>
+                <w:sz w:val="20"/>
+              </w:rPr>
+              <w:t>00:42 a 00:43, 01:40 a 01:42, 02:18</w:t>
+            </w:r>
+          </w:p>
+        </w:tc>
+      </w:tr>
+    </w:tbl>
+    <w:p/>
+    <w:p>
+      <w:r>
+        <w:rPr>
+          <w:i w:val="0"/>
+        </w:rPr>
+        <w:t>A contadora contratada para assumir a contabilidade saiu depois do erro de agosto. Desde então a área não tem responsável além da Thamires (00:30).</w:t>
+      </w:r>
+    </w:p>
+    <w:p>
+      <w:pPr>
+        <w:pStyle w:val="Heading1"/>
+      </w:pPr>
+      <w:r>
+        <w:t>4. Ferramentas e uso real</w:t>
+      </w:r>
+    </w:p>
+    <w:tbl>
+      <w:tblPr>
+        <w:tblStyle w:val="TableGrid"/>
+        <w:tblW w:type="auto" w:w="0"/>
+        <w:jc w:val="center"/>
+        <w:tblLook w:firstColumn="1" w:firstRow="1" w:lastColumn="0" w:lastRow="0" w:noHBand="0" w:noVBand="1" w:val="04A0"/>
+      </w:tblPr>
+      <w:tblGrid>
+        <w:gridCol w:w="3249"/>
+        <w:gridCol w:w="3249"/>
+        <w:gridCol w:w="3249"/>
+      </w:tblGrid>
+      <w:tr>
+        <w:tc>
+          <w:tcPr>
+            <w:tcW w:type="dxa" w:w="1984"/>
             <w:shd w:val="clear" w:color="auto" w:fill="1F3A5F"/>
           </w:tcPr>
           <w:p>
@@ -587,6 +1048,649 @@
         </w:tc>
         <w:tc>
           <w:tcPr>
+            <w:tcW w:type="dxa" w:w="5669"/>
+            <w:shd w:val="clear" w:color="auto" w:fill="1F3A5F"/>
+          </w:tcPr>
+          <w:p>
+            <w:r/>
+            <w:r>
+              <w:rPr>
+                <w:b/>
+                <w:color w:val="FFFFFF"/>
+                <w:sz w:val="20"/>
+              </w:rPr>
+              <w:t>Uso descrito na reunião</w:t>
+            </w:r>
+          </w:p>
+        </w:tc>
+        <w:tc>
+          <w:tcPr>
+            <w:tcW w:type="dxa" w:w="1417"/>
+            <w:shd w:val="clear" w:color="auto" w:fill="1F3A5F"/>
+          </w:tcPr>
+          <w:p>
+            <w:r/>
+            <w:r>
+              <w:rPr>
+                <w:b/>
+                <w:color w:val="FFFFFF"/>
+                <w:sz w:val="20"/>
+              </w:rPr>
+              <w:t>Fonte</w:t>
+            </w:r>
+          </w:p>
+        </w:tc>
+      </w:tr>
+      <w:tr>
+        <w:tc>
+          <w:tcPr>
+            <w:tcW w:type="dxa" w:w="1984"/>
+          </w:tcPr>
+          <w:p>
+            <w:r/>
+            <w:r>
+              <w:rPr>
+                <w:b w:val="0"/>
+                <w:sz w:val="20"/>
+              </w:rPr>
+              <w:t>Trello</w:t>
+            </w:r>
+          </w:p>
+        </w:tc>
+        <w:tc>
+          <w:tcPr>
+            <w:tcW w:type="dxa" w:w="5669"/>
+          </w:tcPr>
+          <w:p>
+            <w:r/>
+            <w:r>
+              <w:rPr>
+                <w:b w:val="0"/>
+                <w:sz w:val="20"/>
+              </w:rPr>
+              <w:t>Principal ferramenta de gestão: rotinas diárias e mensais por pessoa, pendências, checklists de novo cliente e de abertura de empresa. Ela atribui ao Trello a queda nos erros</w:t>
+            </w:r>
+          </w:p>
+        </w:tc>
+        <w:tc>
+          <w:tcPr>
+            <w:tcW w:type="dxa" w:w="1417"/>
+          </w:tcPr>
+          <w:p>
+            <w:r/>
+            <w:r>
+              <w:rPr>
+                <w:b w:val="0"/>
+                <w:sz w:val="20"/>
+              </w:rPr>
+              <w:t>01:03 a 01:07</w:t>
+            </w:r>
+          </w:p>
+        </w:tc>
+      </w:tr>
+      <w:tr>
+        <w:tc>
+          <w:tcPr>
+            <w:tcW w:type="dxa" w:w="1984"/>
+          </w:tcPr>
+          <w:p>
+            <w:r/>
+            <w:r>
+              <w:rPr>
+                <w:b w:val="0"/>
+                <w:sz w:val="20"/>
+              </w:rPr>
+              <w:t>OneDrive / Office</w:t>
+            </w:r>
+          </w:p>
+        </w:tc>
+        <w:tc>
+          <w:tcPr>
+            <w:tcW w:type="dxa" w:w="5669"/>
+          </w:tcPr>
+          <w:p>
+            <w:r/>
+            <w:r>
+              <w:rPr>
+                <w:b w:val="0"/>
+                <w:sz w:val="20"/>
+              </w:rPr>
+              <w:t>Nuvem organizada por frente de serviço, com padrão de pastas por cliente; pasta Geral com acessos, passo a passos e modelos. Toda a equipe trabalha na nuvem</w:t>
+            </w:r>
+          </w:p>
+        </w:tc>
+        <w:tc>
+          <w:tcPr>
+            <w:tcW w:type="dxa" w:w="1417"/>
+          </w:tcPr>
+          <w:p>
+            <w:r/>
+            <w:r>
+              <w:rPr>
+                <w:b w:val="0"/>
+                <w:sz w:val="20"/>
+              </w:rPr>
+              <w:t>00:52 a 00:54, 01:03</w:t>
+            </w:r>
+          </w:p>
+        </w:tc>
+      </w:tr>
+      <w:tr>
+        <w:tc>
+          <w:tcPr>
+            <w:tcW w:type="dxa" w:w="1984"/>
+          </w:tcPr>
+          <w:p>
+            <w:r/>
+            <w:r>
+              <w:rPr>
+                <w:b w:val="0"/>
+                <w:sz w:val="20"/>
+              </w:rPr>
+              <w:t>Google Agenda</w:t>
+            </w:r>
+          </w:p>
+        </w:tc>
+        <w:tc>
+          <w:tcPr>
+            <w:tcW w:type="dxa" w:w="5669"/>
+          </w:tcPr>
+          <w:p>
+            <w:r/>
+            <w:r>
+              <w:rPr>
+                <w:b w:val="0"/>
+                <w:sz w:val="20"/>
+              </w:rPr>
+              <w:t>Agenda central da operação, controlada pela Júlia</w:t>
+            </w:r>
+          </w:p>
+        </w:tc>
+        <w:tc>
+          <w:tcPr>
+            <w:tcW w:type="dxa" w:w="1417"/>
+          </w:tcPr>
+          <w:p>
+            <w:r/>
+            <w:r>
+              <w:rPr>
+                <w:b w:val="0"/>
+                <w:sz w:val="20"/>
+              </w:rPr>
+              <w:t>00:51</w:t>
+            </w:r>
+          </w:p>
+        </w:tc>
+      </w:tr>
+      <w:tr>
+        <w:tc>
+          <w:tcPr>
+            <w:tcW w:type="dxa" w:w="1984"/>
+          </w:tcPr>
+          <w:p>
+            <w:r/>
+            <w:r>
+              <w:rPr>
+                <w:b w:val="0"/>
+                <w:sz w:val="20"/>
+              </w:rPr>
+              <w:t>Veri</w:t>
+            </w:r>
+          </w:p>
+        </w:tc>
+        <w:tc>
+          <w:tcPr>
+            <w:tcW w:type="dxa" w:w="5669"/>
+          </w:tcPr>
+          <w:p>
+            <w:r/>
+            <w:r>
+              <w:rPr>
+                <w:b w:val="0"/>
+                <w:sz w:val="20"/>
+              </w:rPr>
+              <w:t>Suporte à contabilidade: aplicativo do cliente com impostos, certidões e documentos, modelos de contrato. A partir de novembro a comunicação com clientes de contabilidade será só pelo aplicativo</w:t>
+            </w:r>
+          </w:p>
+        </w:tc>
+        <w:tc>
+          <w:tcPr>
+            <w:tcW w:type="dxa" w:w="1417"/>
+          </w:tcPr>
+          <w:p>
+            <w:r/>
+            <w:r>
+              <w:rPr>
+                <w:b w:val="0"/>
+                <w:sz w:val="20"/>
+              </w:rPr>
+              <w:t>01:15 a 01:17</w:t>
+            </w:r>
+          </w:p>
+        </w:tc>
+      </w:tr>
+      <w:tr>
+        <w:tc>
+          <w:tcPr>
+            <w:tcW w:type="dxa" w:w="1984"/>
+          </w:tcPr>
+          <w:p>
+            <w:r/>
+            <w:r>
+              <w:rPr>
+                <w:b w:val="0"/>
+                <w:sz w:val="20"/>
+              </w:rPr>
+              <w:t>Domínio</w:t>
+            </w:r>
+          </w:p>
+        </w:tc>
+        <w:tc>
+          <w:tcPr>
+            <w:tcW w:type="dxa" w:w="5669"/>
+          </w:tcPr>
+          <w:p>
+            <w:r/>
+            <w:r>
+              <w:rPr>
+                <w:b w:val="0"/>
+                <w:sz w:val="20"/>
+              </w:rPr>
+              <w:t>Sistema contábil e fiscal. Configuração errada desde a migração; hoje o fiscal é feito direto no portal da Receita</w:t>
+            </w:r>
+          </w:p>
+        </w:tc>
+        <w:tc>
+          <w:tcPr>
+            <w:tcW w:type="dxa" w:w="1417"/>
+          </w:tcPr>
+          <w:p>
+            <w:r/>
+            <w:r>
+              <w:rPr>
+                <w:b w:val="0"/>
+                <w:sz w:val="20"/>
+              </w:rPr>
+              <w:t>01:17</w:t>
+            </w:r>
+          </w:p>
+        </w:tc>
+      </w:tr>
+      <w:tr>
+        <w:tc>
+          <w:tcPr>
+            <w:tcW w:type="dxa" w:w="1984"/>
+          </w:tcPr>
+          <w:p>
+            <w:r/>
+            <w:r>
+              <w:rPr>
+                <w:b w:val="0"/>
+                <w:sz w:val="20"/>
+              </w:rPr>
+              <w:t>Conta Azul</w:t>
+            </w:r>
+          </w:p>
+        </w:tc>
+        <w:tc>
+          <w:tcPr>
+            <w:tcW w:type="dxa" w:w="5669"/>
+          </w:tcPr>
+          <w:p>
+            <w:r/>
+            <w:r>
+              <w:rPr>
+                <w:b w:val="0"/>
+                <w:sz w:val="20"/>
+              </w:rPr>
+              <w:t>Operação dos clientes do financeiro: conciliação bancária, extratos, plano de contas personalizado. A emissão de nota a partir da conciliação ainda não foi configurada</w:t>
+            </w:r>
+          </w:p>
+        </w:tc>
+        <w:tc>
+          <w:tcPr>
+            <w:tcW w:type="dxa" w:w="1417"/>
+          </w:tcPr>
+          <w:p>
+            <w:r/>
+            <w:r>
+              <w:rPr>
+                <w:b w:val="0"/>
+                <w:sz w:val="20"/>
+              </w:rPr>
+              <w:t>01:20, 00:40</w:t>
+            </w:r>
+          </w:p>
+        </w:tc>
+      </w:tr>
+      <w:tr>
+        <w:tc>
+          <w:tcPr>
+            <w:tcW w:type="dxa" w:w="1984"/>
+          </w:tcPr>
+          <w:p>
+            <w:r/>
+            <w:r>
+              <w:rPr>
+                <w:b w:val="0"/>
+                <w:sz w:val="20"/>
+              </w:rPr>
+              <w:t>Plataforma de atendimento (WhatsApp)</w:t>
+            </w:r>
+          </w:p>
+        </w:tc>
+        <w:tc>
+          <w:tcPr>
+            <w:tcW w:type="dxa" w:w="5669"/>
+          </w:tcPr>
+          <w:p>
+            <w:r/>
+            <w:r>
+              <w:rPr>
+                <w:b w:val="0"/>
+                <w:sz w:val="20"/>
+              </w:rPr>
+              <w:t>Número único com vários usuários; a Júlia recebe e distribui as conversas para a equipe [CONFIRMAR se é o NetsApp citado no briefing]</w:t>
+            </w:r>
+          </w:p>
+        </w:tc>
+        <w:tc>
+          <w:tcPr>
+            <w:tcW w:type="dxa" w:w="1417"/>
+          </w:tcPr>
+          <w:p>
+            <w:r/>
+            <w:r>
+              <w:rPr>
+                <w:b w:val="0"/>
+                <w:sz w:val="20"/>
+              </w:rPr>
+              <w:t>01:54 a 01:55</w:t>
+            </w:r>
+          </w:p>
+        </w:tc>
+      </w:tr>
+      <w:tr>
+        <w:tc>
+          <w:tcPr>
+            <w:tcW w:type="dxa" w:w="1984"/>
+          </w:tcPr>
+          <w:p>
+            <w:r/>
+            <w:r>
+              <w:rPr>
+                <w:b w:val="0"/>
+                <w:sz w:val="20"/>
+              </w:rPr>
+              <w:t>Jusbrasil</w:t>
+            </w:r>
+          </w:p>
+        </w:tc>
+        <w:tc>
+          <w:tcPr>
+            <w:tcW w:type="dxa" w:w="5669"/>
+          </w:tcPr>
+          <w:p>
+            <w:r/>
+            <w:r>
+              <w:rPr>
+                <w:b w:val="0"/>
+                <w:sz w:val="20"/>
+              </w:rPr>
+              <w:t>IA jurídica e modelos de petição; o monitoramento automático dos processos ainda não foi configurado</w:t>
+            </w:r>
+          </w:p>
+        </w:tc>
+        <w:tc>
+          <w:tcPr>
+            <w:tcW w:type="dxa" w:w="1417"/>
+          </w:tcPr>
+          <w:p>
+            <w:r/>
+            <w:r>
+              <w:rPr>
+                <w:b w:val="0"/>
+                <w:sz w:val="20"/>
+              </w:rPr>
+              <w:t>01:43 a 01:44</w:t>
+            </w:r>
+          </w:p>
+        </w:tc>
+      </w:tr>
+      <w:tr>
+        <w:tc>
+          <w:tcPr>
+            <w:tcW w:type="dxa" w:w="1984"/>
+          </w:tcPr>
+          <w:p>
+            <w:r/>
+            <w:r>
+              <w:rPr>
+                <w:b w:val="0"/>
+                <w:sz w:val="20"/>
+              </w:rPr>
+              <w:t>Canva</w:t>
+            </w:r>
+          </w:p>
+        </w:tc>
+        <w:tc>
+          <w:tcPr>
+            <w:tcW w:type="dxa" w:w="5669"/>
+          </w:tcPr>
+          <w:p>
+            <w:r/>
+            <w:r>
+              <w:rPr>
+                <w:b w:val="0"/>
+                <w:sz w:val="20"/>
+              </w:rPr>
+              <w:t>Modelos de proposta comercial preenchidos pela Júlia</w:t>
+            </w:r>
+          </w:p>
+        </w:tc>
+        <w:tc>
+          <w:tcPr>
+            <w:tcW w:type="dxa" w:w="1417"/>
+          </w:tcPr>
+          <w:p>
+            <w:r/>
+            <w:r>
+              <w:rPr>
+                <w:b w:val="0"/>
+                <w:sz w:val="20"/>
+              </w:rPr>
+              <w:t>01:22</w:t>
+            </w:r>
+          </w:p>
+        </w:tc>
+      </w:tr>
+      <w:tr>
+        <w:tc>
+          <w:tcPr>
+            <w:tcW w:type="dxa" w:w="1984"/>
+          </w:tcPr>
+          <w:p>
+            <w:r/>
+            <w:r>
+              <w:rPr>
+                <w:b w:val="0"/>
+                <w:sz w:val="20"/>
+              </w:rPr>
+              <w:t>Claude e Lovable</w:t>
+            </w:r>
+          </w:p>
+        </w:tc>
+        <w:tc>
+          <w:tcPr>
+            <w:tcW w:type="dxa" w:w="5669"/>
+          </w:tcPr>
+          <w:p>
+            <w:r/>
+            <w:r>
+              <w:rPr>
+                <w:b w:val="0"/>
+                <w:sz w:val="20"/>
+              </w:rPr>
+              <w:t>Usados pela Thamires para o fechamento financeiro: o primeiro levou 5 horas, os últimos de 1 a 2 horas, refinando o prompt a cada mês</w:t>
+            </w:r>
+          </w:p>
+        </w:tc>
+        <w:tc>
+          <w:tcPr>
+            <w:tcW w:type="dxa" w:w="1417"/>
+          </w:tcPr>
+          <w:p>
+            <w:r/>
+            <w:r>
+              <w:rPr>
+                <w:b w:val="0"/>
+                <w:sz w:val="20"/>
+              </w:rPr>
+              <w:t>00:33 a 00:35</w:t>
+            </w:r>
+          </w:p>
+        </w:tc>
+      </w:tr>
+      <w:tr>
+        <w:tc>
+          <w:tcPr>
+            <w:tcW w:type="dxa" w:w="1984"/>
+          </w:tcPr>
+          <w:p>
+            <w:r/>
+            <w:r>
+              <w:rPr>
+                <w:b w:val="0"/>
+                <w:sz w:val="20"/>
+              </w:rPr>
+              <w:t>ChatGPT</w:t>
+            </w:r>
+          </w:p>
+        </w:tc>
+        <w:tc>
+          <w:tcPr>
+            <w:tcW w:type="dxa" w:w="5669"/>
+          </w:tcPr>
+          <w:p>
+            <w:r/>
+            <w:r>
+              <w:rPr>
+                <w:b w:val="0"/>
+                <w:sz w:val="20"/>
+              </w:rPr>
+              <w:t>Usado pela Júlia no atendimento</w:t>
+            </w:r>
+          </w:p>
+        </w:tc>
+        <w:tc>
+          <w:tcPr>
+            <w:tcW w:type="dxa" w:w="1417"/>
+          </w:tcPr>
+          <w:p>
+            <w:r/>
+            <w:r>
+              <w:rPr>
+                <w:b w:val="0"/>
+                <w:sz w:val="20"/>
+              </w:rPr>
+              <w:t>01:55</w:t>
+            </w:r>
+          </w:p>
+        </w:tc>
+      </w:tr>
+    </w:tbl>
+    <w:p/>
+    <w:p>
+      <w:r>
+        <w:rPr>
+          <w:i w:val="0"/>
+        </w:rPr>
+        <w:t>Ela quer recriar as contas (e-mail, nuvem, Trello, Claude, Lovable) do zero no novo domínio da Surcin, porque o pacote antigo vai expirar (00:59 a 01:00, 02:10).</w:t>
+      </w:r>
+    </w:p>
+    <w:p>
+      <w:pPr>
+        <w:pStyle w:val="Heading1"/>
+      </w:pPr>
+      <w:r>
+        <w:t>5. Processos que já existem</w:t>
+      </w:r>
+    </w:p>
+    <w:p>
+      <w:r>
+        <w:rPr>
+          <w:i w:val="0"/>
+        </w:rPr>
+        <w:t>Processos citados com algum nível de documentação (passo a passo, checklist ou rotina no Trello):</w:t>
+      </w:r>
+    </w:p>
+    <w:tbl>
+      <w:tblPr>
+        <w:tblStyle w:val="TableGrid"/>
+        <w:tblW w:type="auto" w:w="0"/>
+        <w:jc w:val="center"/>
+        <w:tblLook w:firstColumn="1" w:firstRow="1" w:lastColumn="0" w:lastRow="0" w:noHBand="0" w:noVBand="1" w:val="04A0"/>
+      </w:tblPr>
+      <w:tblGrid>
+        <w:gridCol w:w="2436"/>
+        <w:gridCol w:w="2436"/>
+        <w:gridCol w:w="2436"/>
+        <w:gridCol w:w="2436"/>
+      </w:tblGrid>
+      <w:tr>
+        <w:tc>
+          <w:tcPr>
+            <w:tcW w:type="dxa" w:w="454"/>
+            <w:shd w:val="clear" w:color="auto" w:fill="1F3A5F"/>
+          </w:tcPr>
+          <w:p>
+            <w:r/>
+            <w:r>
+              <w:rPr>
+                <w:b/>
+                <w:color w:val="FFFFFF"/>
+                <w:sz w:val="20"/>
+              </w:rPr>
+              <w:t>#</w:t>
+            </w:r>
+          </w:p>
+        </w:tc>
+        <w:tc>
+          <w:tcPr>
+            <w:tcW w:type="dxa" w:w="3515"/>
+            <w:shd w:val="clear" w:color="auto" w:fill="1F3A5F"/>
+          </w:tcPr>
+          <w:p>
+            <w:r/>
+            <w:r>
+              <w:rPr>
+                <w:b/>
+                <w:color w:val="FFFFFF"/>
+                <w:sz w:val="20"/>
+              </w:rPr>
+              <w:t>Processo</w:t>
+            </w:r>
+          </w:p>
+        </w:tc>
+        <w:tc>
+          <w:tcPr>
+            <w:tcW w:type="dxa" w:w="1984"/>
+            <w:shd w:val="clear" w:color="auto" w:fill="1F3A5F"/>
+          </w:tcPr>
+          <w:p>
+            <w:r/>
+            <w:r>
+              <w:rPr>
+                <w:b/>
+                <w:color w:val="FFFFFF"/>
+                <w:sz w:val="20"/>
+              </w:rPr>
+              <w:t>Quem executa</w:t>
+            </w:r>
+          </w:p>
+        </w:tc>
+        <w:tc>
+          <w:tcPr>
             <w:tcW w:type="dxa" w:w="3118"/>
             <w:shd w:val="clear" w:color="auto" w:fill="1F3A5F"/>
           </w:tcPr>
@@ -598,7 +1702,730 @@
                 <w:color w:val="FFFFFF"/>
                 <w:sz w:val="20"/>
               </w:rPr>
-              <w:t>Uso provável</w:t>
+              <w:t>Situação descrita</w:t>
+            </w:r>
+          </w:p>
+        </w:tc>
+      </w:tr>
+      <w:tr>
+        <w:tc>
+          <w:tcPr>
+            <w:tcW w:type="dxa" w:w="454"/>
+          </w:tcPr>
+          <w:p>
+            <w:r/>
+            <w:r>
+              <w:rPr>
+                <w:b w:val="0"/>
+                <w:sz w:val="20"/>
+              </w:rPr>
+              <w:t>1</w:t>
+            </w:r>
+          </w:p>
+        </w:tc>
+        <w:tc>
+          <w:tcPr>
+            <w:tcW w:type="dxa" w:w="3515"/>
+          </w:tcPr>
+          <w:p>
+            <w:r/>
+            <w:r>
+              <w:rPr>
+                <w:b w:val="0"/>
+                <w:sz w:val="20"/>
+              </w:rPr>
+              <w:t>Atendimento e triagem de demandas</w:t>
+            </w:r>
+          </w:p>
+        </w:tc>
+        <w:tc>
+          <w:tcPr>
+            <w:tcW w:type="dxa" w:w="1984"/>
+          </w:tcPr>
+          <w:p>
+            <w:r/>
+            <w:r>
+              <w:rPr>
+                <w:b w:val="0"/>
+                <w:sz w:val="20"/>
+              </w:rPr>
+              <w:t>Júlia</w:t>
+            </w:r>
+          </w:p>
+        </w:tc>
+        <w:tc>
+          <w:tcPr>
+            <w:tcW w:type="dxa" w:w="3118"/>
+          </w:tcPr>
+          <w:p>
+            <w:r/>
+            <w:r>
+              <w:rPr>
+                <w:b w:val="0"/>
+                <w:sz w:val="20"/>
+              </w:rPr>
+              <w:t>Funciona, mas concentra tudo nela</w:t>
+            </w:r>
+          </w:p>
+        </w:tc>
+      </w:tr>
+      <w:tr>
+        <w:tc>
+          <w:tcPr>
+            <w:tcW w:type="dxa" w:w="454"/>
+          </w:tcPr>
+          <w:p>
+            <w:r/>
+            <w:r>
+              <w:rPr>
+                <w:b w:val="0"/>
+                <w:sz w:val="20"/>
+              </w:rPr>
+              <w:t>2</w:t>
+            </w:r>
+          </w:p>
+        </w:tc>
+        <w:tc>
+          <w:tcPr>
+            <w:tcW w:type="dxa" w:w="3515"/>
+          </w:tcPr>
+          <w:p>
+            <w:r/>
+            <w:r>
+              <w:rPr>
+                <w:b w:val="0"/>
+                <w:sz w:val="20"/>
+              </w:rPr>
+              <w:t>Comercial: primeiro atendimento, checklist, proposta, reunião</w:t>
+            </w:r>
+          </w:p>
+        </w:tc>
+        <w:tc>
+          <w:tcPr>
+            <w:tcW w:type="dxa" w:w="1984"/>
+          </w:tcPr>
+          <w:p>
+            <w:r/>
+            <w:r>
+              <w:rPr>
+                <w:b w:val="0"/>
+                <w:sz w:val="20"/>
+              </w:rPr>
+              <w:t>Júlia e Thamires</w:t>
+            </w:r>
+          </w:p>
+        </w:tc>
+        <w:tc>
+          <w:tcPr>
+            <w:tcW w:type="dxa" w:w="3118"/>
+          </w:tcPr>
+          <w:p>
+            <w:r/>
+            <w:r>
+              <w:rPr>
+                <w:b w:val="0"/>
+                <w:sz w:val="20"/>
+              </w:rPr>
+              <w:t>Checklist e modelos prontos</w:t>
+            </w:r>
+          </w:p>
+        </w:tc>
+      </w:tr>
+      <w:tr>
+        <w:tc>
+          <w:tcPr>
+            <w:tcW w:type="dxa" w:w="454"/>
+          </w:tcPr>
+          <w:p>
+            <w:r/>
+            <w:r>
+              <w:rPr>
+                <w:b w:val="0"/>
+                <w:sz w:val="20"/>
+              </w:rPr>
+              <w:t>3</w:t>
+            </w:r>
+          </w:p>
+        </w:tc>
+        <w:tc>
+          <w:tcPr>
+            <w:tcW w:type="dxa" w:w="3515"/>
+          </w:tcPr>
+          <w:p>
+            <w:r/>
+            <w:r>
+              <w:rPr>
+                <w:b w:val="0"/>
+                <w:sz w:val="20"/>
+              </w:rPr>
+              <w:t>Implantação de novo cliente de contabilidade</w:t>
+            </w:r>
+          </w:p>
+        </w:tc>
+        <w:tc>
+          <w:tcPr>
+            <w:tcW w:type="dxa" w:w="1984"/>
+          </w:tcPr>
+          <w:p>
+            <w:r/>
+            <w:r>
+              <w:rPr>
+                <w:b w:val="0"/>
+                <w:sz w:val="20"/>
+              </w:rPr>
+              <w:t>Júlia</w:t>
+            </w:r>
+          </w:p>
+        </w:tc>
+        <w:tc>
+          <w:tcPr>
+            <w:tcW w:type="dxa" w:w="3118"/>
+          </w:tcPr>
+          <w:p>
+            <w:r/>
+            <w:r>
+              <w:rPr>
+                <w:b w:val="0"/>
+                <w:sz w:val="20"/>
+              </w:rPr>
+              <w:t>Checklist pronto; precisa de atualização</w:t>
+            </w:r>
+          </w:p>
+        </w:tc>
+      </w:tr>
+      <w:tr>
+        <w:tc>
+          <w:tcPr>
+            <w:tcW w:type="dxa" w:w="454"/>
+          </w:tcPr>
+          <w:p>
+            <w:r/>
+            <w:r>
+              <w:rPr>
+                <w:b w:val="0"/>
+                <w:sz w:val="20"/>
+              </w:rPr>
+              <w:t>4</w:t>
+            </w:r>
+          </w:p>
+        </w:tc>
+        <w:tc>
+          <w:tcPr>
+            <w:tcW w:type="dxa" w:w="3515"/>
+          </w:tcPr>
+          <w:p>
+            <w:r/>
+            <w:r>
+              <w:rPr>
+                <w:b w:val="0"/>
+                <w:sz w:val="20"/>
+              </w:rPr>
+              <w:t>Implantação de novo cliente de financeiro</w:t>
+            </w:r>
+          </w:p>
+        </w:tc>
+        <w:tc>
+          <w:tcPr>
+            <w:tcW w:type="dxa" w:w="1984"/>
+          </w:tcPr>
+          <w:p>
+            <w:r/>
+            <w:r>
+              <w:rPr>
+                <w:b w:val="0"/>
+                <w:sz w:val="20"/>
+              </w:rPr>
+              <w:t>Júlia e Vitória</w:t>
+            </w:r>
+          </w:p>
+        </w:tc>
+        <w:tc>
+          <w:tcPr>
+            <w:tcW w:type="dxa" w:w="3118"/>
+          </w:tcPr>
+          <w:p>
+            <w:r/>
+            <w:r>
+              <w:rPr>
+                <w:b w:val="0"/>
+                <w:sz w:val="20"/>
+              </w:rPr>
+              <w:t>Checklist pronto; inclui planilha, Trello e Conta Azul</w:t>
+            </w:r>
+          </w:p>
+        </w:tc>
+      </w:tr>
+      <w:tr>
+        <w:tc>
+          <w:tcPr>
+            <w:tcW w:type="dxa" w:w="454"/>
+          </w:tcPr>
+          <w:p>
+            <w:r/>
+            <w:r>
+              <w:rPr>
+                <w:b w:val="0"/>
+                <w:sz w:val="20"/>
+              </w:rPr>
+              <w:t>5</w:t>
+            </w:r>
+          </w:p>
+        </w:tc>
+        <w:tc>
+          <w:tcPr>
+            <w:tcW w:type="dxa" w:w="3515"/>
+          </w:tcPr>
+          <w:p>
+            <w:r/>
+            <w:r>
+              <w:rPr>
+                <w:b w:val="0"/>
+                <w:sz w:val="20"/>
+              </w:rPr>
+              <w:t>Abertura de empresa (societário)</w:t>
+            </w:r>
+          </w:p>
+        </w:tc>
+        <w:tc>
+          <w:tcPr>
+            <w:tcW w:type="dxa" w:w="1984"/>
+          </w:tcPr>
+          <w:p>
+            <w:r/>
+            <w:r>
+              <w:rPr>
+                <w:b w:val="0"/>
+                <w:sz w:val="20"/>
+              </w:rPr>
+              <w:t>Júlia, Alana, Thamires</w:t>
+            </w:r>
+          </w:p>
+        </w:tc>
+        <w:tc>
+          <w:tcPr>
+            <w:tcW w:type="dxa" w:w="3118"/>
+          </w:tcPr>
+          <w:p>
+            <w:r/>
+            <w:r>
+              <w:rPr>
+                <w:b w:val="0"/>
+                <w:sz w:val="20"/>
+              </w:rPr>
+              <w:t>Checklist no Trello; abertura em Campinas gravada, sem refinar</w:t>
+            </w:r>
+          </w:p>
+        </w:tc>
+      </w:tr>
+      <w:tr>
+        <w:tc>
+          <w:tcPr>
+            <w:tcW w:type="dxa" w:w="454"/>
+          </w:tcPr>
+          <w:p>
+            <w:r/>
+            <w:r>
+              <w:rPr>
+                <w:b w:val="0"/>
+                <w:sz w:val="20"/>
+              </w:rPr>
+              <w:t>6</w:t>
+            </w:r>
+          </w:p>
+        </w:tc>
+        <w:tc>
+          <w:tcPr>
+            <w:tcW w:type="dxa" w:w="3515"/>
+          </w:tcPr>
+          <w:p>
+            <w:r/>
+            <w:r>
+              <w:rPr>
+                <w:b w:val="0"/>
+                <w:sz w:val="20"/>
+              </w:rPr>
+              <w:t>Fiscal mensal: XML, apuração, guia, recibos, envio ao cliente</w:t>
+            </w:r>
+          </w:p>
+        </w:tc>
+        <w:tc>
+          <w:tcPr>
+            <w:tcW w:type="dxa" w:w="1984"/>
+          </w:tcPr>
+          <w:p>
+            <w:r/>
+            <w:r>
+              <w:rPr>
+                <w:b w:val="0"/>
+                <w:sz w:val="20"/>
+              </w:rPr>
+              <w:t>Thamires e Júlia</w:t>
+            </w:r>
+          </w:p>
+        </w:tc>
+        <w:tc>
+          <w:tcPr>
+            <w:tcW w:type="dxa" w:w="3118"/>
+          </w:tcPr>
+          <w:p>
+            <w:r/>
+            <w:r>
+              <w:rPr>
+                <w:b w:val="0"/>
+                <w:sz w:val="20"/>
+              </w:rPr>
+              <w:t>Feito fora do Domínio; maior risco (erro de agosto)</w:t>
+            </w:r>
+          </w:p>
+        </w:tc>
+      </w:tr>
+      <w:tr>
+        <w:tc>
+          <w:tcPr>
+            <w:tcW w:type="dxa" w:w="454"/>
+          </w:tcPr>
+          <w:p>
+            <w:r/>
+            <w:r>
+              <w:rPr>
+                <w:b w:val="0"/>
+                <w:sz w:val="20"/>
+              </w:rPr>
+              <w:t>7</w:t>
+            </w:r>
+          </w:p>
+        </w:tc>
+        <w:tc>
+          <w:tcPr>
+            <w:tcW w:type="dxa" w:w="3515"/>
+          </w:tcPr>
+          <w:p>
+            <w:r/>
+            <w:r>
+              <w:rPr>
+                <w:b w:val="0"/>
+                <w:sz w:val="20"/>
+              </w:rPr>
+              <w:t>Pagamentos dos clientes do financeiro (terças e sextas)</w:t>
+            </w:r>
+          </w:p>
+        </w:tc>
+        <w:tc>
+          <w:tcPr>
+            <w:tcW w:type="dxa" w:w="1984"/>
+          </w:tcPr>
+          <w:p>
+            <w:r/>
+            <w:r>
+              <w:rPr>
+                <w:b w:val="0"/>
+                <w:sz w:val="20"/>
+              </w:rPr>
+              <w:t>Vitória</w:t>
+            </w:r>
+          </w:p>
+        </w:tc>
+        <w:tc>
+          <w:tcPr>
+            <w:tcW w:type="dxa" w:w="3118"/>
+          </w:tcPr>
+          <w:p>
+            <w:r/>
+            <w:r>
+              <w:rPr>
+                <w:b w:val="0"/>
+                <w:sz w:val="20"/>
+              </w:rPr>
+              <w:t>Informações de pagamentos fixos desorganizadas em parte dos clientes</w:t>
+            </w:r>
+          </w:p>
+        </w:tc>
+      </w:tr>
+      <w:tr>
+        <w:tc>
+          <w:tcPr>
+            <w:tcW w:type="dxa" w:w="454"/>
+          </w:tcPr>
+          <w:p>
+            <w:r/>
+            <w:r>
+              <w:rPr>
+                <w:b w:val="0"/>
+                <w:sz w:val="20"/>
+              </w:rPr>
+              <w:t>8</w:t>
+            </w:r>
+          </w:p>
+        </w:tc>
+        <w:tc>
+          <w:tcPr>
+            <w:tcW w:type="dxa" w:w="3515"/>
+          </w:tcPr>
+          <w:p>
+            <w:r/>
+            <w:r>
+              <w:rPr>
+                <w:b w:val="0"/>
+                <w:sz w:val="20"/>
+              </w:rPr>
+              <w:t>Emissão de notas fiscais</w:t>
+            </w:r>
+          </w:p>
+        </w:tc>
+        <w:tc>
+          <w:tcPr>
+            <w:tcW w:type="dxa" w:w="1984"/>
+          </w:tcPr>
+          <w:p>
+            <w:r/>
+            <w:r>
+              <w:rPr>
+                <w:b w:val="0"/>
+                <w:sz w:val="20"/>
+              </w:rPr>
+              <w:t>Tamara e Vitória</w:t>
+            </w:r>
+          </w:p>
+        </w:tc>
+        <w:tc>
+          <w:tcPr>
+            <w:tcW w:type="dxa" w:w="3118"/>
+          </w:tcPr>
+          <w:p>
+            <w:r/>
+            <w:r>
+              <w:rPr>
+                <w:b w:val="0"/>
+                <w:sz w:val="20"/>
+              </w:rPr>
+              <w:t>Feita por fora do Conta Azul</w:t>
+            </w:r>
+          </w:p>
+        </w:tc>
+      </w:tr>
+      <w:tr>
+        <w:tc>
+          <w:tcPr>
+            <w:tcW w:type="dxa" w:w="454"/>
+          </w:tcPr>
+          <w:p>
+            <w:r/>
+            <w:r>
+              <w:rPr>
+                <w:b w:val="0"/>
+                <w:sz w:val="20"/>
+              </w:rPr>
+              <w:t>9</w:t>
+            </w:r>
+          </w:p>
+        </w:tc>
+        <w:tc>
+          <w:tcPr>
+            <w:tcW w:type="dxa" w:w="3515"/>
+          </w:tcPr>
+          <w:p>
+            <w:r/>
+            <w:r>
+              <w:rPr>
+                <w:b w:val="0"/>
+                <w:sz w:val="20"/>
+              </w:rPr>
+              <w:t>Conciliação e fechamento mensal com reunião de resultado</w:t>
+            </w:r>
+          </w:p>
+        </w:tc>
+        <w:tc>
+          <w:tcPr>
+            <w:tcW w:type="dxa" w:w="1984"/>
+          </w:tcPr>
+          <w:p>
+            <w:r/>
+            <w:r>
+              <w:rPr>
+                <w:b w:val="0"/>
+                <w:sz w:val="20"/>
+              </w:rPr>
+              <w:t>Vitória e Thamires</w:t>
+            </w:r>
+          </w:p>
+        </w:tc>
+        <w:tc>
+          <w:tcPr>
+            <w:tcW w:type="dxa" w:w="3118"/>
+          </w:tcPr>
+          <w:p>
+            <w:r/>
+            <w:r>
+              <w:rPr>
+                <w:b w:val="0"/>
+                <w:sz w:val="20"/>
+              </w:rPr>
+              <w:t>Conciliação concentrada no fim do mês; cerca de 15 reuniões de 1 a 2 h na primeira semana</w:t>
+            </w:r>
+          </w:p>
+        </w:tc>
+      </w:tr>
+      <w:tr>
+        <w:tc>
+          <w:tcPr>
+            <w:tcW w:type="dxa" w:w="454"/>
+          </w:tcPr>
+          <w:p>
+            <w:r/>
+            <w:r>
+              <w:rPr>
+                <w:b w:val="0"/>
+                <w:sz w:val="20"/>
+              </w:rPr>
+              <w:t>10</w:t>
+            </w:r>
+          </w:p>
+        </w:tc>
+        <w:tc>
+          <w:tcPr>
+            <w:tcW w:type="dxa" w:w="3515"/>
+          </w:tcPr>
+          <w:p>
+            <w:r/>
+            <w:r>
+              <w:rPr>
+                <w:b w:val="0"/>
+                <w:sz w:val="20"/>
+              </w:rPr>
+              <w:t>Folha e rotinas de DP</w:t>
+            </w:r>
+          </w:p>
+        </w:tc>
+        <w:tc>
+          <w:tcPr>
+            <w:tcW w:type="dxa" w:w="1984"/>
+          </w:tcPr>
+          <w:p>
+            <w:r/>
+            <w:r>
+              <w:rPr>
+                <w:b w:val="0"/>
+                <w:sz w:val="20"/>
+              </w:rPr>
+              <w:t>Tamara</w:t>
+            </w:r>
+          </w:p>
+        </w:tc>
+        <w:tc>
+          <w:tcPr>
+            <w:tcW w:type="dxa" w:w="3118"/>
+          </w:tcPr>
+          <w:p>
+            <w:r/>
+            <w:r>
+              <w:rPr>
+                <w:b w:val="0"/>
+                <w:sz w:val="20"/>
+              </w:rPr>
+              <w:t>Volume baixo; pendências antigas a organizar</w:t>
+            </w:r>
+          </w:p>
+        </w:tc>
+      </w:tr>
+      <w:tr>
+        <w:tc>
+          <w:tcPr>
+            <w:tcW w:type="dxa" w:w="454"/>
+          </w:tcPr>
+          <w:p>
+            <w:r/>
+            <w:r>
+              <w:rPr>
+                <w:b w:val="0"/>
+                <w:sz w:val="20"/>
+              </w:rPr>
+              <w:t>11</w:t>
+            </w:r>
+          </w:p>
+        </w:tc>
+        <w:tc>
+          <w:tcPr>
+            <w:tcW w:type="dxa" w:w="3515"/>
+          </w:tcPr>
+          <w:p>
+            <w:r/>
+            <w:r>
+              <w:rPr>
+                <w:b w:val="0"/>
+                <w:sz w:val="20"/>
+              </w:rPr>
+              <w:t>Acompanhamento de processos jurídicos</w:t>
+            </w:r>
+          </w:p>
+        </w:tc>
+        <w:tc>
+          <w:tcPr>
+            <w:tcW w:type="dxa" w:w="1984"/>
+          </w:tcPr>
+          <w:p>
+            <w:r/>
+            <w:r>
+              <w:rPr>
+                <w:b w:val="0"/>
+                <w:sz w:val="20"/>
+              </w:rPr>
+              <w:t>Alana e Thamires</w:t>
+            </w:r>
+          </w:p>
+        </w:tc>
+        <w:tc>
+          <w:tcPr>
+            <w:tcW w:type="dxa" w:w="3118"/>
+          </w:tcPr>
+          <w:p>
+            <w:r/>
+            <w:r>
+              <w:rPr>
+                <w:b w:val="0"/>
+                <w:sz w:val="20"/>
+              </w:rPr>
+              <w:t>Revisão manual de todos os processos</w:t>
+            </w:r>
+          </w:p>
+        </w:tc>
+      </w:tr>
+    </w:tbl>
+    <w:p/>
+    <w:p>
+      <w:pPr>
+        <w:pStyle w:val="Heading1"/>
+      </w:pPr>
+      <w:r>
+        <w:t>6. Dores, objetivos e expectativas</w:t>
+      </w:r>
+    </w:p>
+    <w:tbl>
+      <w:tblPr>
+        <w:tblStyle w:val="TableGrid"/>
+        <w:tblW w:type="auto" w:w="0"/>
+        <w:jc w:val="center"/>
+        <w:tblLook w:firstColumn="1" w:firstRow="1" w:lastColumn="0" w:lastRow="0" w:noHBand="0" w:noVBand="1" w:val="04A0"/>
+      </w:tblPr>
+      <w:tblGrid>
+        <w:gridCol w:w="3249"/>
+        <w:gridCol w:w="3249"/>
+        <w:gridCol w:w="3249"/>
+      </w:tblGrid>
+      <w:tr>
+        <w:tc>
+          <w:tcPr>
+            <w:tcW w:type="dxa" w:w="5669"/>
+            <w:shd w:val="clear" w:color="auto" w:fill="1F3A5F"/>
+          </w:tcPr>
+          <w:p>
+            <w:r/>
+            <w:r>
+              <w:rPr>
+                <w:b/>
+                <w:color w:val="FFFFFF"/>
+                <w:sz w:val="20"/>
+              </w:rPr>
+              <w:t>Dor ou objetivo (palavras dela)</w:t>
             </w:r>
           </w:p>
         </w:tc>
@@ -621,7 +2448,7 @@
         </w:tc>
         <w:tc>
           <w:tcPr>
-            <w:tcW w:type="dxa" w:w="2551"/>
+            <w:tcW w:type="dxa" w:w="1701"/>
             <w:shd w:val="clear" w:color="auto" w:fill="1F3A5F"/>
           </w:tcPr>
           <w:p>
@@ -632,12 +2459,27 @@
                 <w:color w:val="FFFFFF"/>
                 <w:sz w:val="20"/>
               </w:rPr>
-              <w:t>Status</w:t>
+              <w:t>Fonte</w:t>
             </w:r>
           </w:p>
         </w:tc>
       </w:tr>
       <w:tr>
+        <w:tc>
+          <w:tcPr>
+            <w:tcW w:type="dxa" w:w="5669"/>
+          </w:tcPr>
+          <w:p>
+            <w:r/>
+            <w:r>
+              <w:rPr>
+                <w:b w:val="0"/>
+                <w:sz w:val="20"/>
+              </w:rPr>
+              <w:t>"Tudo tá centralizado em mim. Eu não tenho o direito de ficar doente."</w:t>
+            </w:r>
+          </w:p>
+        </w:tc>
         <w:tc>
           <w:tcPr>
             <w:tcW w:type="dxa" w:w="1701"/>
@@ -649,13 +2491,13 @@
                 <w:b w:val="0"/>
                 <w:sz w:val="20"/>
               </w:rPr>
-              <w:t>Conta Azul</w:t>
+              <w:t>Gestão</w:t>
             </w:r>
           </w:p>
         </w:tc>
         <w:tc>
           <w:tcPr>
-            <w:tcW w:type="dxa" w:w="3118"/>
+            <w:tcW w:type="dxa" w:w="1701"/>
           </w:tcPr>
           <w:p>
             <w:r/>
@@ -664,7 +2506,165 @@
                 <w:b w:val="0"/>
                 <w:sz w:val="20"/>
               </w:rPr>
-              <w:t>Gestão financeira / ERP [HIPÓTESE]</w:t>
+              <w:t>00:18</w:t>
+            </w:r>
+          </w:p>
+        </w:tc>
+      </w:tr>
+      <w:tr>
+        <w:tc>
+          <w:tcPr>
+            <w:tcW w:type="dxa" w:w="5669"/>
+          </w:tcPr>
+          <w:p>
+            <w:r/>
+            <w:r>
+              <w:rPr>
+                <w:b w:val="0"/>
+                <w:sz w:val="20"/>
+              </w:rPr>
+              <w:t>Revisar e corrigir tudo; dúvidas simples da equipe chegam a ela</w:t>
+            </w:r>
+          </w:p>
+        </w:tc>
+        <w:tc>
+          <w:tcPr>
+            <w:tcW w:type="dxa" w:w="1701"/>
+          </w:tcPr>
+          <w:p>
+            <w:r/>
+            <w:r>
+              <w:rPr>
+                <w:b w:val="0"/>
+                <w:sz w:val="20"/>
+              </w:rPr>
+              <w:t>Todas</w:t>
+            </w:r>
+          </w:p>
+        </w:tc>
+        <w:tc>
+          <w:tcPr>
+            <w:tcW w:type="dxa" w:w="1701"/>
+          </w:tcPr>
+          <w:p>
+            <w:r/>
+            <w:r>
+              <w:rPr>
+                <w:b w:val="0"/>
+                <w:sz w:val="20"/>
+              </w:rPr>
+              <w:t>00:15, 00:39, 01:27</w:t>
+            </w:r>
+          </w:p>
+        </w:tc>
+      </w:tr>
+      <w:tr>
+        <w:tc>
+          <w:tcPr>
+            <w:tcW w:type="dxa" w:w="5669"/>
+          </w:tcPr>
+          <w:p>
+            <w:r/>
+            <w:r>
+              <w:rPr>
+                <w:b w:val="0"/>
+                <w:sz w:val="20"/>
+              </w:rPr>
+              <w:t>Erro de configuração no Domínio: imposto recolhido errado, multa, cerca de R$ 10 mil e um cliente perdido</w:t>
+            </w:r>
+          </w:p>
+        </w:tc>
+        <w:tc>
+          <w:tcPr>
+            <w:tcW w:type="dxa" w:w="1701"/>
+          </w:tcPr>
+          <w:p>
+            <w:r/>
+            <w:r>
+              <w:rPr>
+                <w:b w:val="0"/>
+                <w:sz w:val="20"/>
+              </w:rPr>
+              <w:t>Contabilidade</w:t>
+            </w:r>
+          </w:p>
+        </w:tc>
+        <w:tc>
+          <w:tcPr>
+            <w:tcW w:type="dxa" w:w="1701"/>
+          </w:tcPr>
+          <w:p>
+            <w:r/>
+            <w:r>
+              <w:rPr>
+                <w:b w:val="0"/>
+                <w:sz w:val="20"/>
+              </w:rPr>
+              <w:t>00:26 a 00:29</w:t>
+            </w:r>
+          </w:p>
+        </w:tc>
+      </w:tr>
+      <w:tr>
+        <w:tc>
+          <w:tcPr>
+            <w:tcW w:type="dxa" w:w="5669"/>
+          </w:tcPr>
+          <w:p>
+            <w:r/>
+            <w:r>
+              <w:rPr>
+                <w:b w:val="0"/>
+                <w:sz w:val="20"/>
+              </w:rPr>
+              <w:t>Contabilidade sem responsável desde a saída da contadora</w:t>
+            </w:r>
+          </w:p>
+        </w:tc>
+        <w:tc>
+          <w:tcPr>
+            <w:tcW w:type="dxa" w:w="1701"/>
+          </w:tcPr>
+          <w:p>
+            <w:r/>
+            <w:r>
+              <w:rPr>
+                <w:b w:val="0"/>
+                <w:sz w:val="20"/>
+              </w:rPr>
+              <w:t>Contabilidade</w:t>
+            </w:r>
+          </w:p>
+        </w:tc>
+        <w:tc>
+          <w:tcPr>
+            <w:tcW w:type="dxa" w:w="1701"/>
+          </w:tcPr>
+          <w:p>
+            <w:r/>
+            <w:r>
+              <w:rPr>
+                <w:b w:val="0"/>
+                <w:sz w:val="20"/>
+              </w:rPr>
+              <w:t>00:30</w:t>
+            </w:r>
+          </w:p>
+        </w:tc>
+      </w:tr>
+      <w:tr>
+        <w:tc>
+          <w:tcPr>
+            <w:tcW w:type="dxa" w:w="5669"/>
+          </w:tcPr>
+          <w:p>
+            <w:r/>
+            <w:r>
+              <w:rPr>
+                <w:b w:val="0"/>
+                <w:sz w:val="20"/>
+              </w:rPr>
+              <w:t>Fechamento financeiro lento: conciliação no fim do mês, reuniões só na segunda ou terceira semana</w:t>
             </w:r>
           </w:p>
         </w:tc>
@@ -685,23 +2685,6 @@
         </w:tc>
         <w:tc>
           <w:tcPr>
-            <w:tcW w:type="dxa" w:w="2551"/>
-          </w:tcPr>
-          <w:p>
-            <w:r/>
-            <w:r>
-              <w:rPr>
-                <w:b w:val="0"/>
-                <w:sz w:val="20"/>
-              </w:rPr>
-              <w:t>[PREENCHER] uso real e quem acessa</w:t>
-            </w:r>
-          </w:p>
-        </w:tc>
-      </w:tr>
-      <w:tr>
-        <w:tc>
-          <w:tcPr>
             <w:tcW w:type="dxa" w:w="1701"/>
           </w:tcPr>
           <w:p>
@@ -711,13 +2694,15 @@
                 <w:b w:val="0"/>
                 <w:sz w:val="20"/>
               </w:rPr>
-              <w:t>Domínio</w:t>
+              <w:t>01:31 a 01:32</w:t>
             </w:r>
           </w:p>
         </w:tc>
+      </w:tr>
+      <w:tr>
         <w:tc>
           <w:tcPr>
-            <w:tcW w:type="dxa" w:w="3118"/>
+            <w:tcW w:type="dxa" w:w="5669"/>
           </w:tcPr>
           <w:p>
             <w:r/>
@@ -726,7 +2711,7 @@
                 <w:b w:val="0"/>
                 <w:sz w:val="20"/>
               </w:rPr>
-              <w:t>Sistema contábil e fiscal / folha [HIPÓTESE]</w:t>
+              <w:t>Escalar sem contratar: Vitória passar de 15 para 30 clientes</w:t>
             </w:r>
           </w:p>
         </w:tc>
@@ -741,54 +2726,7 @@
                 <w:b w:val="0"/>
                 <w:sz w:val="20"/>
               </w:rPr>
-              <w:t>Contabilidade, DP</w:t>
-            </w:r>
-          </w:p>
-        </w:tc>
-        <w:tc>
-          <w:tcPr>
-            <w:tcW w:type="dxa" w:w="2551"/>
-          </w:tcPr>
-          <w:p>
-            <w:r/>
-            <w:r>
-              <w:rPr>
-                <w:b w:val="0"/>
-                <w:sz w:val="20"/>
-              </w:rPr>
-              <w:t>[PREENCHER]</w:t>
-            </w:r>
-          </w:p>
-        </w:tc>
-      </w:tr>
-      <w:tr>
-        <w:tc>
-          <w:tcPr>
-            <w:tcW w:type="dxa" w:w="1701"/>
-          </w:tcPr>
-          <w:p>
-            <w:r/>
-            <w:r>
-              <w:rPr>
-                <w:b w:val="0"/>
-                <w:sz w:val="20"/>
-              </w:rPr>
-              <w:t>Veri (veri.com.br)</w:t>
-            </w:r>
-          </w:p>
-        </w:tc>
-        <w:tc>
-          <w:tcPr>
-            <w:tcW w:type="dxa" w:w="3118"/>
-          </w:tcPr>
-          <w:p>
-            <w:r/>
-            <w:r>
-              <w:rPr>
-                <w:b w:val="0"/>
-                <w:sz w:val="20"/>
-              </w:rPr>
-              <w:t>[PREENCHER] finalidade</w:t>
+              <w:t>Financeiro</w:t>
             </w:r>
           </w:p>
         </w:tc>
@@ -803,13 +2741,15 @@
                 <w:b w:val="0"/>
                 <w:sz w:val="20"/>
               </w:rPr>
-              <w:t>[PREENCHER]</w:t>
+              <w:t>00:46, 01:25</w:t>
             </w:r>
           </w:p>
         </w:tc>
+      </w:tr>
+      <w:tr>
         <w:tc>
           <w:tcPr>
-            <w:tcW w:type="dxa" w:w="2551"/>
+            <w:tcW w:type="dxa" w:w="5669"/>
           </w:tcPr>
           <w:p>
             <w:r/>
@@ -818,39 +2758,7 @@
                 <w:b w:val="0"/>
                 <w:sz w:val="20"/>
               </w:rPr>
-              <w:t>[PREENCHER]</w:t>
-            </w:r>
-          </w:p>
-        </w:tc>
-      </w:tr>
-      <w:tr>
-        <w:tc>
-          <w:tcPr>
-            <w:tcW w:type="dxa" w:w="1701"/>
-          </w:tcPr>
-          <w:p>
-            <w:r/>
-            <w:r>
-              <w:rPr>
-                <w:b w:val="0"/>
-                <w:sz w:val="20"/>
-              </w:rPr>
-              <w:t>Jusbrasil</w:t>
-            </w:r>
-          </w:p>
-        </w:tc>
-        <w:tc>
-          <w:tcPr>
-            <w:tcW w:type="dxa" w:w="3118"/>
-          </w:tcPr>
-          <w:p>
-            <w:r/>
-            <w:r>
-              <w:rPr>
-                <w:b w:val="0"/>
-                <w:sz w:val="20"/>
-              </w:rPr>
-              <w:t>Pesquisa jurídica / acompanhamento de processos [HIPÓTESE]</w:t>
+              <w:t>Ter tempo para estudar para a prova de 13/12</w:t>
             </w:r>
           </w:p>
         </w:tc>
@@ -865,27 +2773,10 @@
                 <w:b w:val="0"/>
                 <w:sz w:val="20"/>
               </w:rPr>
-              <w:t>[PREENCHER]</w:t>
+              <w:t>Pessoal</w:t>
             </w:r>
           </w:p>
         </w:tc>
-        <w:tc>
-          <w:tcPr>
-            <w:tcW w:type="dxa" w:w="2551"/>
-          </w:tcPr>
-          <w:p>
-            <w:r/>
-            <w:r>
-              <w:rPr>
-                <w:b w:val="0"/>
-                <w:sz w:val="20"/>
-              </w:rPr>
-              <w:t>[PREENCHER]</w:t>
-            </w:r>
-          </w:p>
-        </w:tc>
-      </w:tr>
-      <w:tr>
         <w:tc>
           <w:tcPr>
             <w:tcW w:type="dxa" w:w="1701"/>
@@ -897,13 +2788,15 @@
                 <w:b w:val="0"/>
                 <w:sz w:val="20"/>
               </w:rPr>
-              <w:t>Microsoft OneDrive</w:t>
+              <w:t>00:36, 02:14</w:t>
             </w:r>
           </w:p>
         </w:tc>
+      </w:tr>
+      <w:tr>
         <w:tc>
           <w:tcPr>
-            <w:tcW w:type="dxa" w:w="3118"/>
+            <w:tcW w:type="dxa" w:w="5669"/>
           </w:tcPr>
           <w:p>
             <w:r/>
@@ -912,7 +2805,148 @@
                 <w:b w:val="0"/>
                 <w:sz w:val="20"/>
               </w:rPr>
-              <w:t>Armazenamento e compartilhamento de arquivos [HIPÓTESE]</w:t>
+              <w:t>Equipe com mais autonomia</w:t>
+            </w:r>
+          </w:p>
+        </w:tc>
+        <w:tc>
+          <w:tcPr>
+            <w:tcW w:type="dxa" w:w="1701"/>
+          </w:tcPr>
+          <w:p>
+            <w:r/>
+            <w:r>
+              <w:rPr>
+                <w:b w:val="0"/>
+                <w:sz w:val="20"/>
+              </w:rPr>
+              <w:t>Gestão</w:t>
+            </w:r>
+          </w:p>
+        </w:tc>
+        <w:tc>
+          <w:tcPr>
+            <w:tcW w:type="dxa" w:w="1701"/>
+          </w:tcPr>
+          <w:p>
+            <w:r/>
+            <w:r>
+              <w:rPr>
+                <w:b w:val="0"/>
+                <w:sz w:val="20"/>
+              </w:rPr>
+              <w:t>00:44</w:t>
+            </w:r>
+          </w:p>
+        </w:tc>
+      </w:tr>
+      <w:tr>
+        <w:tc>
+          <w:tcPr>
+            <w:tcW w:type="dxa" w:w="5669"/>
+          </w:tcPr>
+          <w:p>
+            <w:r/>
+            <w:r>
+              <w:rPr>
+                <w:b w:val="0"/>
+                <w:sz w:val="20"/>
+              </w:rPr>
+              <w:t>Avaliar a produtividade individual e criar uma remuneração variável por pontos</w:t>
+            </w:r>
+          </w:p>
+        </w:tc>
+        <w:tc>
+          <w:tcPr>
+            <w:tcW w:type="dxa" w:w="1701"/>
+          </w:tcPr>
+          <w:p>
+            <w:r/>
+            <w:r>
+              <w:rPr>
+                <w:b w:val="0"/>
+                <w:sz w:val="20"/>
+              </w:rPr>
+              <w:t>Pessoas</w:t>
+            </w:r>
+          </w:p>
+        </w:tc>
+        <w:tc>
+          <w:tcPr>
+            <w:tcW w:type="dxa" w:w="1701"/>
+          </w:tcPr>
+          <w:p>
+            <w:r/>
+            <w:r>
+              <w:rPr>
+                <w:b w:val="0"/>
+                <w:sz w:val="20"/>
+              </w:rPr>
+              <w:t>00:46, 01:57, 02:21</w:t>
+            </w:r>
+          </w:p>
+        </w:tc>
+      </w:tr>
+      <w:tr>
+        <w:tc>
+          <w:tcPr>
+            <w:tcW w:type="dxa" w:w="5669"/>
+          </w:tcPr>
+          <w:p>
+            <w:r/>
+            <w:r>
+              <w:rPr>
+                <w:b w:val="0"/>
+                <w:sz w:val="20"/>
+              </w:rPr>
+              <w:t>Retomar o comercial (tráfego pago, possível agente de WhatsApp/CRM), sem atendimento robotizado</w:t>
+            </w:r>
+          </w:p>
+        </w:tc>
+        <w:tc>
+          <w:tcPr>
+            <w:tcW w:type="dxa" w:w="1701"/>
+          </w:tcPr>
+          <w:p>
+            <w:r/>
+            <w:r>
+              <w:rPr>
+                <w:b w:val="0"/>
+                <w:sz w:val="20"/>
+              </w:rPr>
+              <w:t>Vendas</w:t>
+            </w:r>
+          </w:p>
+        </w:tc>
+        <w:tc>
+          <w:tcPr>
+            <w:tcW w:type="dxa" w:w="1701"/>
+          </w:tcPr>
+          <w:p>
+            <w:r/>
+            <w:r>
+              <w:rPr>
+                <w:b w:val="0"/>
+                <w:sz w:val="20"/>
+              </w:rPr>
+              <w:t>00:45, 01:55</w:t>
+            </w:r>
+          </w:p>
+        </w:tc>
+      </w:tr>
+      <w:tr>
+        <w:tc>
+          <w:tcPr>
+            <w:tcW w:type="dxa" w:w="5669"/>
+          </w:tcPr>
+          <w:p>
+            <w:r/>
+            <w:r>
+              <w:rPr>
+                <w:b w:val="0"/>
+                <w:sz w:val="20"/>
+              </w:rPr>
+              <w:t>Ter um assistente de dúvidas por setor</w:t>
             </w:r>
           </w:p>
         </w:tc>
@@ -933,23 +2967,6 @@
         </w:tc>
         <w:tc>
           <w:tcPr>
-            <w:tcW w:type="dxa" w:w="2551"/>
-          </w:tcPr>
-          <w:p>
-            <w:r/>
-            <w:r>
-              <w:rPr>
-                <w:b w:val="0"/>
-                <w:sz w:val="20"/>
-              </w:rPr>
-              <w:t>[PREENCHER] organização das pastas</w:t>
-            </w:r>
-          </w:p>
-        </w:tc>
-      </w:tr>
-      <w:tr>
-        <w:tc>
-          <w:tcPr>
             <w:tcW w:type="dxa" w:w="1701"/>
           </w:tcPr>
           <w:p>
@@ -959,13 +2976,15 @@
                 <w:b w:val="0"/>
                 <w:sz w:val="20"/>
               </w:rPr>
-              <w:t>Trello</w:t>
+              <w:t>00:39</w:t>
             </w:r>
           </w:p>
         </w:tc>
+      </w:tr>
+      <w:tr>
         <w:tc>
           <w:tcPr>
-            <w:tcW w:type="dxa" w:w="3118"/>
+            <w:tcW w:type="dxa" w:w="5669"/>
           </w:tcPr>
           <w:p>
             <w:r/>
@@ -974,7 +2993,7 @@
                 <w:b w:val="0"/>
                 <w:sz w:val="20"/>
               </w:rPr>
-              <w:t>Gestão de tarefas [HIPÓTESE]</w:t>
+              <w:t>Estruturar no futuro uma consultoria jurídica para os clientes</w:t>
             </w:r>
           </w:p>
         </w:tc>
@@ -989,54 +3008,7 @@
                 <w:b w:val="0"/>
                 <w:sz w:val="20"/>
               </w:rPr>
-              <w:t>[PREENCHER]</w:t>
-            </w:r>
-          </w:p>
-        </w:tc>
-        <w:tc>
-          <w:tcPr>
-            <w:tcW w:type="dxa" w:w="2551"/>
-          </w:tcPr>
-          <w:p>
-            <w:r/>
-            <w:r>
-              <w:rPr>
-                <w:b w:val="0"/>
-                <w:sz w:val="20"/>
-              </w:rPr>
-              <w:t>[PREENCHER] quem usa e como</w:t>
-            </w:r>
-          </w:p>
-        </w:tc>
-      </w:tr>
-      <w:tr>
-        <w:tc>
-          <w:tcPr>
-            <w:tcW w:type="dxa" w:w="1701"/>
-          </w:tcPr>
-          <w:p>
-            <w:r/>
-            <w:r>
-              <w:rPr>
-                <w:b w:val="0"/>
-                <w:sz w:val="20"/>
-              </w:rPr>
-              <w:t>NetsApp</w:t>
-            </w:r>
-          </w:p>
-        </w:tc>
-        <w:tc>
-          <w:tcPr>
-            <w:tcW w:type="dxa" w:w="3118"/>
-          </w:tcPr>
-          <w:p>
-            <w:r/>
-            <w:r>
-              <w:rPr>
-                <w:b w:val="0"/>
-                <w:sz w:val="20"/>
-              </w:rPr>
-              <w:t>[PREENCHER] finalidade</w:t>
+              <w:t>Jurídico</w:t>
             </w:r>
           </w:p>
         </w:tc>
@@ -1051,585 +3023,7 @@
                 <w:b w:val="0"/>
                 <w:sz w:val="20"/>
               </w:rPr>
-              <w:t>[PREENCHER]</w:t>
-            </w:r>
-          </w:p>
-        </w:tc>
-        <w:tc>
-          <w:tcPr>
-            <w:tcW w:type="dxa" w:w="2551"/>
-          </w:tcPr>
-          <w:p>
-            <w:r/>
-            <w:r>
-              <w:rPr>
-                <w:b w:val="0"/>
-                <w:sz w:val="20"/>
-              </w:rPr>
-              <w:t>[PREENCHER]</w:t>
-            </w:r>
-          </w:p>
-        </w:tc>
-      </w:tr>
-    </w:tbl>
-    <w:p/>
-    <w:p>
-      <w:pPr>
-        <w:pStyle w:val="Heading1"/>
-      </w:pPr>
-      <w:r>
-        <w:t>4. Necessidades, dores e expectativas</w:t>
-      </w:r>
-    </w:p>
-    <w:p>
-      <w:r>
-        <w:rPr>
-          <w:i w:val="0"/>
-        </w:rPr>
-        <w:t>Preencher com a transcrição. Para cada dor, registrar a frase da cliente (ou o minuto da gravação), a área afetada e o impacto que ela descreveu.</w:t>
-      </w:r>
-    </w:p>
-    <w:tbl>
-      <w:tblPr>
-        <w:tblStyle w:val="TableGrid"/>
-        <w:tblW w:type="auto" w:w="0"/>
-        <w:jc w:val="center"/>
-        <w:tblLook w:firstColumn="1" w:firstRow="1" w:lastColumn="0" w:lastRow="0" w:noHBand="0" w:noVBand="1" w:val="04A0"/>
-      </w:tblPr>
-      <w:tblGrid>
-        <w:gridCol w:w="1949"/>
-        <w:gridCol w:w="1949"/>
-        <w:gridCol w:w="1949"/>
-        <w:gridCol w:w="1949"/>
-        <w:gridCol w:w="1949"/>
-      </w:tblGrid>
-      <w:tr>
-        <w:tc>
-          <w:tcPr>
-            <w:tcW w:type="dxa" w:w="454"/>
-            <w:shd w:val="clear" w:color="auto" w:fill="1F3A5F"/>
-          </w:tcPr>
-          <w:p>
-            <w:r/>
-            <w:r>
-              <w:rPr>
-                <w:b/>
-                <w:color w:val="FFFFFF"/>
-                <w:sz w:val="20"/>
-              </w:rPr>
-              <w:t>#</w:t>
-            </w:r>
-          </w:p>
-        </w:tc>
-        <w:tc>
-          <w:tcPr>
-            <w:tcW w:type="dxa" w:w="3685"/>
-            <w:shd w:val="clear" w:color="auto" w:fill="1F3A5F"/>
-          </w:tcPr>
-          <w:p>
-            <w:r/>
-            <w:r>
-              <w:rPr>
-                <w:b/>
-                <w:color w:val="FFFFFF"/>
-                <w:sz w:val="20"/>
-              </w:rPr>
-              <w:t>Dor ou necessidade (palavras da cliente)</w:t>
-            </w:r>
-          </w:p>
-        </w:tc>
-        <w:tc>
-          <w:tcPr>
-            <w:tcW w:type="dxa" w:w="1417"/>
-            <w:shd w:val="clear" w:color="auto" w:fill="1F3A5F"/>
-          </w:tcPr>
-          <w:p>
-            <w:r/>
-            <w:r>
-              <w:rPr>
-                <w:b/>
-                <w:color w:val="FFFFFF"/>
-                <w:sz w:val="20"/>
-              </w:rPr>
-              <w:t>Área</w:t>
-            </w:r>
-          </w:p>
-        </w:tc>
-        <w:tc>
-          <w:tcPr>
-            <w:tcW w:type="dxa" w:w="1984"/>
-            <w:shd w:val="clear" w:color="auto" w:fill="1F3A5F"/>
-          </w:tcPr>
-          <w:p>
-            <w:r/>
-            <w:r>
-              <w:rPr>
-                <w:b/>
-                <w:color w:val="FFFFFF"/>
-                <w:sz w:val="20"/>
-              </w:rPr>
-              <w:t>Impacto citado</w:t>
-            </w:r>
-          </w:p>
-        </w:tc>
-        <w:tc>
-          <w:tcPr>
-            <w:tcW w:type="dxa" w:w="1531"/>
-            <w:shd w:val="clear" w:color="auto" w:fill="1F3A5F"/>
-          </w:tcPr>
-          <w:p>
-            <w:r/>
-            <w:r>
-              <w:rPr>
-                <w:b/>
-                <w:color w:val="FFFFFF"/>
-                <w:sz w:val="20"/>
-              </w:rPr>
-              <w:t>Minuto na gravação</w:t>
-            </w:r>
-          </w:p>
-        </w:tc>
-      </w:tr>
-      <w:tr>
-        <w:tc>
-          <w:tcPr>
-            <w:tcW w:type="dxa" w:w="454"/>
-          </w:tcPr>
-          <w:p>
-            <w:r/>
-            <w:r>
-              <w:rPr>
-                <w:b w:val="0"/>
-                <w:sz w:val="20"/>
-              </w:rPr>
-              <w:t>1</w:t>
-            </w:r>
-          </w:p>
-        </w:tc>
-        <w:tc>
-          <w:tcPr>
-            <w:tcW w:type="dxa" w:w="3685"/>
-          </w:tcPr>
-          <w:p>
-            <w:r/>
-            <w:r>
-              <w:rPr>
-                <w:b w:val="0"/>
-                <w:sz w:val="20"/>
-              </w:rPr>
-              <w:t>[PREENCHER]</w:t>
-            </w:r>
-          </w:p>
-        </w:tc>
-        <w:tc>
-          <w:tcPr>
-            <w:tcW w:type="dxa" w:w="1417"/>
-          </w:tcPr>
-          <w:p>
-            <w:r/>
-            <w:r>
-              <w:rPr>
-                <w:b w:val="0"/>
-                <w:sz w:val="20"/>
-              </w:rPr>
-            </w:r>
-          </w:p>
-        </w:tc>
-        <w:tc>
-          <w:tcPr>
-            <w:tcW w:type="dxa" w:w="1984"/>
-          </w:tcPr>
-          <w:p>
-            <w:r/>
-            <w:r>
-              <w:rPr>
-                <w:b w:val="0"/>
-                <w:sz w:val="20"/>
-              </w:rPr>
-            </w:r>
-          </w:p>
-        </w:tc>
-        <w:tc>
-          <w:tcPr>
-            <w:tcW w:type="dxa" w:w="1531"/>
-          </w:tcPr>
-          <w:p>
-            <w:r/>
-            <w:r>
-              <w:rPr>
-                <w:b w:val="0"/>
-                <w:sz w:val="20"/>
-              </w:rPr>
-            </w:r>
-          </w:p>
-        </w:tc>
-      </w:tr>
-      <w:tr>
-        <w:tc>
-          <w:tcPr>
-            <w:tcW w:type="dxa" w:w="454"/>
-          </w:tcPr>
-          <w:p>
-            <w:r/>
-            <w:r>
-              <w:rPr>
-                <w:b w:val="0"/>
-                <w:sz w:val="20"/>
-              </w:rPr>
-              <w:t>2</w:t>
-            </w:r>
-          </w:p>
-        </w:tc>
-        <w:tc>
-          <w:tcPr>
-            <w:tcW w:type="dxa" w:w="3685"/>
-          </w:tcPr>
-          <w:p>
-            <w:r/>
-            <w:r>
-              <w:rPr>
-                <w:b w:val="0"/>
-                <w:sz w:val="20"/>
-              </w:rPr>
-              <w:t>[PREENCHER]</w:t>
-            </w:r>
-          </w:p>
-        </w:tc>
-        <w:tc>
-          <w:tcPr>
-            <w:tcW w:type="dxa" w:w="1417"/>
-          </w:tcPr>
-          <w:p>
-            <w:r/>
-            <w:r>
-              <w:rPr>
-                <w:b w:val="0"/>
-                <w:sz w:val="20"/>
-              </w:rPr>
-            </w:r>
-          </w:p>
-        </w:tc>
-        <w:tc>
-          <w:tcPr>
-            <w:tcW w:type="dxa" w:w="1984"/>
-          </w:tcPr>
-          <w:p>
-            <w:r/>
-            <w:r>
-              <w:rPr>
-                <w:b w:val="0"/>
-                <w:sz w:val="20"/>
-              </w:rPr>
-            </w:r>
-          </w:p>
-        </w:tc>
-        <w:tc>
-          <w:tcPr>
-            <w:tcW w:type="dxa" w:w="1531"/>
-          </w:tcPr>
-          <w:p>
-            <w:r/>
-            <w:r>
-              <w:rPr>
-                <w:b w:val="0"/>
-                <w:sz w:val="20"/>
-              </w:rPr>
-            </w:r>
-          </w:p>
-        </w:tc>
-      </w:tr>
-      <w:tr>
-        <w:tc>
-          <w:tcPr>
-            <w:tcW w:type="dxa" w:w="454"/>
-          </w:tcPr>
-          <w:p>
-            <w:r/>
-            <w:r>
-              <w:rPr>
-                <w:b w:val="0"/>
-                <w:sz w:val="20"/>
-              </w:rPr>
-              <w:t>3</w:t>
-            </w:r>
-          </w:p>
-        </w:tc>
-        <w:tc>
-          <w:tcPr>
-            <w:tcW w:type="dxa" w:w="3685"/>
-          </w:tcPr>
-          <w:p>
-            <w:r/>
-            <w:r>
-              <w:rPr>
-                <w:b w:val="0"/>
-                <w:sz w:val="20"/>
-              </w:rPr>
-              <w:t>[PREENCHER]</w:t>
-            </w:r>
-          </w:p>
-        </w:tc>
-        <w:tc>
-          <w:tcPr>
-            <w:tcW w:type="dxa" w:w="1417"/>
-          </w:tcPr>
-          <w:p>
-            <w:r/>
-            <w:r>
-              <w:rPr>
-                <w:b w:val="0"/>
-                <w:sz w:val="20"/>
-              </w:rPr>
-            </w:r>
-          </w:p>
-        </w:tc>
-        <w:tc>
-          <w:tcPr>
-            <w:tcW w:type="dxa" w:w="1984"/>
-          </w:tcPr>
-          <w:p>
-            <w:r/>
-            <w:r>
-              <w:rPr>
-                <w:b w:val="0"/>
-                <w:sz w:val="20"/>
-              </w:rPr>
-            </w:r>
-          </w:p>
-        </w:tc>
-        <w:tc>
-          <w:tcPr>
-            <w:tcW w:type="dxa" w:w="1531"/>
-          </w:tcPr>
-          <w:p>
-            <w:r/>
-            <w:r>
-              <w:rPr>
-                <w:b w:val="0"/>
-                <w:sz w:val="20"/>
-              </w:rPr>
-            </w:r>
-          </w:p>
-        </w:tc>
-      </w:tr>
-      <w:tr>
-        <w:tc>
-          <w:tcPr>
-            <w:tcW w:type="dxa" w:w="454"/>
-          </w:tcPr>
-          <w:p>
-            <w:r/>
-            <w:r>
-              <w:rPr>
-                <w:b w:val="0"/>
-                <w:sz w:val="20"/>
-              </w:rPr>
-              <w:t>4</w:t>
-            </w:r>
-          </w:p>
-        </w:tc>
-        <w:tc>
-          <w:tcPr>
-            <w:tcW w:type="dxa" w:w="3685"/>
-          </w:tcPr>
-          <w:p>
-            <w:r/>
-            <w:r>
-              <w:rPr>
-                <w:b w:val="0"/>
-                <w:sz w:val="20"/>
-              </w:rPr>
-              <w:t>[PREENCHER]</w:t>
-            </w:r>
-          </w:p>
-        </w:tc>
-        <w:tc>
-          <w:tcPr>
-            <w:tcW w:type="dxa" w:w="1417"/>
-          </w:tcPr>
-          <w:p>
-            <w:r/>
-            <w:r>
-              <w:rPr>
-                <w:b w:val="0"/>
-                <w:sz w:val="20"/>
-              </w:rPr>
-            </w:r>
-          </w:p>
-        </w:tc>
-        <w:tc>
-          <w:tcPr>
-            <w:tcW w:type="dxa" w:w="1984"/>
-          </w:tcPr>
-          <w:p>
-            <w:r/>
-            <w:r>
-              <w:rPr>
-                <w:b w:val="0"/>
-                <w:sz w:val="20"/>
-              </w:rPr>
-            </w:r>
-          </w:p>
-        </w:tc>
-        <w:tc>
-          <w:tcPr>
-            <w:tcW w:type="dxa" w:w="1531"/>
-          </w:tcPr>
-          <w:p>
-            <w:r/>
-            <w:r>
-              <w:rPr>
-                <w:b w:val="0"/>
-                <w:sz w:val="20"/>
-              </w:rPr>
-            </w:r>
-          </w:p>
-        </w:tc>
-      </w:tr>
-      <w:tr>
-        <w:tc>
-          <w:tcPr>
-            <w:tcW w:type="dxa" w:w="454"/>
-          </w:tcPr>
-          <w:p>
-            <w:r/>
-            <w:r>
-              <w:rPr>
-                <w:b w:val="0"/>
-                <w:sz w:val="20"/>
-              </w:rPr>
-              <w:t>5</w:t>
-            </w:r>
-          </w:p>
-        </w:tc>
-        <w:tc>
-          <w:tcPr>
-            <w:tcW w:type="dxa" w:w="3685"/>
-          </w:tcPr>
-          <w:p>
-            <w:r/>
-            <w:r>
-              <w:rPr>
-                <w:b w:val="0"/>
-                <w:sz w:val="20"/>
-              </w:rPr>
-              <w:t>[PREENCHER]</w:t>
-            </w:r>
-          </w:p>
-        </w:tc>
-        <w:tc>
-          <w:tcPr>
-            <w:tcW w:type="dxa" w:w="1417"/>
-          </w:tcPr>
-          <w:p>
-            <w:r/>
-            <w:r>
-              <w:rPr>
-                <w:b w:val="0"/>
-                <w:sz w:val="20"/>
-              </w:rPr>
-            </w:r>
-          </w:p>
-        </w:tc>
-        <w:tc>
-          <w:tcPr>
-            <w:tcW w:type="dxa" w:w="1984"/>
-          </w:tcPr>
-          <w:p>
-            <w:r/>
-            <w:r>
-              <w:rPr>
-                <w:b w:val="0"/>
-                <w:sz w:val="20"/>
-              </w:rPr>
-            </w:r>
-          </w:p>
-        </w:tc>
-        <w:tc>
-          <w:tcPr>
-            <w:tcW w:type="dxa" w:w="1531"/>
-          </w:tcPr>
-          <w:p>
-            <w:r/>
-            <w:r>
-              <w:rPr>
-                <w:b w:val="0"/>
-                <w:sz w:val="20"/>
-              </w:rPr>
-            </w:r>
-          </w:p>
-        </w:tc>
-      </w:tr>
-      <w:tr>
-        <w:tc>
-          <w:tcPr>
-            <w:tcW w:type="dxa" w:w="454"/>
-          </w:tcPr>
-          <w:p>
-            <w:r/>
-            <w:r>
-              <w:rPr>
-                <w:b w:val="0"/>
-                <w:sz w:val="20"/>
-              </w:rPr>
-              <w:t>6</w:t>
-            </w:r>
-          </w:p>
-        </w:tc>
-        <w:tc>
-          <w:tcPr>
-            <w:tcW w:type="dxa" w:w="3685"/>
-          </w:tcPr>
-          <w:p>
-            <w:r/>
-            <w:r>
-              <w:rPr>
-                <w:b w:val="0"/>
-                <w:sz w:val="20"/>
-              </w:rPr>
-              <w:t>[PREENCHER]</w:t>
-            </w:r>
-          </w:p>
-        </w:tc>
-        <w:tc>
-          <w:tcPr>
-            <w:tcW w:type="dxa" w:w="1417"/>
-          </w:tcPr>
-          <w:p>
-            <w:r/>
-            <w:r>
-              <w:rPr>
-                <w:b w:val="0"/>
-                <w:sz w:val="20"/>
-              </w:rPr>
-            </w:r>
-          </w:p>
-        </w:tc>
-        <w:tc>
-          <w:tcPr>
-            <w:tcW w:type="dxa" w:w="1984"/>
-          </w:tcPr>
-          <w:p>
-            <w:r/>
-            <w:r>
-              <w:rPr>
-                <w:b w:val="0"/>
-                <w:sz w:val="20"/>
-              </w:rPr>
-            </w:r>
-          </w:p>
-        </w:tc>
-        <w:tc>
-          <w:tcPr>
-            <w:tcW w:type="dxa" w:w="1531"/>
-          </w:tcPr>
-          <w:p>
-            <w:r/>
-            <w:r>
-              <w:rPr>
-                <w:b w:val="0"/>
-                <w:sz w:val="20"/>
-              </w:rPr>
+              <w:t>01:45</w:t>
             </w:r>
           </w:p>
         </w:tc>
@@ -1641,7 +3035,7 @@
         <w:rPr>
           <w:i w:val="0"/>
         </w:rPr>
-        <w:t>Expectativas a registrar: o que ela considera sucesso, em que prazo espera ver resultado, se mencionou orçamento, e se quer autonomia da equipe ou um serviço gerenciado.</w:t>
+        <w:t>Disponibilidade dela: esta semana está cheia; a partir de 19/10 pretende estudar de manhã e trabalhar à tarde, com tempo para o projeto. A primeira semana de cada mês concentra as reuniões de fechamento (02:15 a 02:17).</w:t>
       </w:r>
     </w:p>
     <w:p>
@@ -1649,15 +3043,7 @@
         <w:pStyle w:val="Heading1"/>
       </w:pPr>
       <w:r>
-        <w:t>5. Leitura preliminar do consultor</w:t>
-      </w:r>
-    </w:p>
-    <w:p>
-      <w:r>
-        <w:rPr>
-          <w:i w:val="0"/>
-        </w:rPr>
-        <w:t>Observações que se apoiam apenas no que já se sabe e que servem como hipóteses de trabalho:</w:t>
+        <w:t>7. Leitura do consultor</w:t>
       </w:r>
     </w:p>
     <w:p>
@@ -1668,10 +3054,10 @@
         <w:rPr>
           <w:b/>
         </w:rPr>
-        <w:t xml:space="preserve">[HIPÓTESE] Muitas ferramentas para um escritório pequeno. </w:t>
+        <w:t xml:space="preserve">[HIPÓTESE] O ponto de partida é bom. </w:t>
       </w:r>
       <w:r>
-        <w:t>Sete sistemas citados indicam risco de informação duplicada e retrabalho entre eles. A confirmar no inventário.</w:t>
+        <w:t>Há documentação, padrão de pastas e rotinas no Trello. O mapeamento parte do que existe e não do zero, o que reduz esforço.</w:t>
       </w:r>
     </w:p>
     <w:p>
@@ -1682,10 +3068,10 @@
         <w:rPr>
           <w:b/>
         </w:rPr>
-        <w:t xml:space="preserve">[HIPÓTESE] Dependência da dona. </w:t>
+        <w:t xml:space="preserve">[HIPÓTESE] O maior risco está no fiscal. </w:t>
       </w:r>
       <w:r>
-        <w:t>Uma empresária com dupla formação tende a concentrar decisões e conhecimento técnico. A confirmar nas entrevistas.</w:t>
+        <w:t>Sem contador, com o Domínio mal configurado e com execução manual, é onde um erro custa mais caro. A correção da configuração exige o suporte do Domínio ou um especialista no sistema.</w:t>
       </w:r>
     </w:p>
     <w:p>
@@ -1696,10 +3082,10 @@
         <w:rPr>
           <w:b/>
         </w:rPr>
-        <w:t xml:space="preserve">[HIPÓTESE] Responsabilidades pouco formalizadas. </w:t>
+        <w:t xml:space="preserve">[HIPÓTESE] A Júlia é ponto único de falha. </w:t>
       </w:r>
       <w:r>
-        <w:t>O pedido de organizar a empresa sugere que papéis e fluxos não estão escritos. Por isso a estrutura organizacional entra na proposta.</w:t>
+        <w:t>Ela recebe, distribui e acompanha tudo. Formalizar o papel dela e um substituto é tão importante quanto promovê-la.</w:t>
       </w:r>
     </w:p>
     <w:p>
@@ -1710,10 +3096,10 @@
         <w:rPr>
           <w:b/>
         </w:rPr>
-        <w:t xml:space="preserve">[HIPÓTESE] Dados sensíveis. </w:t>
+        <w:t xml:space="preserve">[HIPÓTESE] A remuneração variável depende de papéis claros. </w:t>
       </w:r>
       <w:r>
-        <w:t>DP trata dados pessoais e o escritório tem sigilo profissional. Qualquer automação passa por LGPD e acesso mínimo.</w:t>
+        <w:t>Sem descrição de função e entregas medíveis, um programa de pontos vira discussão. A estrutura organizacional é o pré-requisito.</w:t>
       </w:r>
     </w:p>
     <w:p>
@@ -1724,10 +3110,24 @@
         <w:rPr>
           <w:b/>
         </w:rPr>
-        <w:t xml:space="preserve">[HIPÓTESE] Domínio com integração limitada. </w:t>
+        <w:t xml:space="preserve">[HIPÓTESE] Há ganhos rápidos sem automação. </w:t>
       </w:r>
       <w:r>
-        <w:t>Não prometer automação dentro do Domínio antes de verificar o que ele permite exportar ou integrar.</w:t>
+        <w:t>Configurar a emissão de nota pelo Conta Azul, o monitoramento de processos no Jusbrasil e a conciliação semanal resolvem parte das dores antes de qualquer desenvolvimento.</w:t>
+      </w:r>
+    </w:p>
+    <w:p>
+      <w:pPr>
+        <w:pStyle w:val="ListBullet"/>
+      </w:pPr>
+      <w:r>
+        <w:rPr>
+          <w:b/>
+        </w:rPr>
+        <w:t xml:space="preserve">[HIPÓTESE] Custo de IA precisa entrar na conta. </w:t>
+      </w:r>
+      <w:r>
+        <w:t>O uso do Claude por várias pessoas tem limites e custo; quem usa e para quê deve sair do plano de automação.</w:t>
       </w:r>
     </w:p>
     <w:p>
@@ -1735,15 +3135,7 @@
         <w:pStyle w:val="Heading1"/>
       </w:pPr>
       <w:r>
-        <w:t>6. Lacunas e perguntas objetivas</w:t>
-      </w:r>
-    </w:p>
-    <w:p>
-      <w:r>
-        <w:rPr>
-          <w:i w:val="0"/>
-        </w:rPr>
-        <w:t>Use esta lista para conferir a gravação. O que a gravação não responder vira pergunta para a Thamires na apresentação de quinta ou na primeira entrevista.</w:t>
+        <w:t>8. Perguntas que ainda faltam responder</w:t>
       </w:r>
     </w:p>
     <w:p>
@@ -1751,7 +3143,7 @@
         <w:pStyle w:val="Heading3"/>
       </w:pPr>
       <w:r>
-        <w:t>Empresa e pessoas</w:t>
+        <w:t>Números e prioridades</w:t>
       </w:r>
     </w:p>
     <w:p>
@@ -1759,7 +3151,7 @@
         <w:pStyle w:val="ListBullet"/>
       </w:pPr>
       <w:r>
-        <w:t>Quantas pessoas trabalham hoje no escritório e em qual área está cada uma?</w:t>
+        <w:t>Quantos clientes há hoje em cada serviço (contabilidade, financeiro, DP, jurídico)?</w:t>
       </w:r>
     </w:p>
     <w:p>
@@ -1767,7 +3159,7 @@
         <w:pStyle w:val="ListBullet"/>
       </w:pPr>
       <w:r>
-        <w:t>Quem é responsável por cada área? Existe alguém além da Thamires que toma decisões?</w:t>
+        <w:t>Qual processo, se resolvido primeiro, mais devolveria tempo a você: fiscal, fechamento financeiro ou implantação de clientes?</w:t>
       </w:r>
     </w:p>
     <w:p>
@@ -1775,7 +3167,15 @@
         <w:pStyle w:val="ListBullet"/>
       </w:pPr>
       <w:r>
-        <w:t>Há funcionários terceirizados, estagiários ou parceiros externos (ex.: advogados, correspondentes)?</w:t>
+        <w:t>Quais passo a passos estão atualizados e quais precisam de revisão?</w:t>
+      </w:r>
+    </w:p>
+    <w:p>
+      <w:pPr>
+        <w:pStyle w:val="Heading3"/>
+      </w:pPr>
+      <w:r>
+        <w:t>Equipe e agenda</w:t>
       </w:r>
     </w:p>
     <w:p>
@@ -1783,7 +3183,31 @@
         <w:pStyle w:val="ListBullet"/>
       </w:pPr>
       <w:r>
-        <w:t>Quantos clientes o escritório atende hoje, e de que tipo (MEI, Simples, Lucro Presumido, pessoa física)?</w:t>
+        <w:t>A equipe pode participar de entrevistas antes das 10h30, no almoço ou após as 19h30?</w:t>
+      </w:r>
+    </w:p>
+    <w:p>
+      <w:pPr>
+        <w:pStyle w:val="ListBullet"/>
+      </w:pPr>
+      <w:r>
+        <w:t>A Júlia pode ser a ponto focal do projeto? Quantas horas por semana ela pode dedicar?</w:t>
+      </w:r>
+    </w:p>
+    <w:p>
+      <w:pPr>
+        <w:pStyle w:val="ListBullet"/>
+      </w:pPr>
+      <w:r>
+        <w:t>A Vitória volta de férias em 28/10?</w:t>
+      </w:r>
+    </w:p>
+    <w:p>
+      <w:pPr>
+        <w:pStyle w:val="ListBullet"/>
+      </w:pPr>
+      <w:r>
+        <w:t>A Alana continua em 2027? O contador que você pretende contratar entraria no desenho da estrutura?</w:t>
       </w:r>
     </w:p>
     <w:p>
@@ -1791,7 +3215,7 @@
         <w:pStyle w:val="Heading3"/>
       </w:pPr>
       <w:r>
-        <w:t>Departamento Pessoal</w:t>
+        <w:t>Sistemas</w:t>
       </w:r>
     </w:p>
     <w:p>
@@ -1799,7 +3223,7 @@
         <w:pStyle w:val="ListBullet"/>
       </w:pPr>
       <w:r>
-        <w:t>Quantas folhas de pagamento são processadas por mês?</w:t>
+        <w:t>Qual é o nome da plataforma de atendimento do WhatsApp? É o NetsApp?</w:t>
       </w:r>
     </w:p>
     <w:p>
@@ -1807,7 +3231,7 @@
         <w:pStyle w:val="ListBullet"/>
       </w:pPr>
       <w:r>
-        <w:t>Como chegam as informações de admissão, férias e rescisão dos clientes (e-mail, WhatsApp, planilha, sistema)?</w:t>
+        <w:t>Quem vai corrigir a configuração do Domínio, e até quando?</w:t>
       </w:r>
     </w:p>
     <w:p>
@@ -1815,7 +3239,15 @@
         <w:pStyle w:val="ListBullet"/>
       </w:pPr>
       <w:r>
-        <w:t>Quais etapas da folha são feitas no Domínio e quais são manuais?</w:t>
+        <w:t>Quando será a migração das contas para o novo domínio da Surcin, e quem cuida dela?</w:t>
+      </w:r>
+    </w:p>
+    <w:p>
+      <w:pPr>
+        <w:pStyle w:val="ListBullet"/>
+      </w:pPr>
+      <w:r>
+        <w:t>Você prefere ficar no Microsoft ou migrar para o Google?</w:t>
       </w:r>
     </w:p>
     <w:p>
@@ -1823,7 +3255,7 @@
         <w:pStyle w:val="Heading3"/>
       </w:pPr>
       <w:r>
-        <w:t>Financeiro</w:t>
+        <w:t>Investimento</w:t>
       </w:r>
     </w:p>
     <w:p>
@@ -1831,7 +3263,7 @@
         <w:pStyle w:val="ListBullet"/>
       </w:pPr>
       <w:r>
-        <w:t>O Conta Azul é usado para o financeiro do próprio escritório, dos clientes ou de ambos?</w:t>
+        <w:t>Qual faixa de investimento cabe agora, considerando o caixa até dezembro?</w:t>
       </w:r>
     </w:p>
     <w:p>
@@ -1839,7 +3271,15 @@
         <w:pStyle w:val="ListBullet"/>
       </w:pPr>
       <w:r>
-        <w:t>Como é feita a cobrança dos honorários e quem acompanha a inadimplência?</w:t>
+        <w:t>Há orçamento separado para ferramentas (licenças do Claude, API de WhatsApp)?</w:t>
+      </w:r>
+    </w:p>
+    <w:p>
+      <w:pPr>
+        <w:pStyle w:val="Heading1"/>
+      </w:pPr>
+      <w:r>
+        <w:t>9. Materiais a receber</w:t>
       </w:r>
     </w:p>
     <w:p>
@@ -1847,15 +3287,7 @@
         <w:pStyle w:val="ListBullet"/>
       </w:pPr>
       <w:r>
-        <w:t>Quem concilia as contas e com que frequência?</w:t>
-      </w:r>
-    </w:p>
-    <w:p>
-      <w:pPr>
-        <w:pStyle w:val="Heading3"/>
-      </w:pPr>
-      <w:r>
-        <w:t>Contabilidade</w:t>
+        <w:t>Gravação da reunião, apresentação e resumo da trajetória que ela ficou de enviar por e-mail (00:04, 02:36).</w:t>
       </w:r>
     </w:p>
     <w:p>
@@ -1863,183 +3295,7 @@
         <w:pStyle w:val="ListBullet"/>
       </w:pPr>
       <w:r>
-        <w:t>Como os clientes enviam documentos (notas, extratos, comprovantes) e com que atraso costumam enviar?</w:t>
-      </w:r>
-    </w:p>
-    <w:p>
-      <w:pPr>
-        <w:pStyle w:val="ListBullet"/>
-      </w:pPr>
-      <w:r>
-        <w:t>Quais obrigações e prazos mensais mais geram retrabalho ou multa?</w:t>
-      </w:r>
-    </w:p>
-    <w:p>
-      <w:pPr>
-        <w:pStyle w:val="ListBullet"/>
-      </w:pPr>
-      <w:r>
-        <w:t>Quanto do lançamento é importado automaticamente e quanto é digitado?</w:t>
-      </w:r>
-    </w:p>
-    <w:p>
-      <w:pPr>
-        <w:pStyle w:val="Heading3"/>
-      </w:pPr>
-      <w:r>
-        <w:t>Vendas</w:t>
-      </w:r>
-    </w:p>
-    <w:p>
-      <w:pPr>
-        <w:pStyle w:val="ListBullet"/>
-      </w:pPr>
-      <w:r>
-        <w:t>Como chegam os novos clientes hoje (indicação, internet, parceiros)?</w:t>
-      </w:r>
-    </w:p>
-    <w:p>
-      <w:pPr>
-        <w:pStyle w:val="ListBullet"/>
-      </w:pPr>
-      <w:r>
-        <w:t>Existe proposta padrão, contrato padrão e processo de entrada (onboarding) do cliente?</w:t>
-      </w:r>
-    </w:p>
-    <w:p>
-      <w:pPr>
-        <w:pStyle w:val="ListBullet"/>
-      </w:pPr>
-      <w:r>
-        <w:t>Quem faz o atendimento comercial e acompanha os orçamentos enviados?</w:t>
-      </w:r>
-    </w:p>
-    <w:p>
-      <w:pPr>
-        <w:pStyle w:val="Heading3"/>
-      </w:pPr>
-      <w:r>
-        <w:t>Ferramentas e dados</w:t>
-      </w:r>
-    </w:p>
-    <w:p>
-      <w:pPr>
-        <w:pStyle w:val="ListBullet"/>
-      </w:pPr>
-      <w:r>
-        <w:t>Para que serve o Veri e o NetsApp no dia a dia, e quem usa?</w:t>
-      </w:r>
-    </w:p>
-    <w:p>
-      <w:pPr>
-        <w:pStyle w:val="ListBullet"/>
-      </w:pPr>
-      <w:r>
-        <w:t>Quem tem acesso de administrador a cada sistema?</w:t>
-      </w:r>
-    </w:p>
-    <w:p>
-      <w:pPr>
-        <w:pStyle w:val="ListBullet"/>
-      </w:pPr>
-      <w:r>
-        <w:t>Como estão organizadas as pastas no OneDrive? Há padrão de nomes?</w:t>
-      </w:r>
-    </w:p>
-    <w:p>
-      <w:pPr>
-        <w:pStyle w:val="ListBullet"/>
-      </w:pPr>
-      <w:r>
-        <w:t>O Trello é usado por toda a equipe ou só por algumas pessoas?</w:t>
-      </w:r>
-    </w:p>
-    <w:p>
-      <w:pPr>
-        <w:pStyle w:val="Heading3"/>
-      </w:pPr>
-      <w:r>
-        <w:t>Expectativas e condições</w:t>
-      </w:r>
-    </w:p>
-    <w:p>
-      <w:pPr>
-        <w:pStyle w:val="ListBullet"/>
-      </w:pPr>
-      <w:r>
-        <w:t>Qual é a dor que, se resolvida primeiro, mais mudaria o dia a dia dela?</w:t>
-      </w:r>
-    </w:p>
-    <w:p>
-      <w:pPr>
-        <w:pStyle w:val="ListBullet"/>
-      </w:pPr>
-      <w:r>
-        <w:t>Em quanto tempo ela espera ver o primeiro resultado?</w:t>
-      </w:r>
-    </w:p>
-    <w:p>
-      <w:pPr>
-        <w:pStyle w:val="ListBullet"/>
-      </w:pPr>
-      <w:r>
-        <w:t>Ela tem uma faixa de investimento em mente para esta etapa?</w:t>
-      </w:r>
-    </w:p>
-    <w:p>
-      <w:pPr>
-        <w:pStyle w:val="ListBullet"/>
-      </w:pPr>
-      <w:r>
-        <w:t>A equipe pode participar de entrevistas fora do horário comercial (antes das 10h ou após 19h30) ou em horário de almoço?</w:t>
-      </w:r>
-    </w:p>
-    <w:p>
-      <w:pPr>
-        <w:pStyle w:val="ListBullet"/>
-      </w:pPr>
-      <w:r>
-        <w:t>Ela prefere que a equipe aprenda a manter as melhorias ou que o consultor mantenha?</w:t>
-      </w:r>
-    </w:p>
-    <w:p>
-      <w:pPr>
-        <w:pStyle w:val="Heading1"/>
-      </w:pPr>
-      <w:r>
-        <w:t>7. Próximos passos do diagnóstico</w:t>
-      </w:r>
-    </w:p>
-    <w:p>
-      <w:pPr>
-        <w:pStyle w:val="ListNumber"/>
-      </w:pPr>
-      <w:r>
-        <w:t>Conferir a transcrição e a gravação e preencher os campos [PREENCHER].</w:t>
-      </w:r>
-    </w:p>
-    <w:p>
-      <w:pPr>
-        <w:pStyle w:val="ListNumber"/>
-      </w:pPr>
-      <w:r>
-        <w:t>Apresentar a proposta na quinta-feira, 15/10/2026, e validar as lacunas principais com a Thamires.</w:t>
-      </w:r>
-    </w:p>
-    <w:p>
-      <w:pPr>
-        <w:pStyle w:val="ListNumber"/>
-      </w:pPr>
-      <w:r>
-        <w:t>Após o aceite: entrevistas com os funcionários de cada área para levantar os insumos de cada tarefa.</w:t>
-      </w:r>
-    </w:p>
-    <w:p>
-      <w:pPr>
-        <w:pStyle w:val="ListNumber"/>
-      </w:pPr>
-      <w:r>
-        <w:t>Consolidar o mapeamento e a proposta de estrutura organizacional (Etapas 1 e 2 da proposta).</w:t>
+        <w:t>Acesso de leitura ao Trello, à pasta Geral do OneDrive e aos passo a passos, via Júlia (02:09).</w:t>
       </w:r>
     </w:p>
     <w:sectPr>
@@ -2065,7 +3321,7 @@
         <w:color w:val="595959"/>
         <w:sz w:val="16"/>
       </w:rPr>
-      <w:t>Surcin Consultoria · Proposta de consultoria em organização e processos · Confidencial</w:t>
+      <w:t>Surcin · Proposta de consultoria em organização e processos · Confidencial</w:t>
     </w:r>
   </w:p>
 </w:ftr>

</xml_diff>

<commit_message>
Proposta Surcin v3: cruza reunião, briefing e anotações do Gemini
Co-Authored-By: Claude Opus 5.5 (1M context) <noreply@anthropic.com>
Claude-Session: https://claude.ai/code/session_0127xFh2xB8HoQ18BDMAY2QJ
</commit_message>
<xml_diff>
--- a/proposta-surcin/01-diagnostico-preliminar.docx
+++ b/proposta-surcin/01-diagnostico-preliminar.docx
@@ -18,7 +18,7 @@
           <w:color w:val="595959"/>
           <w:sz w:val="26"/>
         </w:rPr>
-        <w:t>Surcin · leitura da reunião de descoberta de 12/10/2026</w:t>
+        <w:t>Surcin Assessoria Empresarial · leitura da reunião de 12/10/2026 e do briefing</w:t>
       </w:r>
     </w:p>
     <w:p>
@@ -28,7 +28,7 @@
           <w:color w:val="595959"/>
           <w:sz w:val="18"/>
         </w:rPr>
-        <w:t>Versão 2 · 13/10/2026 · atualizada com a transcrição da reunião · uso interno até revisão do Renato</w:t>
+        <w:t>Versão 3 · 13/10/2026 · reunião, briefing e anotações cruzados · uso interno até revisão do Renato</w:t>
       </w:r>
     </w:p>
     <w:tbl>
@@ -52,7 +52,7 @@
               <w:rPr>
                 <w:sz w:val="20"/>
               </w:rPr>
-              <w:t>Fonte: transcrição automática da reunião de 12/10/2026 (2h38). Transcrições automáticas trocam nomes e números; os pontos marcados [CONFIRMAR] devem ser conferidos com a gravação ou com a Thamires. Nada aqui foi acrescentado além do que ela disse.</w:t>
+              <w:t>Fontes, por ordem de prioridade: (1) transcrição automática da reunião de 12/10/2026, 2h38; (2) "Briefing para proposta de consultoria e implantação", 14 páginas, enviado pela Surcin; (3) anotações automáticas do Gemini sobre a reunião. As divergências estão registradas na seção 8. Nada aqui foi acrescentado além do que as fontes dizem.</w:t>
             </w:r>
           </w:p>
         </w:tc>
@@ -64,7 +64,7 @@
         <w:rPr>
           <w:i/>
         </w:rPr>
-        <w:t>Legenda: [FATO] dito pela Thamires na reunião de 12/10/2026 (o minuto da gravação aparece entre parênteses); [HIPÓTESE] leitura do consultor, a validar; [CONFIRMAR] número ou nome que apareceu de forma ambígua na transcrição automática.</w:t>
+        <w:t>Legenda: [REUNIÃO] dito pela Thamires em 12/10/2026 (minuto da gravação entre parênteses); [BRIEFING] relatório de briefing que a Surcin enviou ao consultor; [HIPÓTESE] leitura do consultor; [DIVERGÊNCIA] as fontes discordam (ver seção 8). Quando as fontes discordam, vale a reunião.</w:t>
       </w:r>
     </w:p>
     <w:p>
@@ -80,7 +80,7 @@
         <w:rPr>
           <w:i w:val="0"/>
         </w:rPr>
-        <w:t>A Surcin é um escritório pequeno que já tem processos desenhados, mas ainda depende da Thamires para quase tudo. Ela reconstruiu a empresa a partir de 2023 com passo a passos, checklists e rotinas no Trello, e recuperou cerca de 90% dos clientes que havia perdido (00:11). O gargalo atual não é falta de processo, é falta de eficiência e de autonomia da equipe: ela revisa e corrige tudo, e um erro de configuração no Domínio em agosto gerou imposto pago errado, multa, um prejuízo de cerca de R$ 10 mil e a perda de um cliente (00:26 a 00:29).</w:t>
+        <w:t>A Surcin é uma assessoria empresarial pequena que já tem processos desenhados, mas ainda depende da Thamires como fonte de conhecimento, decisão e revisão. Depois de quebrar no fim de 2023 por crescer sem estrutura, ela reconstruiu a operação a partir de 2024 com passo a passos, checklists e rotinas no Trello, e recuperou cerca de 90% dos clientes (00:11; briefing, seção 3).</w:t>
       </w:r>
     </w:p>
     <w:p>
@@ -88,7 +88,15 @@
         <w:rPr>
           <w:i w:val="0"/>
         </w:rPr>
-        <w:t>Ela tem prazo pessoal e financeiro: uma prova de certificação em 13/12/2026, caixa garantido por um Pronampe até novembro e a meta de entrar em janeiro com a casa arrumada para contratar um contador e voltar a investir em vendas (00:31 a 00:37, 02:14).</w:t>
+        <w:t>O gargalo atual não é falta de processo, é falta de eficiência, de controle e de autonomia. Em 2026 os sistemas novos (Domínio, Veri, Conta Azul) não foram implantados de fato, e um erro de parametrização de ISS gerou imposto pago errado, retificações, multa, um impacto de cerca de R$ 10 mil e a perda de um cliente (00:26 a 00:29; briefing, seção 4.1). Desde a saída da responsável pelo fiscal, em agosto, a Thamires executa o fiscal pessoalmente.</w:t>
+      </w:r>
+    </w:p>
+    <w:p>
+      <w:r>
+        <w:rPr>
+          <w:i w:val="0"/>
+        </w:rPr>
+        <w:t>Há prazo pessoal e financeiro: prova de certificação em 13/12/2026, caixa garantido por um Pronampe até novembro e a meta de entrar em janeiro com a operação estável para retomar vendas e reavaliar contratações (00:31 a 00:37, 02:14; briefing, seção 1).</w:t>
       </w:r>
     </w:p>
     <w:p>
@@ -96,7 +104,7 @@
         <w:rPr>
           <w:i/>
         </w:rPr>
-        <w:t>Frase dela que resume o objetivo: "Hoje eu sinto que eu tenho um processo. Esse processo ele só não tá eficiente. Se eu melhorar isso, eu consigo escalar com as mesmas pessoas." (01:14)</w:t>
+        <w:t>Frase dela: "Hoje eu sinto que eu tenho um processo. Esse processo ele só não tá eficiente. Se eu melhorar isso, eu consigo escalar com as mesmas pessoas." (01:14)</w:t>
       </w:r>
     </w:p>
     <w:p>
@@ -122,7 +130,7 @@
       <w:tr>
         <w:tc>
           <w:tcPr>
-            <w:tcW w:type="dxa" w:w="1984"/>
+            <w:tcW w:type="dxa" w:w="1871"/>
             <w:shd w:val="clear" w:color="auto" w:fill="1F3A5F"/>
           </w:tcPr>
           <w:p>
@@ -139,7 +147,7 @@
         </w:tc>
         <w:tc>
           <w:tcPr>
-            <w:tcW w:type="dxa" w:w="5386"/>
+            <w:tcW w:type="dxa" w:w="5499"/>
             <w:shd w:val="clear" w:color="auto" w:fill="1F3A5F"/>
           </w:tcPr>
           <w:p>
@@ -150,7 +158,7 @@
                 <w:color w:val="FFFFFF"/>
                 <w:sz w:val="20"/>
               </w:rPr>
-              <w:t>O que foi dito</w:t>
+              <w:t>O que as fontes dizem</w:t>
             </w:r>
           </w:p>
         </w:tc>
@@ -175,7 +183,101 @@
       <w:tr>
         <w:tc>
           <w:tcPr>
-            <w:tcW w:type="dxa" w:w="1984"/>
+            <w:tcW w:type="dxa" w:w="1871"/>
+          </w:tcPr>
+          <w:p>
+            <w:r/>
+            <w:r>
+              <w:rPr>
+                <w:b w:val="0"/>
+                <w:sz w:val="20"/>
+              </w:rPr>
+              <w:t>Fundação</w:t>
+            </w:r>
+          </w:p>
+        </w:tc>
+        <w:tc>
+          <w:tcPr>
+            <w:tcW w:type="dxa" w:w="5499"/>
+          </w:tcPr>
+          <w:p>
+            <w:r/>
+            <w:r>
+              <w:rPr>
+                <w:b w:val="0"/>
+                <w:sz w:val="20"/>
+              </w:rPr>
+              <w:t>Constituída em 2021; dedicação integral da Thamires desde janeiro de 2023; atuação remota</w:t>
+            </w:r>
+          </w:p>
+        </w:tc>
+        <w:tc>
+          <w:tcPr>
+            <w:tcW w:type="dxa" w:w="1701"/>
+          </w:tcPr>
+          <w:p>
+            <w:r/>
+            <w:r>
+              <w:rPr>
+                <w:b w:val="0"/>
+                <w:sz w:val="20"/>
+              </w:rPr>
+              <w:t>[BRIEFING] seção 2</w:t>
+            </w:r>
+          </w:p>
+        </w:tc>
+      </w:tr>
+      <w:tr>
+        <w:tc>
+          <w:tcPr>
+            <w:tcW w:type="dxa" w:w="1871"/>
+          </w:tcPr>
+          <w:p>
+            <w:r/>
+            <w:r>
+              <w:rPr>
+                <w:b w:val="0"/>
+                <w:sz w:val="20"/>
+              </w:rPr>
+              <w:t>Serviços</w:t>
+            </w:r>
+          </w:p>
+        </w:tc>
+        <w:tc>
+          <w:tcPr>
+            <w:tcW w:type="dxa" w:w="5499"/>
+          </w:tcPr>
+          <w:p>
+            <w:r/>
+            <w:r>
+              <w:rPr>
+                <w:b w:val="0"/>
+                <w:sz w:val="20"/>
+              </w:rPr>
+              <w:t>Contabilidade, apurações fiscais, DP/eSocial, BPO financeiro, abertura/alteração/baixa de empresas, regularizações, MEI, IRPF, parcelamentos, contratos e jurídico empresarial; revenda de certificado digital</w:t>
+            </w:r>
+          </w:p>
+        </w:tc>
+        <w:tc>
+          <w:tcPr>
+            <w:tcW w:type="dxa" w:w="1701"/>
+          </w:tcPr>
+          <w:p>
+            <w:r/>
+            <w:r>
+              <w:rPr>
+                <w:b w:val="0"/>
+                <w:sz w:val="20"/>
+              </w:rPr>
+              <w:t>[BRIEFING] seção 2; [REUNIÃO] 00:52</w:t>
+            </w:r>
+          </w:p>
+        </w:tc>
+      </w:tr>
+      <w:tr>
+        <w:tc>
+          <w:tcPr>
+            <w:tcW w:type="dxa" w:w="1871"/>
           </w:tcPr>
           <w:p>
             <w:r/>
@@ -190,7 +292,7 @@
         </w:tc>
         <w:tc>
           <w:tcPr>
-            <w:tcW w:type="dxa" w:w="5386"/>
+            <w:tcW w:type="dxa" w:w="5499"/>
           </w:tcPr>
           <w:p>
             <w:r/>
@@ -199,7 +301,7 @@
                 <w:b w:val="0"/>
                 <w:sz w:val="20"/>
               </w:rPr>
-              <w:t>Fazer a gestão do empresário de ponta a ponta: contabilidade, financeiro (onde ela mais se encontra) e jurídico consultivo e preventivo</w:t>
+              <w:t>Gestão do empresário de ponta a ponta: contabilidade, financeiro e jurídico consultivo</w:t>
             </w:r>
           </w:p>
         </w:tc>
@@ -214,7 +316,7 @@
                 <w:b w:val="0"/>
                 <w:sz w:val="20"/>
               </w:rPr>
-              <w:t>[FATO] 00:05</w:t>
+              <w:t>[REUNIÃO] 00:05</w:t>
             </w:r>
           </w:p>
         </w:tc>
@@ -222,7 +324,54 @@
       <w:tr>
         <w:tc>
           <w:tcPr>
-            <w:tcW w:type="dxa" w:w="1984"/>
+            <w:tcW w:type="dxa" w:w="1871"/>
+          </w:tcPr>
+          <w:p>
+            <w:r/>
+            <w:r>
+              <w:rPr>
+                <w:b w:val="0"/>
+                <w:sz w:val="20"/>
+              </w:rPr>
+              <w:t>Estratégia de longo prazo</w:t>
+            </w:r>
+          </w:p>
+        </w:tc>
+        <w:tc>
+          <w:tcPr>
+            <w:tcW w:type="dxa" w:w="5499"/>
+          </w:tcPr>
+          <w:p>
+            <w:r/>
+            <w:r>
+              <w:rPr>
+                <w:b w:val="0"/>
+                <w:sz w:val="20"/>
+              </w:rPr>
+              <w:t>Especialização gradual no segmento pet/veterinário, sem abandonar os demais</w:t>
+            </w:r>
+          </w:p>
+        </w:tc>
+        <w:tc>
+          <w:tcPr>
+            <w:tcW w:type="dxa" w:w="1701"/>
+          </w:tcPr>
+          <w:p>
+            <w:r/>
+            <w:r>
+              <w:rPr>
+                <w:b w:val="0"/>
+                <w:sz w:val="20"/>
+              </w:rPr>
+              <w:t>[BRIEFING] seção 2</w:t>
+            </w:r>
+          </w:p>
+        </w:tc>
+      </w:tr>
+      <w:tr>
+        <w:tc>
+          <w:tcPr>
+            <w:tcW w:type="dxa" w:w="1871"/>
           </w:tcPr>
           <w:p>
             <w:r/>
@@ -237,7 +386,7 @@
         </w:tc>
         <w:tc>
           <w:tcPr>
-            <w:tcW w:type="dxa" w:w="5386"/>
+            <w:tcW w:type="dxa" w:w="5499"/>
           </w:tcPr>
           <w:p>
             <w:r/>
@@ -246,7 +395,7 @@
                 <w:b w:val="0"/>
                 <w:sz w:val="20"/>
               </w:rPr>
-              <w:t>Três CNPJs: contabilidade, financeiro e jurídico, separados por questão tributária</w:t>
+              <w:t>Três CNPJs: contabilidade, financeiro e jurídico</w:t>
             </w:r>
           </w:p>
         </w:tc>
@@ -261,7 +410,7 @@
                 <w:b w:val="0"/>
                 <w:sz w:val="20"/>
               </w:rPr>
-              <w:t>[FATO] 01:02</w:t>
+              <w:t>[REUNIÃO] 01:02</w:t>
             </w:r>
           </w:p>
         </w:tc>
@@ -269,7 +418,7 @@
       <w:tr>
         <w:tc>
           <w:tcPr>
-            <w:tcW w:type="dxa" w:w="1984"/>
+            <w:tcW w:type="dxa" w:w="1871"/>
           </w:tcPr>
           <w:p>
             <w:r/>
@@ -278,13 +427,13 @@
                 <w:b w:val="0"/>
                 <w:sz w:val="20"/>
               </w:rPr>
-              <w:t>Clientes de contabilidade</w:t>
+              <w:t>Carteira fiscal/contábil</w:t>
             </w:r>
           </w:p>
         </w:tc>
         <w:tc>
           <w:tcPr>
-            <w:tcW w:type="dxa" w:w="5386"/>
+            <w:tcW w:type="dxa" w:w="5499"/>
           </w:tcPr>
           <w:p>
             <w:r/>
@@ -293,7 +442,7 @@
                 <w:b w:val="0"/>
                 <w:sz w:val="20"/>
               </w:rPr>
-              <w:t>Cerca de 40; o fiscal do mês passado cobriu 44 clientes</w:t>
+              <w:t>Cerca de 40 a 45 empresas; o fiscal do mês passado cobriu 44</w:t>
             </w:r>
           </w:p>
         </w:tc>
@@ -308,7 +457,7 @@
                 <w:b w:val="0"/>
                 <w:sz w:val="20"/>
               </w:rPr>
-              <w:t>[FATO] 01:55 e 02:00</w:t>
+              <w:t>[REUNIÃO] 01:55, 02:00; [BRIEFING] seção 3</w:t>
             </w:r>
           </w:p>
         </w:tc>
@@ -316,7 +465,7 @@
       <w:tr>
         <w:tc>
           <w:tcPr>
-            <w:tcW w:type="dxa" w:w="1984"/>
+            <w:tcW w:type="dxa" w:w="1871"/>
           </w:tcPr>
           <w:p>
             <w:r/>
@@ -325,13 +474,13 @@
                 <w:b w:val="0"/>
                 <w:sz w:val="20"/>
               </w:rPr>
-              <w:t>Clientes de financeiro (BPO)</w:t>
+              <w:t>Carteira de BPO financeiro</w:t>
             </w:r>
           </w:p>
         </w:tc>
         <w:tc>
           <w:tcPr>
-            <w:tcW w:type="dxa" w:w="5386"/>
+            <w:tcW w:type="dxa" w:w="5499"/>
           </w:tcPr>
           <w:p>
             <w:r/>
@@ -340,7 +489,7 @@
                 <w:b w:val="0"/>
                 <w:sz w:val="20"/>
               </w:rPr>
-              <w:t>Entre 12 e 16, conforme o trecho; Vitória cuida de todos</w:t>
+              <w:t>13 a 15 clientes externos (16 contando as três empresas da própria Thamires)</w:t>
             </w:r>
           </w:p>
         </w:tc>
@@ -355,7 +504,7 @@
                 <w:b w:val="0"/>
                 <w:sz w:val="20"/>
               </w:rPr>
-              <w:t>[FATO] 00:38, 00:46, 01:02 [CONFIRMAR]</w:t>
+              <w:t>[REUNIÃO] 01:02; [BRIEFING] 9.1</w:t>
             </w:r>
           </w:p>
         </w:tc>
@@ -363,7 +512,7 @@
       <w:tr>
         <w:tc>
           <w:tcPr>
-            <w:tcW w:type="dxa" w:w="1984"/>
+            <w:tcW w:type="dxa" w:w="1871"/>
           </w:tcPr>
           <w:p>
             <w:r/>
@@ -378,7 +527,7 @@
         </w:tc>
         <w:tc>
           <w:tcPr>
-            <w:tcW w:type="dxa" w:w="5386"/>
+            <w:tcW w:type="dxa" w:w="5499"/>
           </w:tcPr>
           <w:p>
             <w:r/>
@@ -387,7 +536,7 @@
                 <w:b w:val="0"/>
                 <w:sz w:val="20"/>
               </w:rPr>
-              <w:t>Cerca de 25 vidas; 4 ou 5 clientes com funcionários; a maioria dos clientes é PJ</w:t>
+              <w:t>Cerca de 25 vidas, em 4 ou 5 clientes com funcionários</w:t>
             </w:r>
           </w:p>
         </w:tc>
@@ -402,7 +551,7 @@
                 <w:b w:val="0"/>
                 <w:sz w:val="20"/>
               </w:rPr>
-              <w:t>[FATO] 00:40</w:t>
+              <w:t>[REUNIÃO] 00:40</w:t>
             </w:r>
           </w:p>
         </w:tc>
@@ -410,7 +559,7 @@
       <w:tr>
         <w:tc>
           <w:tcPr>
-            <w:tcW w:type="dxa" w:w="1984"/>
+            <w:tcW w:type="dxa" w:w="1871"/>
           </w:tcPr>
           <w:p>
             <w:r/>
@@ -425,7 +574,7 @@
         </w:tc>
         <w:tc>
           <w:tcPr>
-            <w:tcW w:type="dxa" w:w="5386"/>
+            <w:tcW w:type="dxa" w:w="5499"/>
           </w:tcPr>
           <w:p>
             <w:r/>
@@ -434,7 +583,7 @@
                 <w:b w:val="0"/>
                 <w:sz w:val="20"/>
               </w:rPr>
-              <w:t>Cerca de 20 processos em andamento, herdados de uma sociedade desfeita, em fase final; contratos e societário (abertura de empresas). Hoje não gera receita recorrente</w:t>
+              <w:t>Cerca de 20 processos legados em fase final; contratos e societário; sem receita recorrente hoje</w:t>
             </w:r>
           </w:p>
         </w:tc>
@@ -449,7 +598,7 @@
                 <w:b w:val="0"/>
                 <w:sz w:val="20"/>
               </w:rPr>
-              <w:t>[FATO] 00:43, 01:45</w:t>
+              <w:t>[REUNIÃO] 00:43, 01:45</w:t>
             </w:r>
           </w:p>
         </w:tc>
@@ -457,7 +606,7 @@
       <w:tr>
         <w:tc>
           <w:tcPr>
-            <w:tcW w:type="dxa" w:w="1984"/>
+            <w:tcW w:type="dxa" w:w="1871"/>
           </w:tcPr>
           <w:p>
             <w:r/>
@@ -466,13 +615,13 @@
                 <w:b w:val="0"/>
                 <w:sz w:val="20"/>
               </w:rPr>
-              <w:t>Outros serviços</w:t>
+              <w:t>Situação financeira</w:t>
             </w:r>
           </w:p>
         </w:tc>
         <w:tc>
           <w:tcPr>
-            <w:tcW w:type="dxa" w:w="5386"/>
+            <w:tcW w:type="dxa" w:w="5499"/>
           </w:tcPr>
           <w:p>
             <w:r/>
@@ -481,7 +630,7 @@
                 <w:b w:val="0"/>
                 <w:sz w:val="20"/>
               </w:rPr>
-              <w:t>Revenda de certificado digital, imposto de renda (pontual), parcerias com outras contabilidades, clientes do Lucro Presumido</w:t>
+              <w:t>Pronampe garante caixa até novembro; dezembro apertado; pagamento começa em fevereiro</w:t>
             </w:r>
           </w:p>
         </w:tc>
@@ -496,7 +645,7 @@
                 <w:b w:val="0"/>
                 <w:sz w:val="20"/>
               </w:rPr>
-              <w:t>[FATO] 00:52 a 00:53</w:t>
+              <w:t>[REUNIÃO] 00:31, 01:33</w:t>
             </w:r>
           </w:p>
         </w:tc>
@@ -504,7 +653,7 @@
       <w:tr>
         <w:tc>
           <w:tcPr>
-            <w:tcW w:type="dxa" w:w="1984"/>
+            <w:tcW w:type="dxa" w:w="1871"/>
           </w:tcPr>
           <w:p>
             <w:r/>
@@ -513,13 +662,13 @@
                 <w:b w:val="0"/>
                 <w:sz w:val="20"/>
               </w:rPr>
-              <w:t>Situação financeira</w:t>
+              <w:t>Decisões já tomadas</w:t>
             </w:r>
           </w:p>
         </w:tc>
         <w:tc>
           <w:tcPr>
-            <w:tcW w:type="dxa" w:w="5386"/>
+            <w:tcW w:type="dxa" w:w="5499"/>
           </w:tcPr>
           <w:p>
             <w:r/>
@@ -528,7 +677,7 @@
                 <w:b w:val="0"/>
                 <w:sz w:val="20"/>
               </w:rPr>
-              <w:t>Prejuízo de agosto; Pronampe garante caixa até novembro; dezembro apertado; pagamento começa em fevereiro</w:t>
+              <w:t>Sem contratações até o fim do ano; tráfego pago pausado (cerca de R$ 1 mil/mês em anúncios); social media mantida; conciliação semanal; comunicação com clientes de contabilidade só pelo aplicativo da Veri a partir de novembro</w:t>
             </w:r>
           </w:p>
         </w:tc>
@@ -543,54 +692,7 @@
                 <w:b w:val="0"/>
                 <w:sz w:val="20"/>
               </w:rPr>
-              <w:t>[FATO] 00:31, 01:33</w:t>
-            </w:r>
-          </w:p>
-        </w:tc>
-      </w:tr>
-      <w:tr>
-        <w:tc>
-          <w:tcPr>
-            <w:tcW w:type="dxa" w:w="1984"/>
-          </w:tcPr>
-          <w:p>
-            <w:r/>
-            <w:r>
-              <w:rPr>
-                <w:b w:val="0"/>
-                <w:sz w:val="20"/>
-              </w:rPr>
-              <w:t>Decisões já tomadas</w:t>
-            </w:r>
-          </w:p>
-        </w:tc>
-        <w:tc>
-          <w:tcPr>
-            <w:tcW w:type="dxa" w:w="5386"/>
-          </w:tcPr>
-          <w:p>
-            <w:r/>
-            <w:r>
-              <w:rPr>
-                <w:b w:val="0"/>
-                <w:sz w:val="20"/>
-              </w:rPr>
-              <w:t>Não contratar até o fim do ano; contratar em janeiro um contador experiente no Domínio; tráfego pago pausado (cerca de R$ 1 mil em anúncios), social media mantida</w:t>
-            </w:r>
-          </w:p>
-        </w:tc>
-        <w:tc>
-          <w:tcPr>
-            <w:tcW w:type="dxa" w:w="1701"/>
-          </w:tcPr>
-          <w:p>
-            <w:r/>
-            <w:r>
-              <w:rPr>
-                <w:b w:val="0"/>
-                <w:sz w:val="20"/>
-              </w:rPr>
-              <w:t>[FATO] 00:30, 01:49, 02:12</w:t>
+              <w:t>[REUNIÃO] 00:30, 01:16, 01:31, 02:12</w:t>
             </w:r>
           </w:p>
         </w:tc>
@@ -602,7 +704,7 @@
         <w:pStyle w:val="Heading1"/>
       </w:pPr>
       <w:r>
-        <w:t>3. Equipe atual</w:t>
+        <w:t>3. Pessoas</w:t>
       </w:r>
     </w:p>
     <w:tbl>
@@ -638,7 +740,7 @@
         </w:tc>
         <w:tc>
           <w:tcPr>
-            <w:tcW w:type="dxa" w:w="3402"/>
+            <w:tcW w:type="dxa" w:w="3515"/>
             <w:shd w:val="clear" w:color="auto" w:fill="1F3A5F"/>
           </w:tcPr>
           <w:p>
@@ -649,13 +751,13 @@
                 <w:color w:val="FFFFFF"/>
                 <w:sz w:val="20"/>
               </w:rPr>
-              <w:t>Função hoje</w:t>
+              <w:t>Função</w:t>
             </w:r>
           </w:p>
         </w:tc>
         <w:tc>
           <w:tcPr>
-            <w:tcW w:type="dxa" w:w="2948"/>
+            <w:tcW w:type="dxa" w:w="2835"/>
             <w:shd w:val="clear" w:color="auto" w:fill="1F3A5F"/>
           </w:tcPr>
           <w:p>
@@ -666,7 +768,7 @@
                 <w:color w:val="FFFFFF"/>
                 <w:sz w:val="20"/>
               </w:rPr>
-              <w:t>Observações dela</w:t>
+              <w:t>Observações</w:t>
             </w:r>
           </w:p>
         </w:tc>
@@ -706,7 +808,7 @@
         </w:tc>
         <w:tc>
           <w:tcPr>
-            <w:tcW w:type="dxa" w:w="3402"/>
+            <w:tcW w:type="dxa" w:w="3515"/>
           </w:tcPr>
           <w:p>
             <w:r/>
@@ -715,13 +817,13 @@
                 <w:b w:val="0"/>
                 <w:sz w:val="20"/>
               </w:rPr>
-              <w:t>Direção, técnica contábil e jurídica, fiscal (absorveu após a saída da contadora), reuniões de fechamento, comercial</w:t>
+              <w:t>Direção, clientes, jurídico, societário, análises financeiras, reuniões de fechamento e, desde agosto, execução do fiscal</w:t>
             </w:r>
           </w:p>
         </w:tc>
         <w:tc>
           <w:tcPr>
-            <w:tcW w:type="dxa" w:w="2948"/>
+            <w:tcW w:type="dxa" w:w="2835"/>
           </w:tcPr>
           <w:p>
             <w:r/>
@@ -730,7 +832,7 @@
                 <w:b w:val="0"/>
                 <w:sz w:val="20"/>
               </w:rPr>
-              <w:t>Tudo passa por ela; revisa o trabalho de todos</w:t>
+              <w:t>Precisa reduzir o envolvimento operacional para estudar</w:t>
             </w:r>
           </w:p>
         </w:tc>
@@ -745,7 +847,7 @@
                 <w:b w:val="0"/>
                 <w:sz w:val="20"/>
               </w:rPr>
-              <w:t>00:18, 00:30</w:t>
+              <w:t>00:18, 00:30; briefing 5</w:t>
             </w:r>
           </w:p>
         </w:tc>
@@ -768,7 +870,7 @@
         </w:tc>
         <w:tc>
           <w:tcPr>
-            <w:tcW w:type="dxa" w:w="3402"/>
+            <w:tcW w:type="dxa" w:w="3515"/>
           </w:tcPr>
           <w:p>
             <w:r/>
@@ -777,13 +879,13 @@
                 <w:b w:val="0"/>
                 <w:sz w:val="20"/>
               </w:rPr>
-              <w:t>Secretária e braço direito: atendimento, WhatsApp, agenda, Trello, implantação de novos clientes, propostas no Canva, envio de impostos, apoio no fiscal (confere notas e XML)</w:t>
+              <w:t>Secretaria e atendimento: WhatsApp (Nestzap), agenda, documentos no OneDrive, Trello, propostas e contratos, implantação de clientes, apoio no fiscal e no societário</w:t>
             </w:r>
           </w:p>
         </w:tc>
         <w:tc>
           <w:tcPr>
-            <w:tcW w:type="dxa" w:w="2948"/>
+            <w:tcW w:type="dxa" w:w="2835"/>
           </w:tcPr>
           <w:p>
             <w:r/>
@@ -792,7 +894,7 @@
                 <w:b w:val="0"/>
                 <w:sz w:val="20"/>
               </w:rPr>
-              <w:t>Vê a empresa inteira; candidata a supervisora em 2027, condicionado a graduação</w:t>
+              <w:t>Braço direito; candidata a supervisora em 2027, condicionado a graduação</w:t>
             </w:r>
           </w:p>
         </w:tc>
@@ -807,7 +909,7 @@
                 <w:b w:val="0"/>
                 <w:sz w:val="20"/>
               </w:rPr>
-              <w:t>00:15 a 00:19, 01:04, 01:35</w:t>
+              <w:t>00:15 a 00:19, 01:04; briefing 5</w:t>
             </w:r>
           </w:p>
         </w:tc>
@@ -830,7 +932,7 @@
         </w:tc>
         <w:tc>
           <w:tcPr>
-            <w:tcW w:type="dxa" w:w="3402"/>
+            <w:tcW w:type="dxa" w:w="3515"/>
           </w:tcPr>
           <w:p>
             <w:r/>
@@ -839,13 +941,13 @@
                 <w:b w:val="0"/>
                 <w:sz w:val="20"/>
               </w:rPr>
-              <w:t>Financeiro operacional: pagamentos (terças e sextas), emissão de notas, conciliação no Conta Azul, preparação do fechamento</w:t>
+              <w:t>Financeiro: pagamentos (terças e sextas), notas, conciliação no Conta Azul, preparação dos fechamentos</w:t>
             </w:r>
           </w:p>
         </w:tc>
         <w:tc>
           <w:tcPr>
-            <w:tcW w:type="dxa" w:w="2948"/>
+            <w:tcW w:type="dxa" w:w="2835"/>
           </w:tcPr>
           <w:p>
             <w:r/>
@@ -854,7 +956,7 @@
                 <w:b w:val="0"/>
                 <w:sz w:val="20"/>
               </w:rPr>
-              <w:t>Muito boa quando o processo está desenhado; ainda precisa de ajuda na classificação de despesas. De férias até 28/10 [CONFIRMAR]</w:t>
+              <w:t>Férias em outubro, retorno em 28/10; a partir de novembro assume o financeiro integralmente</w:t>
             </w:r>
           </w:p>
         </w:tc>
@@ -869,7 +971,7 @@
                 <w:b w:val="0"/>
                 <w:sz w:val="20"/>
               </w:rPr>
-              <w:t>00:13 a 00:15, 01:21, 01:34</w:t>
+              <w:t>00:13, 01:34; briefing 5</w:t>
             </w:r>
           </w:p>
         </w:tc>
@@ -892,7 +994,7 @@
         </w:tc>
         <w:tc>
           <w:tcPr>
-            <w:tcW w:type="dxa" w:w="3402"/>
+            <w:tcW w:type="dxa" w:w="3515"/>
           </w:tcPr>
           <w:p>
             <w:r/>
@@ -901,13 +1003,13 @@
                 <w:b w:val="0"/>
                 <w:sz w:val="20"/>
               </w:rPr>
-              <w:t>Hoje divide DP (folha), conciliações e emissão de notas; a partir de novembro, só DP</w:t>
+              <w:t>Em outubro acumula DP, conciliação e notas; a partir de novembro, DP</w:t>
             </w:r>
           </w:p>
         </w:tc>
         <w:tc>
           <w:tcPr>
-            <w:tcW w:type="dxa" w:w="2948"/>
+            <w:tcW w:type="dxa" w:w="2835"/>
           </w:tcPr>
           <w:p>
             <w:r/>
@@ -916,7 +1018,7 @@
                 <w:b w:val="0"/>
                 <w:sz w:val="20"/>
               </w:rPr>
-              <w:t>Sem experiência anterior; está gostando do DP</w:t>
+              <w:t>[DIVERGÊNCIA] sobre as notas a partir de novembro (seção 8)</w:t>
             </w:r>
           </w:p>
         </w:tc>
@@ -931,7 +1033,7 @@
                 <w:b w:val="0"/>
                 <w:sz w:val="20"/>
               </w:rPr>
-              <w:t>00:39 a 00:41, 02:05</w:t>
+              <w:t>00:41; briefing 5</w:t>
             </w:r>
           </w:p>
         </w:tc>
@@ -954,7 +1056,7 @@
         </w:tc>
         <w:tc>
           <w:tcPr>
-            <w:tcW w:type="dxa" w:w="3402"/>
+            <w:tcW w:type="dxa" w:w="3515"/>
           </w:tcPr>
           <w:p>
             <w:r/>
@@ -963,13 +1065,13 @@
                 <w:b w:val="0"/>
                 <w:sz w:val="20"/>
               </w:rPr>
-              <w:t>Estagiária do jurídico: processos em andamento e apoio no societário</w:t>
+              <w:t>Estagiária do jurídico e do societário, dois dias por semana, paga por hora</w:t>
             </w:r>
           </w:p>
         </w:tc>
         <w:tc>
           <w:tcPr>
-            <w:tcW w:type="dxa" w:w="2948"/>
+            <w:tcW w:type="dxa" w:w="2835"/>
           </w:tcPr>
           <w:p>
             <w:r/>
@@ -978,7 +1080,7 @@
                 <w:b w:val="0"/>
                 <w:sz w:val="20"/>
               </w:rPr>
-              <w:t>Trabalha só quarta e sexta, paga por hora; tudo precisa de revisão; a permanência está em reavaliação</w:t>
+              <w:t>Permanência em reavaliação</w:t>
             </w:r>
           </w:p>
         </w:tc>
@@ -993,7 +1095,131 @@
                 <w:b w:val="0"/>
                 <w:sz w:val="20"/>
               </w:rPr>
-              <w:t>00:42 a 00:43, 01:40 a 01:42, 02:18</w:t>
+              <w:t>00:42, 01:40, 02:18</w:t>
+            </w:r>
+          </w:p>
+        </w:tc>
+      </w:tr>
+      <w:tr>
+        <w:tc>
+          <w:tcPr>
+            <w:tcW w:type="dxa" w:w="1304"/>
+          </w:tcPr>
+          <w:p>
+            <w:r/>
+            <w:r>
+              <w:rPr>
+                <w:b w:val="0"/>
+                <w:sz w:val="20"/>
+              </w:rPr>
+              <w:t>Joyce</w:t>
+            </w:r>
+          </w:p>
+        </w:tc>
+        <w:tc>
+          <w:tcPr>
+            <w:tcW w:type="dxa" w:w="3515"/>
+          </w:tcPr>
+          <w:p>
+            <w:r/>
+            <w:r>
+              <w:rPr>
+                <w:b w:val="0"/>
+                <w:sz w:val="20"/>
+              </w:rPr>
+              <w:t>Contabilidade terceirizada e responsabilidade técnica, segundo o briefing</w:t>
+            </w:r>
+          </w:p>
+        </w:tc>
+        <w:tc>
+          <w:tcPr>
+            <w:tcW w:type="dxa" w:w="2835"/>
+          </w:tcPr>
+          <w:p>
+            <w:r/>
+            <w:r>
+              <w:rPr>
+                <w:b w:val="0"/>
+                <w:sz w:val="20"/>
+              </w:rPr>
+              <w:t>[DIVERGÊNCIA] com a reunião (seção 8)</w:t>
+            </w:r>
+          </w:p>
+        </w:tc>
+        <w:tc>
+          <w:tcPr>
+            <w:tcW w:type="dxa" w:w="1417"/>
+          </w:tcPr>
+          <w:p>
+            <w:r/>
+            <w:r>
+              <w:rPr>
+                <w:b w:val="0"/>
+                <w:sz w:val="20"/>
+              </w:rPr>
+              <w:t>briefing 2 e 5</w:t>
+            </w:r>
+          </w:p>
+        </w:tc>
+      </w:tr>
+      <w:tr>
+        <w:tc>
+          <w:tcPr>
+            <w:tcW w:type="dxa" w:w="1304"/>
+          </w:tcPr>
+          <w:p>
+            <w:r/>
+            <w:r>
+              <w:rPr>
+                <w:b w:val="0"/>
+                <w:sz w:val="20"/>
+              </w:rPr>
+              <w:t>Flora e parceiros</w:t>
+            </w:r>
+          </w:p>
+        </w:tc>
+        <w:tc>
+          <w:tcPr>
+            <w:tcW w:type="dxa" w:w="3515"/>
+          </w:tcPr>
+          <w:p>
+            <w:r/>
+            <w:r>
+              <w:rPr>
+                <w:b w:val="0"/>
+                <w:sz w:val="20"/>
+              </w:rPr>
+              <w:t>Conteúdo e campanhas; parceiros jurídicos para demandas fora do foco</w:t>
+            </w:r>
+          </w:p>
+        </w:tc>
+        <w:tc>
+          <w:tcPr>
+            <w:tcW w:type="dxa" w:w="2835"/>
+          </w:tcPr>
+          <w:p>
+            <w:r/>
+            <w:r>
+              <w:rPr>
+                <w:b w:val="0"/>
+                <w:sz w:val="20"/>
+              </w:rPr>
+              <w:t>Tráfego pago pausado</w:t>
+            </w:r>
+          </w:p>
+        </w:tc>
+        <w:tc>
+          <w:tcPr>
+            <w:tcW w:type="dxa" w:w="1417"/>
+          </w:tcPr>
+          <w:p>
+            <w:r/>
+            <w:r>
+              <w:rPr>
+                <w:b w:val="0"/>
+                <w:sz w:val="20"/>
+              </w:rPr>
+              <w:t>briefing 5</w:t>
             </w:r>
           </w:p>
         </w:tc>
@@ -1005,7 +1231,7 @@
         <w:rPr>
           <w:i w:val="0"/>
         </w:rPr>
-        <w:t>A contadora contratada para assumir a contabilidade saiu depois do erro de agosto. Desde então a área não tem responsável além da Thamires (00:30).</w:t>
+        <w:t>Saídas recentes: Jonathan em junho e Dani, responsável pelo fiscal, no fim de agosto (briefing, seção 3; reunião, 00:30).</w:t>
       </w:r>
     </w:p>
     <w:p>
@@ -1031,7 +1257,7 @@
       <w:tr>
         <w:tc>
           <w:tcPr>
-            <w:tcW w:type="dxa" w:w="1984"/>
+            <w:tcW w:type="dxa" w:w="1871"/>
             <w:shd w:val="clear" w:color="auto" w:fill="1F3A5F"/>
           </w:tcPr>
           <w:p>
@@ -1048,7 +1274,7 @@
         </w:tc>
         <w:tc>
           <w:tcPr>
-            <w:tcW w:type="dxa" w:w="5669"/>
+            <w:tcW w:type="dxa" w:w="5783"/>
             <w:shd w:val="clear" w:color="auto" w:fill="1F3A5F"/>
           </w:tcPr>
           <w:p>
@@ -1059,7 +1285,7 @@
                 <w:color w:val="FFFFFF"/>
                 <w:sz w:val="20"/>
               </w:rPr>
-              <w:t>Uso descrito na reunião</w:t>
+              <w:t>Uso atual</w:t>
             </w:r>
           </w:p>
         </w:tc>
@@ -1084,7 +1310,7 @@
       <w:tr>
         <w:tc>
           <w:tcPr>
-            <w:tcW w:type="dxa" w:w="1984"/>
+            <w:tcW w:type="dxa" w:w="1871"/>
           </w:tcPr>
           <w:p>
             <w:r/>
@@ -1099,7 +1325,7 @@
         </w:tc>
         <w:tc>
           <w:tcPr>
-            <w:tcW w:type="dxa" w:w="5669"/>
+            <w:tcW w:type="dxa" w:w="5783"/>
           </w:tcPr>
           <w:p>
             <w:r/>
@@ -1108,7 +1334,7 @@
                 <w:b w:val="0"/>
                 <w:sz w:val="20"/>
               </w:rPr>
-              <w:t>Principal ferramenta de gestão: rotinas diárias e mensais por pessoa, pendências, checklists de novo cliente e de abertura de empresa. Ela atribui ao Trello a queda nos erros</w:t>
+              <w:t>Rotinas diárias e mensais por pessoa, pendências, checklists de novo cliente e abertura de empresa. Não comprova sozinho que a tarefa foi feita corretamente</w:t>
             </w:r>
           </w:p>
         </w:tc>
@@ -1123,7 +1349,7 @@
                 <w:b w:val="0"/>
                 <w:sz w:val="20"/>
               </w:rPr>
-              <w:t>01:03 a 01:07</w:t>
+              <w:t>01:03 a 01:07; briefing 4.3</w:t>
             </w:r>
           </w:p>
         </w:tc>
@@ -1131,7 +1357,7 @@
       <w:tr>
         <w:tc>
           <w:tcPr>
-            <w:tcW w:type="dxa" w:w="1984"/>
+            <w:tcW w:type="dxa" w:w="1871"/>
           </w:tcPr>
           <w:p>
             <w:r/>
@@ -1140,13 +1366,13 @@
                 <w:b w:val="0"/>
                 <w:sz w:val="20"/>
               </w:rPr>
-              <w:t>OneDrive / Office</w:t>
+              <w:t>OneDrive / Microsoft 365</w:t>
             </w:r>
           </w:p>
         </w:tc>
         <w:tc>
           <w:tcPr>
-            <w:tcW w:type="dxa" w:w="5669"/>
+            <w:tcW w:type="dxa" w:w="5783"/>
           </w:tcPr>
           <w:p>
             <w:r/>
@@ -1155,7 +1381,7 @@
                 <w:b w:val="0"/>
                 <w:sz w:val="20"/>
               </w:rPr>
-              <w:t>Nuvem organizada por frente de serviço, com padrão de pastas por cliente; pasta Geral com acessos, passo a passos e modelos. Toda a equipe trabalha na nuvem</w:t>
+              <w:t>Repositório oficial: pastas por frente de serviço e por cliente, passo a passos e modelos</w:t>
             </w:r>
           </w:p>
         </w:tc>
@@ -1170,7 +1396,7 @@
                 <w:b w:val="0"/>
                 <w:sz w:val="20"/>
               </w:rPr>
-              <w:t>00:52 a 00:54, 01:03</w:t>
+              <w:t>00:52 a 00:54; briefing 6</w:t>
             </w:r>
           </w:p>
         </w:tc>
@@ -1178,7 +1404,7 @@
       <w:tr>
         <w:tc>
           <w:tcPr>
-            <w:tcW w:type="dxa" w:w="1984"/>
+            <w:tcW w:type="dxa" w:w="1871"/>
           </w:tcPr>
           <w:p>
             <w:r/>
@@ -1193,7 +1419,7 @@
         </w:tc>
         <w:tc>
           <w:tcPr>
-            <w:tcW w:type="dxa" w:w="5669"/>
+            <w:tcW w:type="dxa" w:w="5783"/>
           </w:tcPr>
           <w:p>
             <w:r/>
@@ -1225,7 +1451,54 @@
       <w:tr>
         <w:tc>
           <w:tcPr>
-            <w:tcW w:type="dxa" w:w="1984"/>
+            <w:tcW w:type="dxa" w:w="1871"/>
+          </w:tcPr>
+          <w:p>
+            <w:r/>
+            <w:r>
+              <w:rPr>
+                <w:b w:val="0"/>
+                <w:sz w:val="20"/>
+              </w:rPr>
+              <w:t>WhatsApp + Nestzap</w:t>
+            </w:r>
+          </w:p>
+        </w:tc>
+        <w:tc>
+          <w:tcPr>
+            <w:tcW w:type="dxa" w:w="5783"/>
+          </w:tcPr>
+          <w:p>
+            <w:r/>
+            <w:r>
+              <w:rPr>
+                <w:b w:val="0"/>
+                <w:sz w:val="20"/>
+              </w:rPr>
+              <w:t>Número único com vários usuários; entrada de demandas e grupos com clientes</w:t>
+            </w:r>
+          </w:p>
+        </w:tc>
+        <w:tc>
+          <w:tcPr>
+            <w:tcW w:type="dxa" w:w="1417"/>
+          </w:tcPr>
+          <w:p>
+            <w:r/>
+            <w:r>
+              <w:rPr>
+                <w:b w:val="0"/>
+                <w:sz w:val="20"/>
+              </w:rPr>
+              <w:t>01:54; briefing 6</w:t>
+            </w:r>
+          </w:p>
+        </w:tc>
+      </w:tr>
+      <w:tr>
+        <w:tc>
+          <w:tcPr>
+            <w:tcW w:type="dxa" w:w="1871"/>
           </w:tcPr>
           <w:p>
             <w:r/>
@@ -1240,7 +1513,7 @@
         </w:tc>
         <w:tc>
           <w:tcPr>
-            <w:tcW w:type="dxa" w:w="5669"/>
+            <w:tcW w:type="dxa" w:w="5783"/>
           </w:tcPr>
           <w:p>
             <w:r/>
@@ -1249,7 +1522,7 @@
                 <w:b w:val="0"/>
                 <w:sz w:val="20"/>
               </w:rPr>
-              <w:t>Suporte à contabilidade: aplicativo do cliente com impostos, certidões e documentos, modelos de contrato. A partir de novembro a comunicação com clientes de contabilidade será só pelo aplicativo</w:t>
+              <w:t>Aplicativo do cliente (guias, certidões, documentos) e modelos de contrato; adoção real a confirmar</w:t>
             </w:r>
           </w:p>
         </w:tc>
@@ -1264,7 +1537,7 @@
                 <w:b w:val="0"/>
                 <w:sz w:val="20"/>
               </w:rPr>
-              <w:t>01:15 a 01:17</w:t>
+              <w:t>01:15 a 01:17; briefing 6</w:t>
             </w:r>
           </w:p>
         </w:tc>
@@ -1272,7 +1545,7 @@
       <w:tr>
         <w:tc>
           <w:tcPr>
-            <w:tcW w:type="dxa" w:w="1984"/>
+            <w:tcW w:type="dxa" w:w="1871"/>
           </w:tcPr>
           <w:p>
             <w:r/>
@@ -1287,7 +1560,7 @@
         </w:tc>
         <w:tc>
           <w:tcPr>
-            <w:tcW w:type="dxa" w:w="5669"/>
+            <w:tcW w:type="dxa" w:w="5783"/>
           </w:tcPr>
           <w:p>
             <w:r/>
@@ -1296,7 +1569,7 @@
                 <w:b w:val="0"/>
                 <w:sz w:val="20"/>
               </w:rPr>
-              <w:t>Sistema contábil e fiscal. Configuração errada desde a migração; hoje o fiscal é feito direto no portal da Receita</w:t>
+              <w:t>Contábil, fiscal e folha. Parametrização com erro desde a migração; o fiscal está sendo feito direto no portal da Receita</w:t>
             </w:r>
           </w:p>
         </w:tc>
@@ -1311,7 +1584,7 @@
                 <w:b w:val="0"/>
                 <w:sz w:val="20"/>
               </w:rPr>
-              <w:t>01:17</w:t>
+              <w:t>01:17; briefing 6</w:t>
             </w:r>
           </w:p>
         </w:tc>
@@ -1319,7 +1592,54 @@
       <w:tr>
         <w:tc>
           <w:tcPr>
-            <w:tcW w:type="dxa" w:w="1984"/>
+            <w:tcW w:type="dxa" w:w="1871"/>
+          </w:tcPr>
+          <w:p>
+            <w:r/>
+            <w:r>
+              <w:rPr>
+                <w:b w:val="0"/>
+                <w:sz w:val="20"/>
+              </w:rPr>
+              <w:t>CITAX</w:t>
+            </w:r>
+          </w:p>
+        </w:tc>
+        <w:tc>
+          <w:tcPr>
+            <w:tcW w:type="dxa" w:w="5783"/>
+          </w:tcPr>
+          <w:p>
+            <w:r/>
+            <w:r>
+              <w:rPr>
+                <w:b w:val="0"/>
+                <w:sz w:val="20"/>
+              </w:rPr>
+              <w:t>Em avaliação para captura e apuração fiscal</w:t>
+            </w:r>
+          </w:p>
+        </w:tc>
+        <w:tc>
+          <w:tcPr>
+            <w:tcW w:type="dxa" w:w="1417"/>
+          </w:tcPr>
+          <w:p>
+            <w:r/>
+            <w:r>
+              <w:rPr>
+                <w:b w:val="0"/>
+                <w:sz w:val="20"/>
+              </w:rPr>
+              <w:t>briefing 6</w:t>
+            </w:r>
+          </w:p>
+        </w:tc>
+      </w:tr>
+      <w:tr>
+        <w:tc>
+          <w:tcPr>
+            <w:tcW w:type="dxa" w:w="1871"/>
           </w:tcPr>
           <w:p>
             <w:r/>
@@ -1334,7 +1654,7 @@
         </w:tc>
         <w:tc>
           <w:tcPr>
-            <w:tcW w:type="dxa" w:w="5669"/>
+            <w:tcW w:type="dxa" w:w="5783"/>
           </w:tcPr>
           <w:p>
             <w:r/>
@@ -1343,7 +1663,7 @@
                 <w:b w:val="0"/>
                 <w:sz w:val="20"/>
               </w:rPr>
-              <w:t>Operação dos clientes do financeiro: conciliação bancária, extratos, plano de contas personalizado. A emissão de nota a partir da conciliação ainda não foi configurada</w:t>
+              <w:t>Dados financeiros dos clientes de BPO, conciliação; emissão de nota pela conciliação não configurada</w:t>
             </w:r>
           </w:p>
         </w:tc>
@@ -1358,7 +1678,7 @@
                 <w:b w:val="0"/>
                 <w:sz w:val="20"/>
               </w:rPr>
-              <w:t>01:20, 00:40</w:t>
+              <w:t>00:40, 01:20; briefing 6</w:t>
             </w:r>
           </w:p>
         </w:tc>
@@ -1366,7 +1686,7 @@
       <w:tr>
         <w:tc>
           <w:tcPr>
-            <w:tcW w:type="dxa" w:w="1984"/>
+            <w:tcW w:type="dxa" w:w="1871"/>
           </w:tcPr>
           <w:p>
             <w:r/>
@@ -1375,13 +1695,13 @@
                 <w:b w:val="0"/>
                 <w:sz w:val="20"/>
               </w:rPr>
-              <w:t>Plataforma de atendimento (WhatsApp)</w:t>
+              <w:t>Jusbrasil</w:t>
             </w:r>
           </w:p>
         </w:tc>
         <w:tc>
           <w:tcPr>
-            <w:tcW w:type="dxa" w:w="5669"/>
+            <w:tcW w:type="dxa" w:w="5783"/>
           </w:tcPr>
           <w:p>
             <w:r/>
@@ -1390,7 +1710,7 @@
                 <w:b w:val="0"/>
                 <w:sz w:val="20"/>
               </w:rPr>
-              <w:t>Número único com vários usuários; a Júlia recebe e distribui as conversas para a equipe [CONFIRMAR se é o NetsApp citado no briefing]</w:t>
+              <w:t>IA jurídica e modelos; monitoramento de processos não configurado</w:t>
             </w:r>
           </w:p>
         </w:tc>
@@ -1405,7 +1725,7 @@
                 <w:b w:val="0"/>
                 <w:sz w:val="20"/>
               </w:rPr>
-              <w:t>01:54 a 01:55</w:t>
+              <w:t>01:43</w:t>
             </w:r>
           </w:p>
         </w:tc>
@@ -1413,7 +1733,7 @@
       <w:tr>
         <w:tc>
           <w:tcPr>
-            <w:tcW w:type="dxa" w:w="1984"/>
+            <w:tcW w:type="dxa" w:w="1871"/>
           </w:tcPr>
           <w:p>
             <w:r/>
@@ -1422,13 +1742,13 @@
                 <w:b w:val="0"/>
                 <w:sz w:val="20"/>
               </w:rPr>
-              <w:t>Jusbrasil</w:t>
+              <w:t>Canva e PowerPoint</w:t>
             </w:r>
           </w:p>
         </w:tc>
         <w:tc>
           <w:tcPr>
-            <w:tcW w:type="dxa" w:w="5669"/>
+            <w:tcW w:type="dxa" w:w="5783"/>
           </w:tcPr>
           <w:p>
             <w:r/>
@@ -1437,7 +1757,7 @@
                 <w:b w:val="0"/>
                 <w:sz w:val="20"/>
               </w:rPr>
-              <w:t>IA jurídica e modelos de petição; o monitoramento automático dos processos ainda não foi configurado</w:t>
+              <w:t>Propostas comerciais (Canva) e apresentações de fechamento mensal (PowerPoint)</w:t>
             </w:r>
           </w:p>
         </w:tc>
@@ -1452,7 +1772,7 @@
                 <w:b w:val="0"/>
                 <w:sz w:val="20"/>
               </w:rPr>
-              <w:t>01:43 a 01:44</w:t>
+              <w:t>01:22; briefing 6</w:t>
             </w:r>
           </w:p>
         </w:tc>
@@ -1460,7 +1780,7 @@
       <w:tr>
         <w:tc>
           <w:tcPr>
-            <w:tcW w:type="dxa" w:w="1984"/>
+            <w:tcW w:type="dxa" w:w="1871"/>
           </w:tcPr>
           <w:p>
             <w:r/>
@@ -1469,13 +1789,13 @@
                 <w:b w:val="0"/>
                 <w:sz w:val="20"/>
               </w:rPr>
-              <w:t>Canva</w:t>
+              <w:t>Claude e Lovable</w:t>
             </w:r>
           </w:p>
         </w:tc>
         <w:tc>
           <w:tcPr>
-            <w:tcW w:type="dxa" w:w="5669"/>
+            <w:tcW w:type="dxa" w:w="5783"/>
           </w:tcPr>
           <w:p>
             <w:r/>
@@ -1484,7 +1804,7 @@
                 <w:b w:val="0"/>
                 <w:sz w:val="20"/>
               </w:rPr>
-              <w:t>Modelos de proposta comercial preenchidos pela Júlia</w:t>
+              <w:t>Testes da Thamires no fechamento financeiro (5 h no primeiro, 1 a 2 h nos últimos), em conta ligada ao e-mail antigo (RT). Plano: ambiente novo da Surcin (Claude Team)</w:t>
             </w:r>
           </w:p>
         </w:tc>
@@ -1499,101 +1819,7 @@
                 <w:b w:val="0"/>
                 <w:sz w:val="20"/>
               </w:rPr>
-              <w:t>01:22</w:t>
-            </w:r>
-          </w:p>
-        </w:tc>
-      </w:tr>
-      <w:tr>
-        <w:tc>
-          <w:tcPr>
-            <w:tcW w:type="dxa" w:w="1984"/>
-          </w:tcPr>
-          <w:p>
-            <w:r/>
-            <w:r>
-              <w:rPr>
-                <w:b w:val="0"/>
-                <w:sz w:val="20"/>
-              </w:rPr>
-              <w:t>Claude e Lovable</w:t>
-            </w:r>
-          </w:p>
-        </w:tc>
-        <w:tc>
-          <w:tcPr>
-            <w:tcW w:type="dxa" w:w="5669"/>
-          </w:tcPr>
-          <w:p>
-            <w:r/>
-            <w:r>
-              <w:rPr>
-                <w:b w:val="0"/>
-                <w:sz w:val="20"/>
-              </w:rPr>
-              <w:t>Usados pela Thamires para o fechamento financeiro: o primeiro levou 5 horas, os últimos de 1 a 2 horas, refinando o prompt a cada mês</w:t>
-            </w:r>
-          </w:p>
-        </w:tc>
-        <w:tc>
-          <w:tcPr>
-            <w:tcW w:type="dxa" w:w="1417"/>
-          </w:tcPr>
-          <w:p>
-            <w:r/>
-            <w:r>
-              <w:rPr>
-                <w:b w:val="0"/>
-                <w:sz w:val="20"/>
-              </w:rPr>
-              <w:t>00:33 a 00:35</w:t>
-            </w:r>
-          </w:p>
-        </w:tc>
-      </w:tr>
-      <w:tr>
-        <w:tc>
-          <w:tcPr>
-            <w:tcW w:type="dxa" w:w="1984"/>
-          </w:tcPr>
-          <w:p>
-            <w:r/>
-            <w:r>
-              <w:rPr>
-                <w:b w:val="0"/>
-                <w:sz w:val="20"/>
-              </w:rPr>
-              <w:t>ChatGPT</w:t>
-            </w:r>
-          </w:p>
-        </w:tc>
-        <w:tc>
-          <w:tcPr>
-            <w:tcW w:type="dxa" w:w="5669"/>
-          </w:tcPr>
-          <w:p>
-            <w:r/>
-            <w:r>
-              <w:rPr>
-                <w:b w:val="0"/>
-                <w:sz w:val="20"/>
-              </w:rPr>
-              <w:t>Usado pela Júlia no atendimento</w:t>
-            </w:r>
-          </w:p>
-        </w:tc>
-        <w:tc>
-          <w:tcPr>
-            <w:tcW w:type="dxa" w:w="1417"/>
-          </w:tcPr>
-          <w:p>
-            <w:r/>
-            <w:r>
-              <w:rPr>
-                <w:b w:val="0"/>
-                <w:sz w:val="20"/>
-              </w:rPr>
-              <w:t>01:55</w:t>
+              <w:t>00:33, 00:59; briefing 12</w:t>
             </w:r>
           </w:p>
         </w:tc>
@@ -1601,27 +1827,11 @@
     </w:tbl>
     <w:p/>
     <w:p>
-      <w:r>
-        <w:rPr>
-          <w:i w:val="0"/>
-        </w:rPr>
-        <w:t>Ela quer recriar as contas (e-mail, nuvem, Trello, Claude, Lovable) do zero no novo domínio da Surcin, porque o pacote antigo vai expirar (00:59 a 01:00, 02:10).</w:t>
-      </w:r>
-    </w:p>
-    <w:p>
       <w:pPr>
         <w:pStyle w:val="Heading1"/>
       </w:pPr>
       <w:r>
-        <w:t>5. Processos que já existem</w:t>
-      </w:r>
-    </w:p>
-    <w:p>
-      <w:r>
-        <w:rPr>
-          <w:i w:val="0"/>
-        </w:rPr>
-        <w:t>Processos citados com algum nível de documentação (passo a passo, checklist ou rotina no Trello):</w:t>
+        <w:t>5. Processos identificados</w:t>
       </w:r>
     </w:p>
     <w:tbl>
@@ -1657,7 +1867,7 @@
         </w:tc>
         <w:tc>
           <w:tcPr>
-            <w:tcW w:type="dxa" w:w="3515"/>
+            <w:tcW w:type="dxa" w:w="3628"/>
             <w:shd w:val="clear" w:color="auto" w:fill="1F3A5F"/>
           </w:tcPr>
           <w:p>
@@ -1674,7 +1884,7 @@
         </w:tc>
         <w:tc>
           <w:tcPr>
-            <w:tcW w:type="dxa" w:w="1984"/>
+            <w:tcW w:type="dxa" w:w="1871"/>
             <w:shd w:val="clear" w:color="auto" w:fill="1F3A5F"/>
           </w:tcPr>
           <w:p>
@@ -1702,7 +1912,7 @@
                 <w:color w:val="FFFFFF"/>
                 <w:sz w:val="20"/>
               </w:rPr>
-              <w:t>Situação descrita</w:t>
+              <w:t>Situação</w:t>
             </w:r>
           </w:p>
         </w:tc>
@@ -1725,7 +1935,7 @@
         </w:tc>
         <w:tc>
           <w:tcPr>
-            <w:tcW w:type="dxa" w:w="3515"/>
+            <w:tcW w:type="dxa" w:w="3628"/>
           </w:tcPr>
           <w:p>
             <w:r/>
@@ -1734,13 +1944,13 @@
                 <w:b w:val="0"/>
                 <w:sz w:val="20"/>
               </w:rPr>
-              <w:t>Atendimento e triagem de demandas</w:t>
+              <w:t>Atendimento e triagem de demandas (WhatsApp, Nestzap, Veri)</w:t>
             </w:r>
           </w:p>
         </w:tc>
         <w:tc>
           <w:tcPr>
-            <w:tcW w:type="dxa" w:w="1984"/>
+            <w:tcW w:type="dxa" w:w="1871"/>
           </w:tcPr>
           <w:p>
             <w:r/>
@@ -1764,7 +1974,7 @@
                 <w:b w:val="0"/>
                 <w:sz w:val="20"/>
               </w:rPr>
-              <w:t>Funciona, mas concentra tudo nela</w:t>
+              <w:t>Pedidos podem se perder em grupos e planilhas</w:t>
             </w:r>
           </w:p>
         </w:tc>
@@ -1787,7 +1997,7 @@
         </w:tc>
         <w:tc>
           <w:tcPr>
-            <w:tcW w:type="dxa" w:w="3515"/>
+            <w:tcW w:type="dxa" w:w="3628"/>
           </w:tcPr>
           <w:p>
             <w:r/>
@@ -1796,13 +2006,13 @@
                 <w:b w:val="0"/>
                 <w:sz w:val="20"/>
               </w:rPr>
-              <w:t>Comercial: primeiro atendimento, checklist, proposta, reunião</w:t>
+              <w:t>Comercial: primeiro atendimento, proposta, reunião, contrato</w:t>
             </w:r>
           </w:p>
         </w:tc>
         <w:tc>
           <w:tcPr>
-            <w:tcW w:type="dxa" w:w="1984"/>
+            <w:tcW w:type="dxa" w:w="1871"/>
           </w:tcPr>
           <w:p>
             <w:r/>
@@ -1826,7 +2036,7 @@
                 <w:b w:val="0"/>
                 <w:sz w:val="20"/>
               </w:rPr>
-              <w:t>Checklist e modelos prontos</w:t>
+              <w:t>Checklist e modelos prontos; retomada em 2027</w:t>
             </w:r>
           </w:p>
         </w:tc>
@@ -1849,7 +2059,7 @@
         </w:tc>
         <w:tc>
           <w:tcPr>
-            <w:tcW w:type="dxa" w:w="3515"/>
+            <w:tcW w:type="dxa" w:w="3628"/>
           </w:tcPr>
           <w:p>
             <w:r/>
@@ -1858,75 +2068,13 @@
                 <w:b w:val="0"/>
                 <w:sz w:val="20"/>
               </w:rPr>
-              <w:t>Implantação de novo cliente de contabilidade</w:t>
+              <w:t>Implantação de novo cliente (contábil e financeiro)</w:t>
             </w:r>
           </w:p>
         </w:tc>
         <w:tc>
           <w:tcPr>
-            <w:tcW w:type="dxa" w:w="1984"/>
-          </w:tcPr>
-          <w:p>
-            <w:r/>
-            <w:r>
-              <w:rPr>
-                <w:b w:val="0"/>
-                <w:sz w:val="20"/>
-              </w:rPr>
-              <w:t>Júlia</w:t>
-            </w:r>
-          </w:p>
-        </w:tc>
-        <w:tc>
-          <w:tcPr>
-            <w:tcW w:type="dxa" w:w="3118"/>
-          </w:tcPr>
-          <w:p>
-            <w:r/>
-            <w:r>
-              <w:rPr>
-                <w:b w:val="0"/>
-                <w:sz w:val="20"/>
-              </w:rPr>
-              <w:t>Checklist pronto; precisa de atualização</w:t>
-            </w:r>
-          </w:p>
-        </w:tc>
-      </w:tr>
-      <w:tr>
-        <w:tc>
-          <w:tcPr>
-            <w:tcW w:type="dxa" w:w="454"/>
-          </w:tcPr>
-          <w:p>
-            <w:r/>
-            <w:r>
-              <w:rPr>
-                <w:b w:val="0"/>
-                <w:sz w:val="20"/>
-              </w:rPr>
-              <w:t>4</w:t>
-            </w:r>
-          </w:p>
-        </w:tc>
-        <w:tc>
-          <w:tcPr>
-            <w:tcW w:type="dxa" w:w="3515"/>
-          </w:tcPr>
-          <w:p>
-            <w:r/>
-            <w:r>
-              <w:rPr>
-                <w:b w:val="0"/>
-                <w:sz w:val="20"/>
-              </w:rPr>
-              <w:t>Implantação de novo cliente de financeiro</w:t>
-            </w:r>
-          </w:p>
-        </w:tc>
-        <w:tc>
-          <w:tcPr>
-            <w:tcW w:type="dxa" w:w="1984"/>
+            <w:tcW w:type="dxa" w:w="1871"/>
           </w:tcPr>
           <w:p>
             <w:r/>
@@ -1950,7 +2098,7 @@
                 <w:b w:val="0"/>
                 <w:sz w:val="20"/>
               </w:rPr>
-              <w:t>Checklist pronto; inclui planilha, Trello e Conta Azul</w:t>
+              <w:t>Checklists prontos, a atualizar</w:t>
             </w:r>
           </w:p>
         </w:tc>
@@ -1967,13 +2115,13 @@
                 <w:b w:val="0"/>
                 <w:sz w:val="20"/>
               </w:rPr>
-              <w:t>5</w:t>
+              <w:t>4</w:t>
             </w:r>
           </w:p>
         </w:tc>
         <w:tc>
           <w:tcPr>
-            <w:tcW w:type="dxa" w:w="3515"/>
+            <w:tcW w:type="dxa" w:w="3628"/>
           </w:tcPr>
           <w:p>
             <w:r/>
@@ -1982,13 +2130,13 @@
                 <w:b w:val="0"/>
                 <w:sz w:val="20"/>
               </w:rPr>
-              <w:t>Abertura de empresa (societário)</w:t>
+              <w:t>Abertura, alteração e baixa de empresas</w:t>
             </w:r>
           </w:p>
         </w:tc>
         <w:tc>
           <w:tcPr>
-            <w:tcW w:type="dxa" w:w="1984"/>
+            <w:tcW w:type="dxa" w:w="1871"/>
           </w:tcPr>
           <w:p>
             <w:r/>
@@ -2029,13 +2177,13 @@
                 <w:b w:val="0"/>
                 <w:sz w:val="20"/>
               </w:rPr>
-              <w:t>6</w:t>
+              <w:t>5</w:t>
             </w:r>
           </w:p>
         </w:tc>
         <w:tc>
           <w:tcPr>
-            <w:tcW w:type="dxa" w:w="3515"/>
+            <w:tcW w:type="dxa" w:w="3628"/>
           </w:tcPr>
           <w:p>
             <w:r/>
@@ -2044,13 +2192,13 @@
                 <w:b w:val="0"/>
                 <w:sz w:val="20"/>
               </w:rPr>
-              <w:t>Fiscal mensal: XML, apuração, guia, recibos, envio ao cliente</w:t>
+              <w:t>Fiscal mensal: captura, conferência de cadastro e tributação, apuração, guia, envio, evidência</w:t>
             </w:r>
           </w:p>
         </w:tc>
         <w:tc>
           <w:tcPr>
-            <w:tcW w:type="dxa" w:w="1984"/>
+            <w:tcW w:type="dxa" w:w="1871"/>
           </w:tcPr>
           <w:p>
             <w:r/>
@@ -2074,7 +2222,69 @@
                 <w:b w:val="0"/>
                 <w:sz w:val="20"/>
               </w:rPr>
-              <w:t>Feito fora do Domínio; maior risco (erro de agosto)</w:t>
+              <w:t>Maior risco: erros de parâmetro (ISS, regime, Fator R)</w:t>
+            </w:r>
+          </w:p>
+        </w:tc>
+      </w:tr>
+      <w:tr>
+        <w:tc>
+          <w:tcPr>
+            <w:tcW w:type="dxa" w:w="454"/>
+          </w:tcPr>
+          <w:p>
+            <w:r/>
+            <w:r>
+              <w:rPr>
+                <w:b w:val="0"/>
+                <w:sz w:val="20"/>
+              </w:rPr>
+              <w:t>6</w:t>
+            </w:r>
+          </w:p>
+        </w:tc>
+        <w:tc>
+          <w:tcPr>
+            <w:tcW w:type="dxa" w:w="3628"/>
+          </w:tcPr>
+          <w:p>
+            <w:r/>
+            <w:r>
+              <w:rPr>
+                <w:b w:val="0"/>
+                <w:sz w:val="20"/>
+              </w:rPr>
+              <w:t>Recebimento e conferência do trabalho contábil terceirizado</w:t>
+            </w:r>
+          </w:p>
+        </w:tc>
+        <w:tc>
+          <w:tcPr>
+            <w:tcW w:type="dxa" w:w="1871"/>
+          </w:tcPr>
+          <w:p>
+            <w:r/>
+            <w:r>
+              <w:rPr>
+                <w:b w:val="0"/>
+                <w:sz w:val="20"/>
+              </w:rPr>
+              <w:t>A definir</w:t>
+            </w:r>
+          </w:p>
+        </w:tc>
+        <w:tc>
+          <w:tcPr>
+            <w:tcW w:type="dxa" w:w="3118"/>
+          </w:tcPr>
+          <w:p>
+            <w:r/>
+            <w:r>
+              <w:rPr>
+                <w:b w:val="0"/>
+                <w:sz w:val="20"/>
+              </w:rPr>
+              <w:t>Citado no briefing; fluxo não documentado</w:t>
             </w:r>
           </w:p>
         </w:tc>
@@ -2097,7 +2307,7 @@
         </w:tc>
         <w:tc>
           <w:tcPr>
-            <w:tcW w:type="dxa" w:w="3515"/>
+            <w:tcW w:type="dxa" w:w="3628"/>
           </w:tcPr>
           <w:p>
             <w:r/>
@@ -2106,13 +2316,13 @@
                 <w:b w:val="0"/>
                 <w:sz w:val="20"/>
               </w:rPr>
-              <w:t>Pagamentos dos clientes do financeiro (terças e sextas)</w:t>
+              <w:t>Pedidos de pagamento e pagamentos dos clientes de BPO</w:t>
             </w:r>
           </w:p>
         </w:tc>
         <w:tc>
           <w:tcPr>
-            <w:tcW w:type="dxa" w:w="1984"/>
+            <w:tcW w:type="dxa" w:w="1871"/>
           </w:tcPr>
           <w:p>
             <w:r/>
@@ -2136,7 +2346,7 @@
                 <w:b w:val="0"/>
                 <w:sz w:val="20"/>
               </w:rPr>
-              <w:t>Informações de pagamentos fixos desorganizadas em parte dos clientes</w:t>
+              <w:t>Pedidos chegam por WhatsApp; risco de guia do cliente errado</w:t>
             </w:r>
           </w:p>
         </w:tc>
@@ -2159,7 +2369,7 @@
         </w:tc>
         <w:tc>
           <w:tcPr>
-            <w:tcW w:type="dxa" w:w="3515"/>
+            <w:tcW w:type="dxa" w:w="3628"/>
           </w:tcPr>
           <w:p>
             <w:r/>
@@ -2174,7 +2384,7 @@
         </w:tc>
         <w:tc>
           <w:tcPr>
-            <w:tcW w:type="dxa" w:w="1984"/>
+            <w:tcW w:type="dxa" w:w="1871"/>
           </w:tcPr>
           <w:p>
             <w:r/>
@@ -2221,7 +2431,7 @@
         </w:tc>
         <w:tc>
           <w:tcPr>
-            <w:tcW w:type="dxa" w:w="3515"/>
+            <w:tcW w:type="dxa" w:w="3628"/>
           </w:tcPr>
           <w:p>
             <w:r/>
@@ -2236,7 +2446,7 @@
         </w:tc>
         <w:tc>
           <w:tcPr>
-            <w:tcW w:type="dxa" w:w="1984"/>
+            <w:tcW w:type="dxa" w:w="1871"/>
           </w:tcPr>
           <w:p>
             <w:r/>
@@ -2260,7 +2470,7 @@
                 <w:b w:val="0"/>
                 <w:sz w:val="20"/>
               </w:rPr>
-              <w:t>Conciliação concentrada no fim do mês; cerca de 15 reuniões de 1 a 2 h na primeira semana</w:t>
+              <w:t>Conciliação passando a semanal; mais de 10 reuniões na semana do fechamento; promessa de formato mais interativo</w:t>
             </w:r>
           </w:p>
         </w:tc>
@@ -2283,7 +2493,7 @@
         </w:tc>
         <w:tc>
           <w:tcPr>
-            <w:tcW w:type="dxa" w:w="3515"/>
+            <w:tcW w:type="dxa" w:w="3628"/>
           </w:tcPr>
           <w:p>
             <w:r/>
@@ -2292,13 +2502,13 @@
                 <w:b w:val="0"/>
                 <w:sz w:val="20"/>
               </w:rPr>
-              <w:t>Folha e rotinas de DP</w:t>
+              <w:t>Folha, admissões, rescisões, eSocial</w:t>
             </w:r>
           </w:p>
         </w:tc>
         <w:tc>
           <w:tcPr>
-            <w:tcW w:type="dxa" w:w="1984"/>
+            <w:tcW w:type="dxa" w:w="1871"/>
           </w:tcPr>
           <w:p>
             <w:r/>
@@ -2322,7 +2532,7 @@
                 <w:b w:val="0"/>
                 <w:sz w:val="20"/>
               </w:rPr>
-              <w:t>Volume baixo; pendências antigas a organizar</w:t>
+              <w:t>Volume baixo; pendências antigas</w:t>
             </w:r>
           </w:p>
         </w:tc>
@@ -2345,7 +2555,7 @@
         </w:tc>
         <w:tc>
           <w:tcPr>
-            <w:tcW w:type="dxa" w:w="3515"/>
+            <w:tcW w:type="dxa" w:w="3628"/>
           </w:tcPr>
           <w:p>
             <w:r/>
@@ -2360,7 +2570,7 @@
         </w:tc>
         <w:tc>
           <w:tcPr>
-            <w:tcW w:type="dxa" w:w="1984"/>
+            <w:tcW w:type="dxa" w:w="1871"/>
           </w:tcPr>
           <w:p>
             <w:r/>
@@ -2384,7 +2594,69 @@
                 <w:b w:val="0"/>
                 <w:sz w:val="20"/>
               </w:rPr>
-              <w:t>Revisão manual de todos os processos</w:t>
+              <w:t>Revisão manual</w:t>
+            </w:r>
+          </w:p>
+        </w:tc>
+      </w:tr>
+      <w:tr>
+        <w:tc>
+          <w:tcPr>
+            <w:tcW w:type="dxa" w:w="454"/>
+          </w:tcPr>
+          <w:p>
+            <w:r/>
+            <w:r>
+              <w:rPr>
+                <w:b w:val="0"/>
+                <w:sz w:val="20"/>
+              </w:rPr>
+              <w:t>12</w:t>
+            </w:r>
+          </w:p>
+        </w:tc>
+        <w:tc>
+          <w:tcPr>
+            <w:tcW w:type="dxa" w:w="3628"/>
+          </w:tcPr>
+          <w:p>
+            <w:r/>
+            <w:r>
+              <w:rPr>
+                <w:b w:val="0"/>
+                <w:sz w:val="20"/>
+              </w:rPr>
+              <w:t>Rotinas transversais: EFD-Reinf, IRPF, parcelamentos</w:t>
+            </w:r>
+          </w:p>
+        </w:tc>
+        <w:tc>
+          <w:tcPr>
+            <w:tcW w:type="dxa" w:w="1871"/>
+          </w:tcPr>
+          <w:p>
+            <w:r/>
+            <w:r>
+              <w:rPr>
+                <w:b w:val="0"/>
+                <w:sz w:val="20"/>
+              </w:rPr>
+              <w:t>A definir</w:t>
+            </w:r>
+          </w:p>
+        </w:tc>
+        <w:tc>
+          <w:tcPr>
+            <w:tcW w:type="dxa" w:w="3118"/>
+          </w:tcPr>
+          <w:p>
+            <w:r/>
+            <w:r>
+              <w:rPr>
+                <w:b w:val="0"/>
+                <w:sz w:val="20"/>
+              </w:rPr>
+              <w:t>Citadas no briefing</w:t>
             </w:r>
           </w:p>
         </w:tc>
@@ -2396,7 +2668,7 @@
         <w:pStyle w:val="Heading1"/>
       </w:pPr>
       <w:r>
-        <w:t>6. Dores, objetivos e expectativas</w:t>
+        <w:t>6. Dores e riscos</w:t>
       </w:r>
     </w:p>
     <w:tbl>
@@ -2425,7 +2697,7 @@
                 <w:color w:val="FFFFFF"/>
                 <w:sz w:val="20"/>
               </w:rPr>
-              <w:t>Dor ou objetivo (palavras dela)</w:t>
+              <w:t>Dor ou risco</w:t>
             </w:r>
           </w:p>
         </w:tc>
@@ -2476,7 +2748,7 @@
                 <w:b w:val="0"/>
                 <w:sz w:val="20"/>
               </w:rPr>
-              <w:t>"Tudo tá centralizado em mim. Eu não tenho o direito de ficar doente."</w:t>
+              <w:t>"Tudo tá centralizado em mim. Eu não tenho o direito de ficar doente." Dúvidas e revisões sobem para a Thamires</w:t>
             </w:r>
           </w:p>
         </w:tc>
@@ -2506,7 +2778,7 @@
                 <w:b w:val="0"/>
                 <w:sz w:val="20"/>
               </w:rPr>
-              <w:t>00:18</w:t>
+              <w:t>00:18; briefing 4.3</w:t>
             </w:r>
           </w:p>
         </w:tc>
@@ -2523,7 +2795,7 @@
                 <w:b w:val="0"/>
                 <w:sz w:val="20"/>
               </w:rPr>
-              <w:t>Revisar e corrigir tudo; dúvidas simples da equipe chegam a ela</w:t>
+              <w:t>ISS tratado como devido a outro município por várias competências: retificações, impacto de cerca de R$ 10 mil (guia de cerca de R$ 5 mil numa etapa) e cliente perdido</w:t>
             </w:r>
           </w:p>
         </w:tc>
@@ -2538,7 +2810,7 @@
                 <w:b w:val="0"/>
                 <w:sz w:val="20"/>
               </w:rPr>
-              <w:t>Todas</w:t>
+              <w:t>Fiscal</w:t>
             </w:r>
           </w:p>
         </w:tc>
@@ -2553,7 +2825,7 @@
                 <w:b w:val="0"/>
                 <w:sz w:val="20"/>
               </w:rPr>
-              <w:t>00:15, 00:39, 01:27</w:t>
+              <w:t>00:26 a 00:29; briefing 4.1</w:t>
             </w:r>
           </w:p>
         </w:tc>
@@ -2570,7 +2842,7 @@
                 <w:b w:val="0"/>
                 <w:sz w:val="20"/>
               </w:rPr>
-              <w:t>Erro de configuração no Domínio: imposto recolhido errado, multa, cerca de R$ 10 mil e um cliente perdido</w:t>
+              <w:t>Cadastro municipal como regime normal em vez de Simples; nutricionistas com Anexo/Fator R inadequado; DCTF sem movimento não transmitidas; taxas municipais esquecidas</w:t>
             </w:r>
           </w:p>
         </w:tc>
@@ -2585,7 +2857,7 @@
                 <w:b w:val="0"/>
                 <w:sz w:val="20"/>
               </w:rPr>
-              <w:t>Contabilidade</w:t>
+              <w:t>Fiscal</w:t>
             </w:r>
           </w:p>
         </w:tc>
@@ -2600,7 +2872,7 @@
                 <w:b w:val="0"/>
                 <w:sz w:val="20"/>
               </w:rPr>
-              <w:t>00:26 a 00:29</w:t>
+              <w:t>briefing 4.1</w:t>
             </w:r>
           </w:p>
         </w:tc>
@@ -2617,7 +2889,7 @@
                 <w:b w:val="0"/>
                 <w:sz w:val="20"/>
               </w:rPr>
-              <w:t>Contabilidade sem responsável desde a saída da contadora</w:t>
+              <w:t>Guia de um cliente salva na pasta de outro, encontrada pelo Financeiro na hora de pagar</w:t>
             </w:r>
           </w:p>
         </w:tc>
@@ -2632,7 +2904,7 @@
                 <w:b w:val="0"/>
                 <w:sz w:val="20"/>
               </w:rPr>
-              <w:t>Contabilidade</w:t>
+              <w:t>Documentos e pagamentos</w:t>
             </w:r>
           </w:p>
         </w:tc>
@@ -2647,7 +2919,7 @@
                 <w:b w:val="0"/>
                 <w:sz w:val="20"/>
               </w:rPr>
-              <w:t>00:30</w:t>
+              <w:t>briefing 4.2</w:t>
             </w:r>
           </w:p>
         </w:tc>
@@ -2664,7 +2936,54 @@
                 <w:b w:val="0"/>
                 <w:sz w:val="20"/>
               </w:rPr>
-              <w:t>Fechamento financeiro lento: conciliação no fim do mês, reuniões só na segunda ou terceira semana</w:t>
+              <w:t>Trello marcado como concluído sem documento, ou documento sem cartão atualizado</w:t>
+            </w:r>
+          </w:p>
+        </w:tc>
+        <w:tc>
+          <w:tcPr>
+            <w:tcW w:type="dxa" w:w="1701"/>
+          </w:tcPr>
+          <w:p>
+            <w:r/>
+            <w:r>
+              <w:rPr>
+                <w:b w:val="0"/>
+                <w:sz w:val="20"/>
+              </w:rPr>
+              <w:t>Controle</w:t>
+            </w:r>
+          </w:p>
+        </w:tc>
+        <w:tc>
+          <w:tcPr>
+            <w:tcW w:type="dxa" w:w="1701"/>
+          </w:tcPr>
+          <w:p>
+            <w:r/>
+            <w:r>
+              <w:rPr>
+                <w:b w:val="0"/>
+                <w:sz w:val="20"/>
+              </w:rPr>
+              <w:t>briefing 4.3</w:t>
+            </w:r>
+          </w:p>
+        </w:tc>
+      </w:tr>
+      <w:tr>
+        <w:tc>
+          <w:tcPr>
+            <w:tcW w:type="dxa" w:w="5669"/>
+          </w:tcPr>
+          <w:p>
+            <w:r/>
+            <w:r>
+              <w:rPr>
+                <w:b w:val="0"/>
+                <w:sz w:val="20"/>
+              </w:rPr>
+              <w:t>Fechamento financeiro concentrado no fim do mês e reuniões de resultado atrasadas</w:t>
             </w:r>
           </w:p>
         </w:tc>
@@ -2694,7 +3013,7 @@
                 <w:b w:val="0"/>
                 <w:sz w:val="20"/>
               </w:rPr>
-              <w:t>01:31 a 01:32</w:t>
+              <w:t>01:31</w:t>
             </w:r>
           </w:p>
         </w:tc>
@@ -2758,101 +3077,7 @@
                 <w:b w:val="0"/>
                 <w:sz w:val="20"/>
               </w:rPr>
-              <w:t>Ter tempo para estudar para a prova de 13/12</w:t>
-            </w:r>
-          </w:p>
-        </w:tc>
-        <w:tc>
-          <w:tcPr>
-            <w:tcW w:type="dxa" w:w="1701"/>
-          </w:tcPr>
-          <w:p>
-            <w:r/>
-            <w:r>
-              <w:rPr>
-                <w:b w:val="0"/>
-                <w:sz w:val="20"/>
-              </w:rPr>
-              <w:t>Pessoal</w:t>
-            </w:r>
-          </w:p>
-        </w:tc>
-        <w:tc>
-          <w:tcPr>
-            <w:tcW w:type="dxa" w:w="1701"/>
-          </w:tcPr>
-          <w:p>
-            <w:r/>
-            <w:r>
-              <w:rPr>
-                <w:b w:val="0"/>
-                <w:sz w:val="20"/>
-              </w:rPr>
-              <w:t>00:36, 02:14</w:t>
-            </w:r>
-          </w:p>
-        </w:tc>
-      </w:tr>
-      <w:tr>
-        <w:tc>
-          <w:tcPr>
-            <w:tcW w:type="dxa" w:w="5669"/>
-          </w:tcPr>
-          <w:p>
-            <w:r/>
-            <w:r>
-              <w:rPr>
-                <w:b w:val="0"/>
-                <w:sz w:val="20"/>
-              </w:rPr>
-              <w:t>Equipe com mais autonomia</w:t>
-            </w:r>
-          </w:p>
-        </w:tc>
-        <w:tc>
-          <w:tcPr>
-            <w:tcW w:type="dxa" w:w="1701"/>
-          </w:tcPr>
-          <w:p>
-            <w:r/>
-            <w:r>
-              <w:rPr>
-                <w:b w:val="0"/>
-                <w:sz w:val="20"/>
-              </w:rPr>
-              <w:t>Gestão</w:t>
-            </w:r>
-          </w:p>
-        </w:tc>
-        <w:tc>
-          <w:tcPr>
-            <w:tcW w:type="dxa" w:w="1701"/>
-          </w:tcPr>
-          <w:p>
-            <w:r/>
-            <w:r>
-              <w:rPr>
-                <w:b w:val="0"/>
-                <w:sz w:val="20"/>
-              </w:rPr>
-              <w:t>00:44</w:t>
-            </w:r>
-          </w:p>
-        </w:tc>
-      </w:tr>
-      <w:tr>
-        <w:tc>
-          <w:tcPr>
-            <w:tcW w:type="dxa" w:w="5669"/>
-          </w:tcPr>
-          <w:p>
-            <w:r/>
-            <w:r>
-              <w:rPr>
-                <w:b w:val="0"/>
-                <w:sz w:val="20"/>
-              </w:rPr>
-              <w:t>Avaliar a produtividade individual e criar uma remuneração variável por pontos</w:t>
+              <w:t>Avaliar desempenho individual e criar premiação por pontos, com revisão trabalhista</w:t>
             </w:r>
           </w:p>
         </w:tc>
@@ -2882,7 +3107,7 @@
                 <w:b w:val="0"/>
                 <w:sz w:val="20"/>
               </w:rPr>
-              <w:t>00:46, 01:57, 02:21</w:t>
+              <w:t>00:46, 02:21; briefing 10</w:t>
             </w:r>
           </w:p>
         </w:tc>
@@ -2899,7 +3124,7 @@
                 <w:b w:val="0"/>
                 <w:sz w:val="20"/>
               </w:rPr>
-              <w:t>Retomar o comercial (tráfego pago, possível agente de WhatsApp/CRM), sem atendimento robotizado</w:t>
+              <w:t>Ter tempo para estudar até 13/12</w:t>
             </w:r>
           </w:p>
         </w:tc>
@@ -2914,7 +3139,7 @@
                 <w:b w:val="0"/>
                 <w:sz w:val="20"/>
               </w:rPr>
-              <w:t>Vendas</w:t>
+              <w:t>Direção</w:t>
             </w:r>
           </w:p>
         </w:tc>
@@ -2929,7 +3154,164 @@
                 <w:b w:val="0"/>
                 <w:sz w:val="20"/>
               </w:rPr>
-              <w:t>00:45, 01:55</w:t>
+              <w:t>00:36; briefing 1</w:t>
+            </w:r>
+          </w:p>
+        </w:tc>
+      </w:tr>
+    </w:tbl>
+    <w:p/>
+    <w:p>
+      <w:pPr>
+        <w:pStyle w:val="Heading1"/>
+      </w:pPr>
+      <w:r>
+        <w:t>7. O que a Surcin pediu ao consultor (briefing)</w:t>
+      </w:r>
+    </w:p>
+    <w:p>
+      <w:pPr>
+        <w:pStyle w:val="ListBullet"/>
+      </w:pPr>
+      <w:r>
+        <w:t>Proposta modular que separe consultoria, implantação, desenvolvimento, integrações, licenças e manutenção, com valores e responsabilidades separados (seção 14).</w:t>
+      </w:r>
+    </w:p>
+    <w:p>
+      <w:pPr>
+        <w:pStyle w:val="ListBullet"/>
+      </w:pPr>
+      <w:r>
+        <w:t>Diagnóstico com fluxos atual e futuro e lista de casos de uso priorizada por valor, risco, esforço e dependência externa.</w:t>
+      </w:r>
+    </w:p>
+    <w:p>
+      <w:pPr>
+        <w:pStyle w:val="ListBullet"/>
+      </w:pPr>
+      <w:r>
+        <w:t>Ganhos já em outubro e novembro, sem consumir horas diárias da diretora e sem interromper as entregas correntes (seções 12 e 17).</w:t>
+      </w:r>
+    </w:p>
+    <w:p>
+      <w:pPr>
+        <w:pStyle w:val="ListBullet"/>
+      </w:pPr>
+      <w:r>
+        <w:t>Controles de segurança: aprovação humana, matriz de autonomia (verde, amarelo, vermelho), LGPD, propriedade dos ativos pela Surcin e continuidade sem o consultor (seções 11 e 14).</w:t>
+      </w:r>
+    </w:p>
+    <w:p>
+      <w:pPr>
+        <w:pStyle w:val="ListBullet"/>
+      </w:pPr>
+      <w:r>
+        <w:t>Estimativa do custo mensal recorrente de ferramentas e plano de contingência.</w:t>
+      </w:r>
+    </w:p>
+    <w:p>
+      <w:pPr>
+        <w:pStyle w:val="ListBullet"/>
+      </w:pPr>
+      <w:r>
+        <w:t>Respostas às perguntas da seção 16 (respondidas na proposta comercial).</w:t>
+      </w:r>
+    </w:p>
+    <w:p>
+      <w:pPr>
+        <w:pStyle w:val="ListBullet"/>
+      </w:pPr>
+      <w:r>
+        <w:t>Comercial e CRM só a partir de janeiro de 2027.</w:t>
+      </w:r>
+    </w:p>
+    <w:p>
+      <w:pPr>
+        <w:pStyle w:val="Heading1"/>
+      </w:pPr>
+      <w:r>
+        <w:t>8. Divergências entre as fontes</w:t>
+      </w:r>
+    </w:p>
+    <w:tbl>
+      <w:tblPr>
+        <w:tblStyle w:val="TableGrid"/>
+        <w:tblW w:type="auto" w:w="0"/>
+        <w:jc w:val="center"/>
+        <w:tblLook w:firstColumn="1" w:firstRow="1" w:lastColumn="0" w:lastRow="0" w:noHBand="0" w:noVBand="1" w:val="04A0"/>
+      </w:tblPr>
+      <w:tblGrid>
+        <w:gridCol w:w="2436"/>
+        <w:gridCol w:w="2436"/>
+        <w:gridCol w:w="2436"/>
+        <w:gridCol w:w="2436"/>
+      </w:tblGrid>
+      <w:tr>
+        <w:tc>
+          <w:tcPr>
+            <w:tcW w:type="dxa" w:w="1474"/>
+            <w:shd w:val="clear" w:color="auto" w:fill="1F3A5F"/>
+          </w:tcPr>
+          <w:p>
+            <w:r/>
+            <w:r>
+              <w:rPr>
+                <w:b/>
+                <w:color w:val="FFFFFF"/>
+                <w:sz w:val="20"/>
+              </w:rPr>
+              <w:t>Tema</w:t>
+            </w:r>
+          </w:p>
+        </w:tc>
+        <w:tc>
+          <w:tcPr>
+            <w:tcW w:type="dxa" w:w="2721"/>
+            <w:shd w:val="clear" w:color="auto" w:fill="1F3A5F"/>
+          </w:tcPr>
+          <w:p>
+            <w:r/>
+            <w:r>
+              <w:rPr>
+                <w:b/>
+                <w:color w:val="FFFFFF"/>
+                <w:sz w:val="20"/>
+              </w:rPr>
+              <w:t>Reunião (prevalece)</w:t>
+            </w:r>
+          </w:p>
+        </w:tc>
+        <w:tc>
+          <w:tcPr>
+            <w:tcW w:type="dxa" w:w="2721"/>
+            <w:shd w:val="clear" w:color="auto" w:fill="1F3A5F"/>
+          </w:tcPr>
+          <w:p>
+            <w:r/>
+            <w:r>
+              <w:rPr>
+                <w:b/>
+                <w:color w:val="FFFFFF"/>
+                <w:sz w:val="20"/>
+              </w:rPr>
+              <w:t>Outra fonte</w:t>
+            </w:r>
+          </w:p>
+        </w:tc>
+        <w:tc>
+          <w:tcPr>
+            <w:tcW w:type="dxa" w:w="2154"/>
+            <w:shd w:val="clear" w:color="auto" w:fill="1F3A5F"/>
+          </w:tcPr>
+          <w:p>
+            <w:r/>
+            <w:r>
+              <w:rPr>
+                <w:b/>
+                <w:color w:val="FFFFFF"/>
+                <w:sz w:val="20"/>
+              </w:rPr>
+              <w:t>Como tratamos</w:t>
             </w:r>
           </w:p>
         </w:tc>
@@ -2937,7 +3319,7 @@
       <w:tr>
         <w:tc>
           <w:tcPr>
-            <w:tcW w:type="dxa" w:w="5669"/>
+            <w:tcW w:type="dxa" w:w="1474"/>
           </w:tcPr>
           <w:p>
             <w:r/>
@@ -2946,13 +3328,13 @@
                 <w:b w:val="0"/>
                 <w:sz w:val="20"/>
               </w:rPr>
-              <w:t>Ter um assistente de dúvidas por setor</w:t>
+              <w:t>Contabilidade</w:t>
             </w:r>
           </w:p>
         </w:tc>
         <w:tc>
           <w:tcPr>
-            <w:tcW w:type="dxa" w:w="1701"/>
+            <w:tcW w:type="dxa" w:w="2721"/>
           </w:tcPr>
           <w:p>
             <w:r/>
@@ -2961,13 +3343,13 @@
                 <w:b w:val="0"/>
                 <w:sz w:val="20"/>
               </w:rPr>
-              <w:t>Todas</w:t>
+              <w:t>"Hoje eu não tenho ninguém na contabilidade, eu que tô tendo que fazer tudo" (00:30)</w:t>
             </w:r>
           </w:p>
         </w:tc>
         <w:tc>
           <w:tcPr>
-            <w:tcW w:type="dxa" w:w="1701"/>
+            <w:tcW w:type="dxa" w:w="2721"/>
           </w:tcPr>
           <w:p>
             <w:r/>
@@ -2976,15 +3358,13 @@
                 <w:b w:val="0"/>
                 <w:sz w:val="20"/>
               </w:rPr>
-              <w:t>00:39</w:t>
+              <w:t>Briefing: execução contábil terceirizada com a Joyce, que tem a responsabilidade técnica</w:t>
             </w:r>
           </w:p>
         </w:tc>
-      </w:tr>
-      <w:tr>
         <w:tc>
           <w:tcPr>
-            <w:tcW w:type="dxa" w:w="5669"/>
+            <w:tcW w:type="dxa" w:w="2154"/>
           </w:tcPr>
           <w:p>
             <w:r/>
@@ -2993,13 +3373,15 @@
                 <w:b w:val="0"/>
                 <w:sz w:val="20"/>
               </w:rPr>
-              <w:t>Estruturar no futuro uma consultoria jurídica para os clientes</w:t>
+              <w:t>Provável divisão: contábil terceirizado e fiscal interno. Confirmar na quinta</w:t>
             </w:r>
           </w:p>
         </w:tc>
+      </w:tr>
+      <w:tr>
         <w:tc>
           <w:tcPr>
-            <w:tcW w:type="dxa" w:w="1701"/>
+            <w:tcW w:type="dxa" w:w="1474"/>
           </w:tcPr>
           <w:p>
             <w:r/>
@@ -3008,13 +3390,13 @@
                 <w:b w:val="0"/>
                 <w:sz w:val="20"/>
               </w:rPr>
-              <w:t>Jurídico</w:t>
+              <w:t>Tamara a partir de novembro</w:t>
             </w:r>
           </w:p>
         </w:tc>
         <w:tc>
           <w:tcPr>
-            <w:tcW w:type="dxa" w:w="1701"/>
+            <w:tcW w:type="dxa" w:w="2721"/>
           </w:tcPr>
           <w:p>
             <w:r/>
@@ -3023,7 +3405,409 @@
                 <w:b w:val="0"/>
                 <w:sz w:val="20"/>
               </w:rPr>
-              <w:t>01:45</w:t>
+              <w:t>"Vai ficar exclusiva com o departamento pessoal" (00:41)</w:t>
+            </w:r>
+          </w:p>
+        </w:tc>
+        <w:tc>
+          <w:tcPr>
+            <w:tcW w:type="dxa" w:w="2721"/>
+          </w:tcPr>
+          <w:p>
+            <w:r/>
+            <w:r>
+              <w:rPr>
+                <w:b w:val="0"/>
+                <w:sz w:val="20"/>
+              </w:rPr>
+              <w:t>Briefing: DP e emissão de notas dos clientes contábeis</w:t>
+            </w:r>
+          </w:p>
+        </w:tc>
+        <w:tc>
+          <w:tcPr>
+            <w:tcW w:type="dxa" w:w="2154"/>
+          </w:tcPr>
+          <w:p>
+            <w:r/>
+            <w:r>
+              <w:rPr>
+                <w:b w:val="0"/>
+                <w:sz w:val="20"/>
+              </w:rPr>
+              <w:t>Usamos só DP; confirmar quem emite notas</w:t>
+            </w:r>
+          </w:p>
+        </w:tc>
+      </w:tr>
+      <w:tr>
+        <w:tc>
+          <w:tcPr>
+            <w:tcW w:type="dxa" w:w="1474"/>
+          </w:tcPr>
+          <w:p>
+            <w:r/>
+            <w:r>
+              <w:rPr>
+                <w:b w:val="0"/>
+                <w:sz w:val="20"/>
+              </w:rPr>
+              <w:t>Retomada do tráfego pago</w:t>
+            </w:r>
+          </w:p>
+        </w:tc>
+        <w:tc>
+          <w:tcPr>
+            <w:tcW w:type="dxa" w:w="2721"/>
+          </w:tcPr>
+          <w:p>
+            <w:r/>
+            <w:r>
+              <w:rPr>
+                <w:b w:val="0"/>
+                <w:sz w:val="20"/>
+              </w:rPr>
+              <w:t>Combinado começar em 15/12 para colher em janeiro (02:16)</w:t>
+            </w:r>
+          </w:p>
+        </w:tc>
+        <w:tc>
+          <w:tcPr>
+            <w:tcW w:type="dxa" w:w="2721"/>
+          </w:tcPr>
+          <w:p>
+            <w:r/>
+            <w:r>
+              <w:rPr>
+                <w:b w:val="0"/>
+                <w:sz w:val="20"/>
+              </w:rPr>
+              <w:t>Briefing: retomada em janeiro de 2027. Gemini: "pausar em dezembro"</w:t>
+            </w:r>
+          </w:p>
+        </w:tc>
+        <w:tc>
+          <w:tcPr>
+            <w:tcW w:type="dxa" w:w="2154"/>
+          </w:tcPr>
+          <w:p>
+            <w:r/>
+            <w:r>
+              <w:rPr>
+                <w:b w:val="0"/>
+                <w:sz w:val="20"/>
+              </w:rPr>
+              <w:t>Usamos 15/12; confirmar</w:t>
+            </w:r>
+          </w:p>
+        </w:tc>
+      </w:tr>
+      <w:tr>
+        <w:tc>
+          <w:tcPr>
+            <w:tcW w:type="dxa" w:w="1474"/>
+          </w:tcPr>
+          <w:p>
+            <w:r/>
+            <w:r>
+              <w:rPr>
+                <w:b w:val="0"/>
+                <w:sz w:val="20"/>
+              </w:rPr>
+              <w:t>Contratação</w:t>
+            </w:r>
+          </w:p>
+        </w:tc>
+        <w:tc>
+          <w:tcPr>
+            <w:tcW w:type="dxa" w:w="2721"/>
+          </w:tcPr>
+          <w:p>
+            <w:r/>
+            <w:r>
+              <w:rPr>
+                <w:b w:val="0"/>
+                <w:sz w:val="20"/>
+              </w:rPr>
+              <w:t>"Provavelmente eu vou contratar um contador" em janeiro (00:32, 01:49)</w:t>
+            </w:r>
+          </w:p>
+        </w:tc>
+        <w:tc>
+          <w:tcPr>
+            <w:tcW w:type="dxa" w:w="2721"/>
+          </w:tcPr>
+          <w:p>
+            <w:r/>
+            <w:r>
+              <w:rPr>
+                <w:b w:val="0"/>
+                <w:sz w:val="20"/>
+              </w:rPr>
+              <w:t>Briefing: reavaliar em janeiro caso a distribuição não funcione</w:t>
+            </w:r>
+          </w:p>
+        </w:tc>
+        <w:tc>
+          <w:tcPr>
+            <w:tcW w:type="dxa" w:w="2154"/>
+          </w:tcPr>
+          <w:p>
+            <w:r/>
+            <w:r>
+              <w:rPr>
+                <w:b w:val="0"/>
+                <w:sz w:val="20"/>
+              </w:rPr>
+              <w:t>Tratada como decisão em aberto</w:t>
+            </w:r>
+          </w:p>
+        </w:tc>
+      </w:tr>
+      <w:tr>
+        <w:tc>
+          <w:tcPr>
+            <w:tcW w:type="dxa" w:w="1474"/>
+          </w:tcPr>
+          <w:p>
+            <w:r/>
+            <w:r>
+              <w:rPr>
+                <w:b w:val="0"/>
+                <w:sz w:val="20"/>
+              </w:rPr>
+              <w:t>Novo domínio</w:t>
+            </w:r>
+          </w:p>
+        </w:tc>
+        <w:tc>
+          <w:tcPr>
+            <w:tcW w:type="dxa" w:w="2721"/>
+          </w:tcPr>
+          <w:p>
+            <w:r/>
+            <w:r>
+              <w:rPr>
+                <w:b w:val="0"/>
+                <w:sz w:val="20"/>
+              </w:rPr>
+              <w:t>Contas novas no domínio da Surcin (00:59, 02:10)</w:t>
+            </w:r>
+          </w:p>
+        </w:tc>
+        <w:tc>
+          <w:tcPr>
+            <w:tcW w:type="dxa" w:w="2721"/>
+          </w:tcPr>
+          <w:p>
+            <w:r/>
+            <w:r>
+              <w:rPr>
+                <w:b w:val="0"/>
+                <w:sz w:val="20"/>
+              </w:rPr>
+              <w:t>Gemini: "novo domínio RT". Briefing: RT é a conta antiga</w:t>
+            </w:r>
+          </w:p>
+        </w:tc>
+        <w:tc>
+          <w:tcPr>
+            <w:tcW w:type="dxa" w:w="2154"/>
+          </w:tcPr>
+          <w:p>
+            <w:r/>
+            <w:r>
+              <w:rPr>
+                <w:b w:val="0"/>
+                <w:sz w:val="20"/>
+              </w:rPr>
+              <w:t>Gemini errou; novo ambiente é Surcin</w:t>
+            </w:r>
+          </w:p>
+        </w:tc>
+      </w:tr>
+      <w:tr>
+        <w:tc>
+          <w:tcPr>
+            <w:tcW w:type="dxa" w:w="1474"/>
+          </w:tcPr>
+          <w:p>
+            <w:r/>
+            <w:r>
+              <w:rPr>
+                <w:b w:val="0"/>
+                <w:sz w:val="20"/>
+              </w:rPr>
+              <w:t>Fiscal feito pela Thamires</w:t>
+            </w:r>
+          </w:p>
+        </w:tc>
+        <w:tc>
+          <w:tcPr>
+            <w:tcW w:type="dxa" w:w="2721"/>
+          </w:tcPr>
+          <w:p>
+            <w:r/>
+            <w:r>
+              <w:rPr>
+                <w:b w:val="0"/>
+                <w:sz w:val="20"/>
+              </w:rPr>
+              <w:t>44 clientes em 3 dias, 3 a 4 horas por dia (02:00)</w:t>
+            </w:r>
+          </w:p>
+        </w:tc>
+        <w:tc>
+          <w:tcPr>
+            <w:tcW w:type="dxa" w:w="2721"/>
+          </w:tcPr>
+          <w:p>
+            <w:r/>
+            <w:r>
+              <w:rPr>
+                <w:b w:val="0"/>
+                <w:sz w:val="20"/>
+              </w:rPr>
+              <w:t>Gemini: "3 horas fracionadas"</w:t>
+            </w:r>
+          </w:p>
+        </w:tc>
+        <w:tc>
+          <w:tcPr>
+            <w:tcW w:type="dxa" w:w="2154"/>
+          </w:tcPr>
+          <w:p>
+            <w:r/>
+            <w:r>
+              <w:rPr>
+                <w:b w:val="0"/>
+                <w:sz w:val="20"/>
+              </w:rPr>
+              <w:t>Vale a reunião</w:t>
+            </w:r>
+          </w:p>
+        </w:tc>
+      </w:tr>
+      <w:tr>
+        <w:tc>
+          <w:tcPr>
+            <w:tcW w:type="dxa" w:w="1474"/>
+          </w:tcPr>
+          <w:p>
+            <w:r/>
+            <w:r>
+              <w:rPr>
+                <w:b w:val="0"/>
+                <w:sz w:val="20"/>
+              </w:rPr>
+              <w:t>Tempo do fechamento com IA</w:t>
+            </w:r>
+          </w:p>
+        </w:tc>
+        <w:tc>
+          <w:tcPr>
+            <w:tcW w:type="dxa" w:w="2721"/>
+          </w:tcPr>
+          <w:p>
+            <w:r/>
+            <w:r>
+              <w:rPr>
+                <w:b w:val="0"/>
+                <w:sz w:val="20"/>
+              </w:rPr>
+              <w:t>De 5 h para 1 a 2 h (00:34)</w:t>
+            </w:r>
+          </w:p>
+        </w:tc>
+        <w:tc>
+          <w:tcPr>
+            <w:tcW w:type="dxa" w:w="2721"/>
+          </w:tcPr>
+          <w:p>
+            <w:r/>
+            <w:r>
+              <w:rPr>
+                <w:b w:val="0"/>
+                <w:sz w:val="20"/>
+              </w:rPr>
+              <w:t>Gemini: 1 h 30</w:t>
+            </w:r>
+          </w:p>
+        </w:tc>
+        <w:tc>
+          <w:tcPr>
+            <w:tcW w:type="dxa" w:w="2154"/>
+          </w:tcPr>
+          <w:p>
+            <w:r/>
+            <w:r>
+              <w:rPr>
+                <w:b w:val="0"/>
+                <w:sz w:val="20"/>
+              </w:rPr>
+              <w:t>Usamos 1 a 2 h</w:t>
+            </w:r>
+          </w:p>
+        </w:tc>
+      </w:tr>
+      <w:tr>
+        <w:tc>
+          <w:tcPr>
+            <w:tcW w:type="dxa" w:w="1474"/>
+          </w:tcPr>
+          <w:p>
+            <w:r/>
+            <w:r>
+              <w:rPr>
+                <w:b w:val="0"/>
+                <w:sz w:val="20"/>
+              </w:rPr>
+              <w:t>Clientes de BPO</w:t>
+            </w:r>
+          </w:p>
+        </w:tc>
+        <w:tc>
+          <w:tcPr>
+            <w:tcW w:type="dxa" w:w="2721"/>
+          </w:tcPr>
+          <w:p>
+            <w:r/>
+            <w:r>
+              <w:rPr>
+                <w:b w:val="0"/>
+                <w:sz w:val="20"/>
+              </w:rPr>
+              <w:t>12, 15 e 16 em trechos diferentes</w:t>
+            </w:r>
+          </w:p>
+        </w:tc>
+        <w:tc>
+          <w:tcPr>
+            <w:tcW w:type="dxa" w:w="2721"/>
+          </w:tcPr>
+          <w:p>
+            <w:r/>
+            <w:r>
+              <w:rPr>
+                <w:b w:val="0"/>
+                <w:sz w:val="20"/>
+              </w:rPr>
+              <w:t>Briefing: 14 a 15</w:t>
+            </w:r>
+          </w:p>
+        </w:tc>
+        <w:tc>
+          <w:tcPr>
+            <w:tcW w:type="dxa" w:w="2154"/>
+          </w:tcPr>
+          <w:p>
+            <w:r/>
+            <w:r>
+              <w:rPr>
+                <w:b w:val="0"/>
+                <w:sz w:val="20"/>
+              </w:rPr>
+              <w:t>13 a 15 externos</w:t>
             </w:r>
           </w:p>
         </w:tc>
@@ -3031,19 +3815,11 @@
     </w:tbl>
     <w:p/>
     <w:p>
-      <w:r>
-        <w:rPr>
-          <w:i w:val="0"/>
-        </w:rPr>
-        <w:t>Disponibilidade dela: esta semana está cheia; a partir de 19/10 pretende estudar de manhã e trabalhar à tarde, com tempo para o projeto. A primeira semana de cada mês concentra as reuniões de fechamento (02:15 a 02:17).</w:t>
-      </w:r>
-    </w:p>
-    <w:p>
       <w:pPr>
         <w:pStyle w:val="Heading1"/>
       </w:pPr>
       <w:r>
-        <w:t>7. Leitura do consultor</w:t>
+        <w:t>9. Leitura do consultor</w:t>
       </w:r>
     </w:p>
     <w:p>
@@ -3057,7 +3833,7 @@
         <w:t xml:space="preserve">[HIPÓTESE] O ponto de partida é bom. </w:t>
       </w:r>
       <w:r>
-        <w:t>Há documentação, padrão de pastas e rotinas no Trello. O mapeamento parte do que existe e não do zero, o que reduz esforço.</w:t>
+        <w:t>Há documentação, padrão de pastas e rotinas no Trello; o mapeamento parte do que existe.</w:t>
       </w:r>
     </w:p>
     <w:p>
@@ -3068,10 +3844,24 @@
         <w:rPr>
           <w:b/>
         </w:rPr>
-        <w:t xml:space="preserve">[HIPÓTESE] O maior risco está no fiscal. </w:t>
+        <w:t xml:space="preserve">[HIPÓTESE] O maior risco está nos parâmetros fiscais. </w:t>
       </w:r>
       <w:r>
-        <w:t>Sem contador, com o Domínio mal configurado e com execução manual, é onde um erro custa mais caro. A correção da configuração exige o suporte do Domínio ou um especialista no sistema.</w:t>
+        <w:t>Sistemas apuram certo com parâmetro errado. Separar execução de conferência e corrigir a parametrização do Domínio (com o suporte do sistema) vem antes de qualquer automação.</w:t>
+      </w:r>
+    </w:p>
+    <w:p>
+      <w:pPr>
+        <w:pStyle w:val="ListBullet"/>
+      </w:pPr>
+      <w:r>
+        <w:rPr>
+          <w:b/>
+        </w:rPr>
+        <w:t xml:space="preserve">[HIPÓTESE] Três controles manuais já reduzem risco antes da prova. </w:t>
+      </w:r>
+      <w:r>
+        <w:t>Conferência de guia antes de pagar, evidência obrigatória para concluir cartão e registro das dúvidas que chegam à Thamires. Não exigem desenvolvimento.</w:t>
       </w:r>
     </w:p>
     <w:p>
@@ -3085,7 +3875,7 @@
         <w:t xml:space="preserve">[HIPÓTESE] A Júlia é ponto único de falha. </w:t>
       </w:r>
       <w:r>
-        <w:t>Ela recebe, distribui e acompanha tudo. Formalizar o papel dela e um substituto é tão importante quanto promovê-la.</w:t>
+        <w:t>Ela recebe, distribui e acompanha tudo; precisa de papel formal e substituto.</w:t>
       </w:r>
     </w:p>
     <w:p>
@@ -3096,10 +3886,10 @@
         <w:rPr>
           <w:b/>
         </w:rPr>
-        <w:t xml:space="preserve">[HIPÓTESE] A remuneração variável depende de papéis claros. </w:t>
+        <w:t xml:space="preserve">[HIPÓTESE] A premiação depende de papéis claros. </w:t>
       </w:r>
       <w:r>
-        <w:t>Sem descrição de função e entregas medíveis, um programa de pontos vira discussão. A estrutura organizacional é o pré-requisito.</w:t>
+        <w:t>Sem função e entregas medíveis, o programa vira discussão; e não deve premiar volume de cartões (briefing, seção 10).</w:t>
       </w:r>
     </w:p>
     <w:p>
@@ -3110,10 +3900,26 @@
         <w:rPr>
           <w:b/>
         </w:rPr>
-        <w:t xml:space="preserve">[HIPÓTESE] Há ganhos rápidos sem automação. </w:t>
+        <w:t xml:space="preserve">[HIPÓTESE] A capacidade do consultor limita o que cabe antes de 13/12. </w:t>
       </w:r>
       <w:r>
-        <w:t>Configurar a emissão de nota pelo Conta Azul, o monitoramento de processos no Jusbrasil e a conciliação semanal resolvem parte das dores antes de qualquer desenvolvimento.</w:t>
+        <w:t>Com cerca de 10 h por semana, cabe mapear, estruturar e implantar controles manuais. Pilotos de software ficam para janeiro, salvo troca de escopo.</w:t>
+      </w:r>
+    </w:p>
+    <w:p>
+      <w:pPr>
+        <w:pStyle w:val="Heading1"/>
+      </w:pPr>
+      <w:r>
+        <w:t>10. Perguntas para quinta-feira</w:t>
+      </w:r>
+    </w:p>
+    <w:p>
+      <w:pPr>
+        <w:pStyle w:val="Heading3"/>
+      </w:pPr>
+      <w:r>
+        <w:t>Confirmar divergências</w:t>
       </w:r>
     </w:p>
     <w:p>
@@ -3121,21 +3927,31 @@
         <w:pStyle w:val="ListBullet"/>
       </w:pPr>
       <w:r>
-        <w:rPr>
-          <w:b/>
-        </w:rPr>
-        <w:t xml:space="preserve">[HIPÓTESE] Custo de IA precisa entrar na conta. </w:t>
-      </w:r>
-      <w:r>
-        <w:t>O uso do Claude por várias pessoas tem limites e custo; quem usa e para quê deve sair do plano de automação.</w:t>
+        <w:t>A contabilidade é executada pela Joyce? O que fica com a Surcin (fiscal, conferência, entrega)?</w:t>
       </w:r>
     </w:p>
     <w:p>
       <w:pPr>
-        <w:pStyle w:val="Heading1"/>
+        <w:pStyle w:val="ListBullet"/>
       </w:pPr>
       <w:r>
-        <w:t>8. Perguntas que ainda faltam responder</w:t>
+        <w:t>A partir de novembro, quem emite as notas dos clientes contábeis: Tamara ou Vitória?</w:t>
+      </w:r>
+    </w:p>
+    <w:p>
+      <w:pPr>
+        <w:pStyle w:val="ListBullet"/>
+      </w:pPr>
+      <w:r>
+        <w:t>O tráfego pago volta em 15/12 ou em janeiro?</w:t>
+      </w:r>
+    </w:p>
+    <w:p>
+      <w:pPr>
+        <w:pStyle w:val="ListBullet"/>
+      </w:pPr>
+      <w:r>
+        <w:t>A contratação de um(a) contador(a) em janeiro está decidida ou depende do teste de novembro e dezembro?</w:t>
       </w:r>
     </w:p>
     <w:p>
@@ -3143,7 +3959,7 @@
         <w:pStyle w:val="Heading3"/>
       </w:pPr>
       <w:r>
-        <w:t>Números e prioridades</w:t>
+        <w:t>Prioridades e agenda</w:t>
       </w:r>
     </w:p>
     <w:p>
@@ -3151,31 +3967,7 @@
         <w:pStyle w:val="ListBullet"/>
       </w:pPr>
       <w:r>
-        <w:t>Quantos clientes há hoje em cada serviço (contabilidade, financeiro, DP, jurídico)?</w:t>
-      </w:r>
-    </w:p>
-    <w:p>
-      <w:pPr>
-        <w:pStyle w:val="ListBullet"/>
-      </w:pPr>
-      <w:r>
-        <w:t>Qual processo, se resolvido primeiro, mais devolveria tempo a você: fiscal, fechamento financeiro ou implantação de clientes?</w:t>
-      </w:r>
-    </w:p>
-    <w:p>
-      <w:pPr>
-        <w:pStyle w:val="ListBullet"/>
-      </w:pPr>
-      <w:r>
-        <w:t>Quais passo a passos estão atualizados e quais precisam de revisão?</w:t>
-      </w:r>
-    </w:p>
-    <w:p>
-      <w:pPr>
-        <w:pStyle w:val="Heading3"/>
-      </w:pPr>
-      <w:r>
-        <w:t>Equipe e agenda</w:t>
+        <w:t>Qual processo, resolvido primeiro, mais devolve seu tempo: fiscal, fechamento financeiro ou implantação de clientes?</w:t>
       </w:r>
     </w:p>
     <w:p>
@@ -3191,23 +3983,7 @@
         <w:pStyle w:val="ListBullet"/>
       </w:pPr>
       <w:r>
-        <w:t>A Júlia pode ser a ponto focal do projeto? Quantas horas por semana ela pode dedicar?</w:t>
-      </w:r>
-    </w:p>
-    <w:p>
-      <w:pPr>
-        <w:pStyle w:val="ListBullet"/>
-      </w:pPr>
-      <w:r>
-        <w:t>A Vitória volta de férias em 28/10?</w:t>
-      </w:r>
-    </w:p>
-    <w:p>
-      <w:pPr>
-        <w:pStyle w:val="ListBullet"/>
-      </w:pPr>
-      <w:r>
-        <w:t>A Alana continua em 2027? O contador que você pretende contratar entraria no desenho da estrutura?</w:t>
+        <w:t>A Júlia pode ser a ponto focal do projeto?</w:t>
       </w:r>
     </w:p>
     <w:p>
@@ -3223,7 +3999,7 @@
         <w:pStyle w:val="ListBullet"/>
       </w:pPr>
       <w:r>
-        <w:t>Qual é o nome da plataforma de atendimento do WhatsApp? É o NetsApp?</w:t>
+        <w:t>Quem vai corrigir a parametrização do Domínio, e até quando? O CITAX entra nessa decisão?</w:t>
       </w:r>
     </w:p>
     <w:p>
@@ -3231,23 +4007,7 @@
         <w:pStyle w:val="ListBullet"/>
       </w:pPr>
       <w:r>
-        <w:t>Quem vai corrigir a configuração do Domínio, e até quando?</w:t>
-      </w:r>
-    </w:p>
-    <w:p>
-      <w:pPr>
-        <w:pStyle w:val="ListBullet"/>
-      </w:pPr>
-      <w:r>
-        <w:t>Quando será a migração das contas para o novo domínio da Surcin, e quem cuida dela?</w:t>
-      </w:r>
-    </w:p>
-    <w:p>
-      <w:pPr>
-        <w:pStyle w:val="ListBullet"/>
-      </w:pPr>
-      <w:r>
-        <w:t>Você prefere ficar no Microsoft ou migrar para o Google?</w:t>
+        <w:t>Quando o ambiente novo da Surcin (e-mail, Claude, Lovable) será criado e por quem?</w:t>
       </w:r>
     </w:p>
     <w:p>
@@ -3271,7 +4031,7 @@
         <w:pStyle w:val="ListBullet"/>
       </w:pPr>
       <w:r>
-        <w:t>Há orçamento separado para ferramentas (licenças do Claude, API de WhatsApp)?</w:t>
+        <w:t>Há orçamento separado para licenças (Claude Team, Lovable, API de WhatsApp)?</w:t>
       </w:r>
     </w:p>
     <w:p>
@@ -3279,7 +4039,7 @@
         <w:pStyle w:val="Heading1"/>
       </w:pPr>
       <w:r>
-        <w:t>9. Materiais a receber</w:t>
+        <w:t>11. Materiais</w:t>
       </w:r>
     </w:p>
     <w:p>
@@ -3287,7 +4047,7 @@
         <w:pStyle w:val="ListBullet"/>
       </w:pPr>
       <w:r>
-        <w:t>Gravação da reunião, apresentação e resumo da trajetória que ela ficou de enviar por e-mail (00:04, 02:36).</w:t>
+        <w:t>Recebidos: transcrição da reunião, briefing de 14 páginas e anotações do Gemini.</w:t>
       </w:r>
     </w:p>
     <w:p>
@@ -3295,7 +4055,7 @@
         <w:pStyle w:val="ListBullet"/>
       </w:pPr>
       <w:r>
-        <w:t>Acesso de leitura ao Trello, à pasta Geral do OneDrive e aos passo a passos, via Júlia (02:09).</w:t>
+        <w:t>Pendentes: gravação e apresentação usada na reunião (02:36); acesso de leitura ao Trello e à pasta Geral do OneDrive, via Júlia (02:09).</w:t>
       </w:r>
     </w:p>
     <w:sectPr>
@@ -3321,7 +4081,7 @@
         <w:color w:val="595959"/>
         <w:sz w:val="16"/>
       </w:rPr>
-      <w:t>Surcin · Proposta de consultoria em organização e processos · Confidencial</w:t>
+      <w:t>Surcin Assessoria Empresarial · Proposta de consultoria · Confidencial</w:t>
     </w:r>
   </w:p>
 </w:ftr>

</xml_diff>

<commit_message>
Proposta Surcin: deixa explícito que mudanças de pessoas são hipóteses da cliente; registra divergência do ano da reconstrução
Co-Authored-By: Claude Opus 5.5 (1M context) <noreply@anthropic.com>
Claude-Session: https://claude.ai/code/session_0127xFh2xB8HoQ18BDMAY2QJ
</commit_message>
<xml_diff>
--- a/proposta-surcin/01-diagnostico-preliminar.docx
+++ b/proposta-surcin/01-diagnostico-preliminar.docx
@@ -3812,6 +3812,68 @@
           </w:p>
         </w:tc>
       </w:tr>
+      <w:tr>
+        <w:tc>
+          <w:tcPr>
+            <w:tcW w:type="dxa" w:w="1474"/>
+          </w:tcPr>
+          <w:p>
+            <w:r/>
+            <w:r>
+              <w:rPr>
+                <w:b w:val="0"/>
+                <w:sz w:val="20"/>
+              </w:rPr>
+              <w:t>Ano da quebra e da reconstrução</w:t>
+            </w:r>
+          </w:p>
+        </w:tc>
+        <w:tc>
+          <w:tcPr>
+            <w:tcW w:type="dxa" w:w="2721"/>
+          </w:tcPr>
+          <w:p>
+            <w:r/>
+            <w:r>
+              <w:rPr>
+                <w:b w:val="0"/>
+                <w:sz w:val="20"/>
+              </w:rPr>
+              <w:t>Ambígua: "no final de 2023, eu quebrei" (00:06) e "em 2023 foi o ano que eu comecei a me reconstruir" (00:11)</w:t>
+            </w:r>
+          </w:p>
+        </w:tc>
+        <w:tc>
+          <w:tcPr>
+            <w:tcW w:type="dxa" w:w="2721"/>
+          </w:tcPr>
+          <w:p>
+            <w:r/>
+            <w:r>
+              <w:rPr>
+                <w:b w:val="0"/>
+                <w:sz w:val="20"/>
+              </w:rPr>
+              <w:t>Briefing: quebra no fim de 2023, reconstrução em 2024. Gemini: quebra no fim de 2023</w:t>
+            </w:r>
+          </w:p>
+        </w:tc>
+        <w:tc>
+          <w:tcPr>
+            <w:tcW w:type="dxa" w:w="2154"/>
+          </w:tcPr>
+          <w:p>
+            <w:r/>
+            <w:r>
+              <w:rPr>
+                <w:b w:val="0"/>
+                <w:sz w:val="20"/>
+              </w:rPr>
+              <w:t>Usamos quebra no fim de 2023 e reconstrução a partir de 2024; confirmar</w:t>
+            </w:r>
+          </w:p>
+        </w:tc>
+      </w:tr>
     </w:tbl>
     <w:p/>
     <w:p>

</xml_diff>

<commit_message>
Proposta Surcin v4: remove BPO, Joyce e contabilidade terceirizada; reconfere números com a transcrição
Co-Authored-By: Claude Opus 5.5 (1M context) <noreply@anthropic.com>
Claude-Session: https://claude.ai/code/session_0127xFh2xB8HoQ18BDMAY2QJ
</commit_message>
<xml_diff>
--- a/proposta-surcin/01-diagnostico-preliminar.docx
+++ b/proposta-surcin/01-diagnostico-preliminar.docx
@@ -28,7 +28,7 @@
           <w:color w:val="595959"/>
           <w:sz w:val="18"/>
         </w:rPr>
-        <w:t>Versão 3 · 13/10/2026 · reunião, briefing e anotações cruzados · uso interno até revisão do Renato</w:t>
+        <w:t>Versão 4 · 13/10/2026 · dados reconferidos com a transcrição · uso interno até revisão do Renato</w:t>
       </w:r>
     </w:p>
     <w:tbl>
@@ -80,7 +80,7 @@
         <w:rPr>
           <w:i w:val="0"/>
         </w:rPr>
-        <w:t>A Surcin é uma assessoria empresarial pequena que já tem processos desenhados, mas ainda depende da Thamires como fonte de conhecimento, decisão e revisão. Depois de quebrar no fim de 2023 por crescer sem estrutura, ela reconstruiu a operação a partir de 2024 com passo a passos, checklists e rotinas no Trello, e recuperou cerca de 90% dos clientes (00:11; briefing, seção 3).</w:t>
+        <w:t>A Surcin é uma assessoria empresarial pequena que já tem processos desenhados, mas ainda depende da Thamires como fonte de conhecimento, decisão e revisão. Depois de uma quebra causada por crescer sem estrutura, ela reconstruiu a operação com passo a passos, checklists e rotinas no Trello, e recuperou cerca de 90% dos clientes (00:06 a 00:11; o ano da reconstrução está na seção 8).</w:t>
       </w:r>
     </w:p>
     <w:p>
@@ -254,7 +254,7 @@
                 <w:b w:val="0"/>
                 <w:sz w:val="20"/>
               </w:rPr>
-              <w:t>Contabilidade, apurações fiscais, DP/eSocial, BPO financeiro, abertura/alteração/baixa de empresas, regularizações, MEI, IRPF, parcelamentos, contratos e jurídico empresarial; revenda de certificado digital</w:t>
+              <w:t>Contabilidade, apurações fiscais, DP/eSocial, financeiro (gestão financeira dos clientes), abertura/alteração/baixa de empresas, regularizações, MEI, IRPF, parcelamentos, contratos e jurídico empresarial; revenda de certificado digital</w:t>
             </w:r>
           </w:p>
         </w:tc>
@@ -474,7 +474,7 @@
                 <w:b w:val="0"/>
                 <w:sz w:val="20"/>
               </w:rPr>
-              <w:t>Carteira de BPO financeiro</w:t>
+              <w:t>Clientes do financeiro</w:t>
             </w:r>
           </w:p>
         </w:tc>
@@ -489,7 +489,7 @@
                 <w:b w:val="0"/>
                 <w:sz w:val="20"/>
               </w:rPr>
-              <w:t>13 a 15 clientes externos (16 contando as três empresas da própria Thamires)</w:t>
+              <w:t>A Vitória cuida de 12 clientes (00:38). Na contagem do Trello ela citou 11, 13 e 16, este último incluindo as três empresas dela (01:02). Número exato a confirmar</w:t>
             </w:r>
           </w:p>
         </w:tc>
@@ -504,7 +504,7 @@
                 <w:b w:val="0"/>
                 <w:sz w:val="20"/>
               </w:rPr>
-              <w:t>[REUNIÃO] 01:02; [BRIEFING] 9.1</w:t>
+              <w:t>[REUNIÃO] 00:38, 01:02</w:t>
             </w:r>
           </w:p>
         </w:tc>
@@ -677,7 +677,7 @@
                 <w:b w:val="0"/>
                 <w:sz w:val="20"/>
               </w:rPr>
-              <w:t>Sem contratações até o fim do ano; tráfego pago pausado (cerca de R$ 1 mil/mês em anúncios); social media mantida; conciliação semanal; comunicação com clientes de contabilidade só pelo aplicativo da Veri a partir de novembro</w:t>
+              <w:t>Sem contratações até o fim do ano; tráfego pago pausado (valor investido em anúncios a confirmar); social media mantida; conciliação semanal; comunicação com clientes de contabilidade só pelo aplicativo da Veri a partir de novembro</w:t>
             </w:r>
           </w:p>
         </w:tc>
@@ -1112,7 +1112,7 @@
                 <w:b w:val="0"/>
                 <w:sz w:val="20"/>
               </w:rPr>
-              <w:t>Joyce</w:t>
+              <w:t>Apoio externo</w:t>
             </w:r>
           </w:p>
         </w:tc>
@@ -1127,7 +1127,7 @@
                 <w:b w:val="0"/>
                 <w:sz w:val="20"/>
               </w:rPr>
-              <w:t>Contabilidade terceirizada e responsabilidade técnica, segundo o briefing</w:t>
+              <w:t>Social media e gestora de tráfego</w:t>
             </w:r>
           </w:p>
         </w:tc>
@@ -1142,7 +1142,7 @@
                 <w:b w:val="0"/>
                 <w:sz w:val="20"/>
               </w:rPr>
-              <w:t>[DIVERGÊNCIA] com a reunião (seção 8)</w:t>
+              <w:t>Social media mantida; campanhas de tráfego canceladas</w:t>
             </w:r>
           </w:p>
         </w:tc>
@@ -1157,69 +1157,7 @@
                 <w:b w:val="0"/>
                 <w:sz w:val="20"/>
               </w:rPr>
-              <w:t>briefing 2 e 5</w:t>
-            </w:r>
-          </w:p>
-        </w:tc>
-      </w:tr>
-      <w:tr>
-        <w:tc>
-          <w:tcPr>
-            <w:tcW w:type="dxa" w:w="1304"/>
-          </w:tcPr>
-          <w:p>
-            <w:r/>
-            <w:r>
-              <w:rPr>
-                <w:b w:val="0"/>
-                <w:sz w:val="20"/>
-              </w:rPr>
-              <w:t>Flora e parceiros</w:t>
-            </w:r>
-          </w:p>
-        </w:tc>
-        <w:tc>
-          <w:tcPr>
-            <w:tcW w:type="dxa" w:w="3515"/>
-          </w:tcPr>
-          <w:p>
-            <w:r/>
-            <w:r>
-              <w:rPr>
-                <w:b w:val="0"/>
-                <w:sz w:val="20"/>
-              </w:rPr>
-              <w:t>Conteúdo e campanhas; parceiros jurídicos para demandas fora do foco</w:t>
-            </w:r>
-          </w:p>
-        </w:tc>
-        <w:tc>
-          <w:tcPr>
-            <w:tcW w:type="dxa" w:w="2835"/>
-          </w:tcPr>
-          <w:p>
-            <w:r/>
-            <w:r>
-              <w:rPr>
-                <w:b w:val="0"/>
-                <w:sz w:val="20"/>
-              </w:rPr>
-              <w:t>Tráfego pago pausado</w:t>
-            </w:r>
-          </w:p>
-        </w:tc>
-        <w:tc>
-          <w:tcPr>
-            <w:tcW w:type="dxa" w:w="1417"/>
-          </w:tcPr>
-          <w:p>
-            <w:r/>
-            <w:r>
-              <w:rPr>
-                <w:b w:val="0"/>
-                <w:sz w:val="20"/>
-              </w:rPr>
-              <w:t>briefing 5</w:t>
+              <w:t>00:37, 02:12</w:t>
             </w:r>
           </w:p>
         </w:tc>
@@ -1231,7 +1169,7 @@
         <w:rPr>
           <w:i w:val="0"/>
         </w:rPr>
-        <w:t>Saídas recentes: Jonathan em junho e Dani, responsável pelo fiscal, no fim de agosto (briefing, seção 3; reunião, 00:30).</w:t>
+        <w:t>Saída recente: Dani, que cuidava da contabilidade e do fiscal e emitia notas, saiu depois do erro de agosto. A Thamires absorveu o setor e hoje não há ninguém na contabilidade (00:30, 00:40, 02:00).</w:t>
       </w:r>
     </w:p>
     <w:p>
@@ -1663,7 +1601,7 @@
                 <w:b w:val="0"/>
                 <w:sz w:val="20"/>
               </w:rPr>
-              <w:t>Dados financeiros dos clientes de BPO, conciliação; emissão de nota pela conciliação não configurada</w:t>
+              <w:t>Dados financeiros dos clientes do financeiro, conciliação; emissão de nota pela conciliação não configurada</w:t>
             </w:r>
           </w:p>
         </w:tc>
@@ -2254,69 +2192,7 @@
                 <w:b w:val="0"/>
                 <w:sz w:val="20"/>
               </w:rPr>
-              <w:t>Recebimento e conferência do trabalho contábil terceirizado</w:t>
-            </w:r>
-          </w:p>
-        </w:tc>
-        <w:tc>
-          <w:tcPr>
-            <w:tcW w:type="dxa" w:w="1871"/>
-          </w:tcPr>
-          <w:p>
-            <w:r/>
-            <w:r>
-              <w:rPr>
-                <w:b w:val="0"/>
-                <w:sz w:val="20"/>
-              </w:rPr>
-              <w:t>A definir</w:t>
-            </w:r>
-          </w:p>
-        </w:tc>
-        <w:tc>
-          <w:tcPr>
-            <w:tcW w:type="dxa" w:w="3118"/>
-          </w:tcPr>
-          <w:p>
-            <w:r/>
-            <w:r>
-              <w:rPr>
-                <w:b w:val="0"/>
-                <w:sz w:val="20"/>
-              </w:rPr>
-              <w:t>Citado no briefing; fluxo não documentado</w:t>
-            </w:r>
-          </w:p>
-        </w:tc>
-      </w:tr>
-      <w:tr>
-        <w:tc>
-          <w:tcPr>
-            <w:tcW w:type="dxa" w:w="454"/>
-          </w:tcPr>
-          <w:p>
-            <w:r/>
-            <w:r>
-              <w:rPr>
-                <w:b w:val="0"/>
-                <w:sz w:val="20"/>
-              </w:rPr>
-              <w:t>7</w:t>
-            </w:r>
-          </w:p>
-        </w:tc>
-        <w:tc>
-          <w:tcPr>
-            <w:tcW w:type="dxa" w:w="3628"/>
-          </w:tcPr>
-          <w:p>
-            <w:r/>
-            <w:r>
-              <w:rPr>
-                <w:b w:val="0"/>
-                <w:sz w:val="20"/>
-              </w:rPr>
-              <w:t>Pedidos de pagamento e pagamentos dos clientes de BPO</w:t>
+              <w:t>Pedidos de pagamento e pagamentos dos clientes do financeiro</w:t>
             </w:r>
           </w:p>
         </w:tc>
@@ -2363,7 +2239,7 @@
                 <w:b w:val="0"/>
                 <w:sz w:val="20"/>
               </w:rPr>
-              <w:t>8</w:t>
+              <w:t>7</w:t>
             </w:r>
           </w:p>
         </w:tc>
@@ -2425,7 +2301,7 @@
                 <w:b w:val="0"/>
                 <w:sz w:val="20"/>
               </w:rPr>
-              <w:t>9</w:t>
+              <w:t>8</w:t>
             </w:r>
           </w:p>
         </w:tc>
@@ -2487,7 +2363,7 @@
                 <w:b w:val="0"/>
                 <w:sz w:val="20"/>
               </w:rPr>
-              <w:t>10</w:t>
+              <w:t>9</w:t>
             </w:r>
           </w:p>
         </w:tc>
@@ -2549,7 +2425,7 @@
                 <w:b w:val="0"/>
                 <w:sz w:val="20"/>
               </w:rPr>
-              <w:t>11</w:t>
+              <w:t>10</w:t>
             </w:r>
           </w:p>
         </w:tc>
@@ -2611,7 +2487,7 @@
                 <w:b w:val="0"/>
                 <w:sz w:val="20"/>
               </w:rPr>
-              <w:t>12</w:t>
+              <w:t>11</w:t>
             </w:r>
           </w:p>
         </w:tc>
@@ -3030,7 +2906,7 @@
                 <w:b w:val="0"/>
                 <w:sz w:val="20"/>
               </w:rPr>
-              <w:t>Escalar sem contratar: Vitória passar de 15 para 30 clientes</w:t>
+              <w:t>Escalar sem contratar: a Vitória atende 12 clientes; a Thamires fala em 20 (00:38) e em dobrar "de 15 para 30" (01:25)</w:t>
             </w:r>
           </w:p>
         </w:tc>
@@ -3060,7 +2936,7 @@
                 <w:b w:val="0"/>
                 <w:sz w:val="20"/>
               </w:rPr>
-              <w:t>00:46, 01:25</w:t>
+              <w:t>00:38, 01:25</w:t>
             </w:r>
           </w:p>
         </w:tc>
@@ -3312,68 +3188,6 @@
                 <w:sz w:val="20"/>
               </w:rPr>
               <w:t>Como tratamos</w:t>
-            </w:r>
-          </w:p>
-        </w:tc>
-      </w:tr>
-      <w:tr>
-        <w:tc>
-          <w:tcPr>
-            <w:tcW w:type="dxa" w:w="1474"/>
-          </w:tcPr>
-          <w:p>
-            <w:r/>
-            <w:r>
-              <w:rPr>
-                <w:b w:val="0"/>
-                <w:sz w:val="20"/>
-              </w:rPr>
-              <w:t>Contabilidade</w:t>
-            </w:r>
-          </w:p>
-        </w:tc>
-        <w:tc>
-          <w:tcPr>
-            <w:tcW w:type="dxa" w:w="2721"/>
-          </w:tcPr>
-          <w:p>
-            <w:r/>
-            <w:r>
-              <w:rPr>
-                <w:b w:val="0"/>
-                <w:sz w:val="20"/>
-              </w:rPr>
-              <w:t>"Hoje eu não tenho ninguém na contabilidade, eu que tô tendo que fazer tudo" (00:30)</w:t>
-            </w:r>
-          </w:p>
-        </w:tc>
-        <w:tc>
-          <w:tcPr>
-            <w:tcW w:type="dxa" w:w="2721"/>
-          </w:tcPr>
-          <w:p>
-            <w:r/>
-            <w:r>
-              <w:rPr>
-                <w:b w:val="0"/>
-                <w:sz w:val="20"/>
-              </w:rPr>
-              <w:t>Briefing: execução contábil terceirizada com a Joyce, que tem a responsabilidade técnica</w:t>
-            </w:r>
-          </w:p>
-        </w:tc>
-        <w:tc>
-          <w:tcPr>
-            <w:tcW w:type="dxa" w:w="2154"/>
-          </w:tcPr>
-          <w:p>
-            <w:r/>
-            <w:r>
-              <w:rPr>
-                <w:b w:val="0"/>
-                <w:sz w:val="20"/>
-              </w:rPr>
-              <w:t>Provável divisão: contábil terceirizado e fiscal interno. Confirmar na quinta</w:t>
             </w:r>
           </w:p>
         </w:tc>
@@ -3762,7 +3576,7 @@
                 <w:b w:val="0"/>
                 <w:sz w:val="20"/>
               </w:rPr>
-              <w:t>Clientes de BPO</w:t>
+              <w:t>Clientes do financeiro</w:t>
             </w:r>
           </w:p>
         </w:tc>
@@ -3777,7 +3591,7 @@
                 <w:b w:val="0"/>
                 <w:sz w:val="20"/>
               </w:rPr>
-              <w:t>12, 15 e 16 em trechos diferentes</w:t>
+              <w:t>12 (00:38); 11, 13 e 16 na contagem do Trello (01:02); "de 15 para 30" (01:25)</w:t>
             </w:r>
           </w:p>
         </w:tc>
@@ -3807,7 +3621,7 @@
                 <w:b w:val="0"/>
                 <w:sz w:val="20"/>
               </w:rPr>
-              <w:t>13 a 15 externos</w:t>
+              <w:t>Usamos "cerca de 12 a 16"; confirmar</w:t>
             </w:r>
           </w:p>
         </w:tc>
@@ -3869,7 +3683,7 @@
                 <w:b w:val="0"/>
                 <w:sz w:val="20"/>
               </w:rPr>
-              <w:t>Usamos quebra no fim de 2023 e reconstrução a partir de 2024; confirmar</w:t>
+              <w:t>Não citamos ano nos documentos; confirmar</w:t>
             </w:r>
           </w:p>
         </w:tc>
@@ -3989,7 +3803,7 @@
         <w:pStyle w:val="ListBullet"/>
       </w:pPr>
       <w:r>
-        <w:t>A contabilidade é executada pela Joyce? O que fica com a Surcin (fiscal, conferência, entrega)?</w:t>
+        <w:t>Quantos clientes o financeiro atende hoje, sem contar as três empresas da Thamires?</w:t>
       </w:r>
     </w:p>
     <w:p>

</xml_diff>